<commit_message>
Right-align body and format references per Ono APA 7 guide
Co-Authored-By: Claude Fable 5.1 <noreply@anthropic.com>
Claude-Session: https://claude.ai/code/session_01AGMAnS6o1o3m246uMW2ium
</commit_message>
<xml_diff>
--- a/seminar/סמינריון - תפקודים ניהוליים - הייכל מרווה.docx
+++ b/seminar/סמינריון - תפקודים ניהוליים - הייכל מרווה.docx
@@ -522,7 +522,7 @@
             </w:rPr>
             <w:fldChar w:fldCharType="separate"/>
           </w:r>
-          <w:hyperlink w:anchor="__RefHeading___Toc416_253614021">
+          <w:hyperlink w:anchor="__RefHeading___Toc409_1283528634">
             <w:r>
               <w:rPr>
                 <w:rStyle w:val="IndexLink"/>
@@ -559,7 +559,7 @@
             </w:tabs>
             <w:rPr/>
           </w:pPr>
-          <w:hyperlink w:anchor="__RefHeading___Toc418_253614021">
+          <w:hyperlink w:anchor="__RefHeading___Toc411_1283528634">
             <w:r>
               <w:rPr>
                 <w:rStyle w:val="IndexLink"/>
@@ -596,7 +596,7 @@
             </w:tabs>
             <w:rPr/>
           </w:pPr>
-          <w:hyperlink w:anchor="__RefHeading___Toc420_253614021">
+          <w:hyperlink w:anchor="__RefHeading___Toc413_1283528634">
             <w:r>
               <w:rPr>
                 <w:rStyle w:val="IndexLink"/>
@@ -633,7 +633,7 @@
             </w:tabs>
             <w:rPr/>
           </w:pPr>
-          <w:hyperlink w:anchor="__RefHeading___Toc422_253614021">
+          <w:hyperlink w:anchor="__RefHeading___Toc415_1283528634">
             <w:r>
               <w:rPr>
                 <w:rStyle w:val="IndexLink"/>
@@ -670,7 +670,7 @@
             </w:tabs>
             <w:rPr/>
           </w:pPr>
-          <w:hyperlink w:anchor="__RefHeading___Toc424_253614021">
+          <w:hyperlink w:anchor="__RefHeading___Toc417_1283528634">
             <w:r>
               <w:rPr>
                 <w:rStyle w:val="IndexLink"/>
@@ -721,7 +721,7 @@
             </w:tabs>
             <w:rPr/>
           </w:pPr>
-          <w:hyperlink w:anchor="__RefHeading___Toc426_253614021">
+          <w:hyperlink w:anchor="__RefHeading___Toc419_1283528634">
             <w:r>
               <w:rPr>
                 <w:rStyle w:val="IndexLink"/>
@@ -758,7 +758,7 @@
             </w:tabs>
             <w:rPr/>
           </w:pPr>
-          <w:hyperlink w:anchor="__RefHeading___Toc428_253614021">
+          <w:hyperlink w:anchor="__RefHeading___Toc421_1283528634">
             <w:r>
               <w:rPr>
                 <w:rStyle w:val="IndexLink"/>
@@ -795,7 +795,7 @@
             </w:tabs>
             <w:rPr/>
           </w:pPr>
-          <w:hyperlink w:anchor="__RefHeading___Toc430_253614021">
+          <w:hyperlink w:anchor="__RefHeading___Toc423_1283528634">
             <w:r>
               <w:rPr>
                 <w:rStyle w:val="IndexLink"/>
@@ -832,7 +832,7 @@
             </w:tabs>
             <w:rPr/>
           </w:pPr>
-          <w:hyperlink w:anchor="__RefHeading___Toc432_253614021">
+          <w:hyperlink w:anchor="__RefHeading___Toc425_1283528634">
             <w:r>
               <w:rPr>
                 <w:rStyle w:val="IndexLink"/>
@@ -869,7 +869,7 @@
             </w:tabs>
             <w:rPr/>
           </w:pPr>
-          <w:hyperlink w:anchor="__RefHeading___Toc434_253614021">
+          <w:hyperlink w:anchor="__RefHeading___Toc427_1283528634">
             <w:r>
               <w:rPr>
                 <w:rStyle w:val="IndexLink"/>
@@ -906,7 +906,7 @@
             </w:tabs>
             <w:rPr/>
           </w:pPr>
-          <w:hyperlink w:anchor="__RefHeading___Toc436_253614021">
+          <w:hyperlink w:anchor="__RefHeading___Toc429_1283528634">
             <w:r>
               <w:rPr>
                 <w:rStyle w:val="IndexLink"/>
@@ -943,7 +943,7 @@
             </w:tabs>
             <w:rPr/>
           </w:pPr>
-          <w:hyperlink w:anchor="__RefHeading___Toc438_253614021">
+          <w:hyperlink w:anchor="__RefHeading___Toc431_1283528634">
             <w:r>
               <w:rPr>
                 <w:rStyle w:val="IndexLink"/>
@@ -980,7 +980,7 @@
             </w:tabs>
             <w:rPr/>
           </w:pPr>
-          <w:hyperlink w:anchor="__RefHeading___Toc440_253614021">
+          <w:hyperlink w:anchor="__RefHeading___Toc433_1283528634">
             <w:r>
               <w:rPr>
                 <w:rStyle w:val="IndexLink"/>
@@ -1045,7 +1045,7 @@
             </w:tabs>
             <w:rPr/>
           </w:pPr>
-          <w:hyperlink w:anchor="__RefHeading___Toc442_253614021">
+          <w:hyperlink w:anchor="__RefHeading___Toc435_1283528634">
             <w:r>
               <w:rPr>
                 <w:rStyle w:val="IndexLink"/>
@@ -1082,7 +1082,7 @@
             </w:tabs>
             <w:rPr/>
           </w:pPr>
-          <w:hyperlink w:anchor="__RefHeading___Toc444_253614021">
+          <w:hyperlink w:anchor="__RefHeading___Toc437_1283528634">
             <w:r>
               <w:rPr>
                 <w:rStyle w:val="IndexLink"/>
@@ -1119,7 +1119,7 @@
             </w:tabs>
             <w:rPr/>
           </w:pPr>
-          <w:hyperlink w:anchor="__RefHeading___Toc446_253614021">
+          <w:hyperlink w:anchor="__RefHeading___Toc439_1283528634">
             <w:r>
               <w:rPr>
                 <w:rStyle w:val="IndexLink"/>
@@ -1170,7 +1170,7 @@
             </w:tabs>
             <w:rPr/>
           </w:pPr>
-          <w:hyperlink w:anchor="__RefHeading___Toc448_253614021">
+          <w:hyperlink w:anchor="__RefHeading___Toc441_1283528634">
             <w:r>
               <w:rPr>
                 <w:rStyle w:val="IndexLink"/>
@@ -1236,7 +1236,7 @@
               <w:rPr>
                 <w:rStyle w:val="IndexLink"/>
               </w:rPr>
-              <w:t>9</w:t>
+              <w:t>10</w:t>
             </w:r>
           </w:hyperlink>
         </w:p>
@@ -1249,7 +1249,7 @@
             </w:tabs>
             <w:rPr/>
           </w:pPr>
-          <w:hyperlink w:anchor="__RefHeading___Toc450_253614021">
+          <w:hyperlink w:anchor="__RefHeading___Toc443_1283528634">
             <w:r>
               <w:rPr>
                 <w:rStyle w:val="IndexLink"/>
@@ -1301,7 +1301,7 @@
               <w:rPr>
                 <w:rStyle w:val="IndexLink"/>
               </w:rPr>
-              <w:t>9</w:t>
+              <w:t>10</w:t>
             </w:r>
           </w:hyperlink>
         </w:p>
@@ -1314,7 +1314,7 @@
             </w:tabs>
             <w:rPr/>
           </w:pPr>
-          <w:hyperlink w:anchor="__RefHeading___Toc452_253614021">
+          <w:hyperlink w:anchor="__RefHeading___Toc445_1283528634">
             <w:r>
               <w:rPr>
                 <w:rStyle w:val="IndexLink"/>
@@ -1352,7 +1352,7 @@
               <w:rPr>
                 <w:rStyle w:val="IndexLink"/>
               </w:rPr>
-              <w:t>10</w:t>
+              <w:t>11</w:t>
             </w:r>
           </w:hyperlink>
         </w:p>
@@ -1365,7 +1365,7 @@
             </w:tabs>
             <w:rPr/>
           </w:pPr>
-          <w:hyperlink w:anchor="__RefHeading___Toc454_253614021">
+          <w:hyperlink w:anchor="__RefHeading___Toc447_1283528634">
             <w:r>
               <w:rPr>
                 <w:rStyle w:val="IndexLink"/>
@@ -1412,7 +1412,7 @@
             </w:tabs>
             <w:rPr/>
           </w:pPr>
-          <w:hyperlink w:anchor="__RefHeading___Toc456_253614021">
+          <w:hyperlink w:anchor="__RefHeading___Toc449_1283528634">
             <w:r>
               <w:rPr>
                 <w:rStyle w:val="IndexLink"/>
@@ -1463,7 +1463,7 @@
             </w:tabs>
             <w:rPr/>
           </w:pPr>
-          <w:hyperlink w:anchor="__RefHeading___Toc458_253614021">
+          <w:hyperlink w:anchor="__RefHeading___Toc451_1283528634">
             <w:r>
               <w:rPr>
                 <w:rStyle w:val="IndexLink"/>
@@ -1528,7 +1528,7 @@
             </w:tabs>
             <w:rPr/>
           </w:pPr>
-          <w:hyperlink w:anchor="__RefHeading___Toc460_253614021">
+          <w:hyperlink w:anchor="__RefHeading___Toc453_1283528634">
             <w:r>
               <w:rPr>
                 <w:rStyle w:val="IndexLink"/>
@@ -1593,7 +1593,7 @@
             </w:tabs>
             <w:rPr/>
           </w:pPr>
-          <w:hyperlink w:anchor="__RefHeading___Toc462_253614021">
+          <w:hyperlink w:anchor="__RefHeading___Toc455_1283528634">
             <w:r>
               <w:rPr>
                 <w:rStyle w:val="IndexLink"/>
@@ -1630,7 +1630,7 @@
             </w:tabs>
             <w:rPr/>
           </w:pPr>
-          <w:hyperlink w:anchor="__RefHeading___Toc464_253614021">
+          <w:hyperlink w:anchor="__RefHeading___Toc457_1283528634">
             <w:r>
               <w:rPr>
                 <w:rStyle w:val="IndexLink"/>
@@ -1668,7 +1668,7 @@
               <w:rPr>
                 <w:rStyle w:val="IndexLink"/>
               </w:rPr>
-              <w:t>14</w:t>
+              <w:t>15</w:t>
             </w:r>
           </w:hyperlink>
         </w:p>
@@ -1681,7 +1681,7 @@
             </w:tabs>
             <w:rPr/>
           </w:pPr>
-          <w:hyperlink w:anchor="__RefHeading___Toc466_253614021">
+          <w:hyperlink w:anchor="__RefHeading___Toc459_1283528634">
             <w:r>
               <w:rPr>
                 <w:rStyle w:val="IndexLink"/>
@@ -1746,7 +1746,7 @@
             </w:tabs>
             <w:rPr/>
           </w:pPr>
-          <w:hyperlink w:anchor="__RefHeading___Toc468_253614021">
+          <w:hyperlink w:anchor="__RefHeading___Toc461_1283528634">
             <w:r>
               <w:rPr>
                 <w:rStyle w:val="IndexLink"/>
@@ -1811,7 +1811,7 @@
             </w:tabs>
             <w:rPr/>
           </w:pPr>
-          <w:hyperlink w:anchor="__RefHeading___Toc470_253614021">
+          <w:hyperlink w:anchor="__RefHeading___Toc463_1283528634">
             <w:r>
               <w:rPr>
                 <w:rStyle w:val="IndexLink"/>
@@ -1849,7 +1849,7 @@
               <w:rPr>
                 <w:rStyle w:val="IndexLink"/>
               </w:rPr>
-              <w:t>16</w:t>
+              <w:t>17</w:t>
             </w:r>
           </w:hyperlink>
         </w:p>
@@ -1862,7 +1862,7 @@
             </w:tabs>
             <w:rPr/>
           </w:pPr>
-          <w:hyperlink w:anchor="__RefHeading___Toc472_253614021">
+          <w:hyperlink w:anchor="__RefHeading___Toc465_1283528634">
             <w:r>
               <w:rPr>
                 <w:rStyle w:val="IndexLink"/>
@@ -1886,7 +1886,7 @@
               <w:rPr>
                 <w:rStyle w:val="IndexLink"/>
               </w:rPr>
-              <w:t>19</w:t>
+              <w:t>20</w:t>
             </w:r>
           </w:hyperlink>
         </w:p>
@@ -1899,7 +1899,7 @@
             </w:tabs>
             <w:rPr/>
           </w:pPr>
-          <w:hyperlink w:anchor="__RefHeading___Toc474_253614021">
+          <w:hyperlink w:anchor="__RefHeading___Toc467_1283528634">
             <w:r>
               <w:rPr>
                 <w:rStyle w:val="IndexLink"/>
@@ -1923,7 +1923,7 @@
               <w:rPr>
                 <w:rStyle w:val="IndexLink"/>
               </w:rPr>
-              <w:t>24</w:t>
+              <w:t>25</w:t>
             </w:r>
           </w:hyperlink>
         </w:p>
@@ -1936,7 +1936,7 @@
             </w:tabs>
             <w:rPr/>
           </w:pPr>
-          <w:hyperlink w:anchor="__RefHeading___Toc476_253614021">
+          <w:hyperlink w:anchor="__RefHeading___Toc469_1283528634">
             <w:r>
               <w:rPr>
                 <w:rStyle w:val="IndexLink"/>
@@ -1954,7 +1954,7 @@
               <w:rPr>
                 <w:rStyle w:val="IndexLink"/>
               </w:rPr>
-              <w:t>26</w:t>
+              <w:t>27</w:t>
             </w:r>
           </w:hyperlink>
           <w:r>
@@ -1996,7 +1996,7 @@
         <w:jc w:val="right"/>
         <w:rPr/>
       </w:pPr>
-      <w:bookmarkStart w:id="0" w:name="__RefHeading___Toc416_253614021"/>
+      <w:bookmarkStart w:id="0" w:name="__RefHeading___Toc409_1283528634"/>
       <w:bookmarkEnd w:id="0"/>
       <w:r>
         <w:rPr>
@@ -2041,7 +2041,7 @@
         <w:jc w:val="right"/>
         <w:rPr/>
       </w:pPr>
-      <w:bookmarkStart w:id="1" w:name="__RefHeading___Toc418_253614021"/>
+      <w:bookmarkStart w:id="1" w:name="__RefHeading___Toc411_1283528634"/>
       <w:bookmarkEnd w:id="1"/>
       <w:r>
         <w:rPr>
@@ -2084,7 +2084,7 @@
         <w:bidi w:val="1"/>
         <w:spacing w:lineRule="auto" w:line="360" w:before="0" w:after="120"/>
         <w:ind w:firstLine="567"/>
-        <w:jc w:val="both"/>
+        <w:jc w:val="left"/>
         <w:rPr/>
       </w:pPr>
       <w:r>
@@ -2393,7 +2393,7 @@
         <w:bidi w:val="1"/>
         <w:spacing w:lineRule="auto" w:line="360" w:before="0" w:after="120"/>
         <w:ind w:firstLine="567"/>
-        <w:jc w:val="both"/>
+        <w:jc w:val="left"/>
         <w:rPr/>
       </w:pPr>
       <w:r>
@@ -2709,7 +2709,7 @@
         <w:jc w:val="right"/>
         <w:rPr/>
       </w:pPr>
-      <w:bookmarkStart w:id="2" w:name="__RefHeading___Toc420_253614021"/>
+      <w:bookmarkStart w:id="2" w:name="__RefHeading___Toc413_1283528634"/>
       <w:bookmarkEnd w:id="2"/>
       <w:r>
         <w:rPr>
@@ -2752,7 +2752,7 @@
         <w:bidi w:val="1"/>
         <w:spacing w:lineRule="auto" w:line="360" w:before="0" w:after="120"/>
         <w:ind w:firstLine="567"/>
-        <w:jc w:val="both"/>
+        <w:jc w:val="left"/>
         <w:rPr/>
       </w:pPr>
       <w:r>
@@ -3110,7 +3110,7 @@
         <w:jc w:val="right"/>
         <w:rPr/>
       </w:pPr>
-      <w:bookmarkStart w:id="3" w:name="__RefHeading___Toc422_253614021"/>
+      <w:bookmarkStart w:id="3" w:name="__RefHeading___Toc415_1283528634"/>
       <w:bookmarkEnd w:id="3"/>
       <w:r>
         <w:rPr>
@@ -3153,7 +3153,7 @@
         <w:bidi w:val="1"/>
         <w:spacing w:lineRule="auto" w:line="360" w:before="0" w:after="120"/>
         <w:ind w:firstLine="567"/>
-        <w:jc w:val="both"/>
+        <w:jc w:val="left"/>
         <w:rPr/>
       </w:pPr>
       <w:r>
@@ -3493,7 +3493,7 @@
         <w:bidi w:val="1"/>
         <w:spacing w:lineRule="auto" w:line="360" w:before="0" w:after="120"/>
         <w:ind w:firstLine="567"/>
-        <w:jc w:val="both"/>
+        <w:jc w:val="left"/>
         <w:rPr/>
       </w:pPr>
       <w:r>
@@ -3731,7 +3731,7 @@
         <w:bidi w:val="1"/>
         <w:spacing w:lineRule="auto" w:line="360" w:before="0" w:after="120"/>
         <w:ind w:firstLine="567"/>
-        <w:jc w:val="both"/>
+        <w:jc w:val="left"/>
         <w:rPr/>
       </w:pPr>
       <w:r>
@@ -3967,7 +3967,7 @@
         <w:jc w:val="right"/>
         <w:rPr/>
       </w:pPr>
-      <w:bookmarkStart w:id="4" w:name="__RefHeading___Toc424_253614021"/>
+      <w:bookmarkStart w:id="4" w:name="__RefHeading___Toc417_1283528634"/>
       <w:bookmarkEnd w:id="4"/>
       <w:r>
         <w:rPr>
@@ -4034,7 +4034,7 @@
         <w:bidi w:val="1"/>
         <w:spacing w:lineRule="auto" w:line="360" w:before="0" w:after="120"/>
         <w:ind w:firstLine="567"/>
-        <w:jc w:val="both"/>
+        <w:jc w:val="left"/>
         <w:rPr/>
       </w:pPr>
       <w:r>
@@ -4215,7 +4215,7 @@
         <w:bidi w:val="1"/>
         <w:spacing w:lineRule="auto" w:line="360" w:before="0" w:after="120"/>
         <w:ind w:firstLine="567"/>
-        <w:jc w:val="both"/>
+        <w:jc w:val="left"/>
         <w:rPr/>
       </w:pPr>
       <w:r>
@@ -4384,7 +4384,7 @@
         <w:bidi w:val="1"/>
         <w:spacing w:lineRule="auto" w:line="360" w:before="0" w:after="120"/>
         <w:ind w:firstLine="567"/>
-        <w:jc w:val="both"/>
+        <w:jc w:val="left"/>
         <w:rPr/>
       </w:pPr>
       <w:r>
@@ -4582,7 +4582,7 @@
         <w:bidi w:val="1"/>
         <w:spacing w:lineRule="auto" w:line="360" w:before="0" w:after="120"/>
         <w:ind w:firstLine="567"/>
-        <w:jc w:val="both"/>
+        <w:jc w:val="left"/>
         <w:rPr/>
       </w:pPr>
       <w:r>
@@ -4765,7 +4765,7 @@
         <w:jc w:val="right"/>
         <w:rPr/>
       </w:pPr>
-      <w:bookmarkStart w:id="5" w:name="__RefHeading___Toc426_253614021"/>
+      <w:bookmarkStart w:id="5" w:name="__RefHeading___Toc419_1283528634"/>
       <w:bookmarkEnd w:id="5"/>
       <w:r>
         <w:rPr>
@@ -4808,7 +4808,7 @@
         <w:bidi w:val="1"/>
         <w:spacing w:lineRule="auto" w:line="360" w:before="0" w:after="120"/>
         <w:ind w:firstLine="567"/>
-        <w:jc w:val="both"/>
+        <w:jc w:val="left"/>
         <w:rPr/>
       </w:pPr>
       <w:r>
@@ -4953,7 +4953,7 @@
         <w:jc w:val="right"/>
         <w:rPr/>
       </w:pPr>
-      <w:bookmarkStart w:id="6" w:name="__RefHeading___Toc428_253614021"/>
+      <w:bookmarkStart w:id="6" w:name="__RefHeading___Toc421_1283528634"/>
       <w:bookmarkEnd w:id="6"/>
       <w:r>
         <w:rPr>
@@ -4996,7 +4996,7 @@
         <w:bidi w:val="1"/>
         <w:spacing w:lineRule="auto" w:line="360" w:before="0" w:after="120"/>
         <w:ind w:firstLine="567"/>
-        <w:jc w:val="both"/>
+        <w:jc w:val="left"/>
         <w:rPr/>
       </w:pPr>
       <w:r>
@@ -5274,7 +5274,7 @@
         <w:jc w:val="right"/>
         <w:rPr/>
       </w:pPr>
-      <w:bookmarkStart w:id="7" w:name="__RefHeading___Toc430_253614021"/>
+      <w:bookmarkStart w:id="7" w:name="__RefHeading___Toc423_1283528634"/>
       <w:bookmarkEnd w:id="7"/>
       <w:r>
         <w:rPr>
@@ -5317,7 +5317,7 @@
         <w:bidi w:val="1"/>
         <w:spacing w:lineRule="auto" w:line="360" w:before="0" w:after="120"/>
         <w:ind w:firstLine="567"/>
-        <w:jc w:val="both"/>
+        <w:jc w:val="left"/>
         <w:rPr/>
       </w:pPr>
       <w:r>
@@ -5519,7 +5519,7 @@
         <w:jc w:val="right"/>
         <w:rPr/>
       </w:pPr>
-      <w:bookmarkStart w:id="8" w:name="__RefHeading___Toc432_253614021"/>
+      <w:bookmarkStart w:id="8" w:name="__RefHeading___Toc425_1283528634"/>
       <w:bookmarkEnd w:id="8"/>
       <w:r>
         <w:rPr>
@@ -5562,7 +5562,7 @@
         <w:bidi w:val="1"/>
         <w:spacing w:lineRule="auto" w:line="360" w:before="0" w:after="120"/>
         <w:ind w:firstLine="567"/>
-        <w:jc w:val="both"/>
+        <w:jc w:val="left"/>
         <w:rPr/>
       </w:pPr>
       <w:r>
@@ -5814,7 +5814,7 @@
         <w:jc w:val="right"/>
         <w:rPr/>
       </w:pPr>
-      <w:bookmarkStart w:id="9" w:name="__RefHeading___Toc434_253614021"/>
+      <w:bookmarkStart w:id="9" w:name="__RefHeading___Toc427_1283528634"/>
       <w:bookmarkEnd w:id="9"/>
       <w:r>
         <w:rPr>
@@ -5859,7 +5859,7 @@
         <w:jc w:val="right"/>
         <w:rPr/>
       </w:pPr>
-      <w:bookmarkStart w:id="10" w:name="__RefHeading___Toc436_253614021"/>
+      <w:bookmarkStart w:id="10" w:name="__RefHeading___Toc429_1283528634"/>
       <w:bookmarkEnd w:id="10"/>
       <w:r>
         <w:rPr>
@@ -5904,7 +5904,7 @@
         <w:jc w:val="right"/>
         <w:rPr/>
       </w:pPr>
-      <w:bookmarkStart w:id="11" w:name="__RefHeading___Toc438_253614021"/>
+      <w:bookmarkStart w:id="11" w:name="__RefHeading___Toc431_1283528634"/>
       <w:bookmarkEnd w:id="11"/>
       <w:r>
         <w:rPr>
@@ -5947,7 +5947,7 @@
         <w:bidi w:val="1"/>
         <w:spacing w:lineRule="auto" w:line="360" w:before="0" w:after="120"/>
         <w:ind w:firstLine="567"/>
-        <w:jc w:val="both"/>
+        <w:jc w:val="left"/>
         <w:rPr/>
       </w:pPr>
       <w:r>
@@ -6268,7 +6268,7 @@
         <w:bidi w:val="1"/>
         <w:spacing w:lineRule="auto" w:line="360" w:before="0" w:after="120"/>
         <w:ind w:firstLine="567"/>
-        <w:jc w:val="both"/>
+        <w:jc w:val="left"/>
         <w:rPr/>
       </w:pPr>
       <w:r>
@@ -6551,7 +6551,7 @@
         <w:bidi w:val="1"/>
         <w:spacing w:lineRule="auto" w:line="360" w:before="0" w:after="120"/>
         <w:ind w:firstLine="567"/>
-        <w:jc w:val="both"/>
+        <w:jc w:val="left"/>
         <w:rPr/>
       </w:pPr>
       <w:r>
@@ -6953,7 +6953,7 @@
         <w:bidi w:val="1"/>
         <w:spacing w:lineRule="auto" w:line="360" w:before="0" w:after="120"/>
         <w:ind w:firstLine="567"/>
-        <w:jc w:val="both"/>
+        <w:jc w:val="left"/>
         <w:rPr/>
       </w:pPr>
       <w:r>
@@ -7307,7 +7307,7 @@
         <w:jc w:val="right"/>
         <w:rPr/>
       </w:pPr>
-      <w:bookmarkStart w:id="12" w:name="__RefHeading___Toc440_253614021"/>
+      <w:bookmarkStart w:id="12" w:name="__RefHeading___Toc433_1283528634"/>
       <w:bookmarkEnd w:id="12"/>
       <w:r>
         <w:rPr>
@@ -7398,7 +7398,7 @@
         <w:bidi w:val="1"/>
         <w:spacing w:lineRule="auto" w:line="360" w:before="0" w:after="120"/>
         <w:ind w:firstLine="567"/>
-        <w:jc w:val="both"/>
+        <w:jc w:val="left"/>
         <w:rPr/>
       </w:pPr>
       <w:r>
@@ -7689,7 +7689,7 @@
         <w:bidi w:val="1"/>
         <w:spacing w:lineRule="auto" w:line="360" w:before="0" w:after="120"/>
         <w:ind w:firstLine="567"/>
-        <w:jc w:val="both"/>
+        <w:jc w:val="left"/>
         <w:rPr/>
       </w:pPr>
       <w:r>
@@ -8213,7 +8213,7 @@
         <w:bidi w:val="1"/>
         <w:spacing w:lineRule="auto" w:line="360" w:before="0" w:after="120"/>
         <w:ind w:firstLine="567"/>
-        <w:jc w:val="both"/>
+        <w:jc w:val="left"/>
         <w:rPr/>
       </w:pPr>
       <w:r>
@@ -8563,7 +8563,7 @@
         <w:bidi w:val="1"/>
         <w:spacing w:lineRule="auto" w:line="360" w:before="0" w:after="120"/>
         <w:ind w:firstLine="567"/>
-        <w:jc w:val="both"/>
+        <w:jc w:val="left"/>
         <w:rPr/>
       </w:pPr>
       <w:r>
@@ -8879,7 +8879,7 @@
         <w:jc w:val="right"/>
         <w:rPr/>
       </w:pPr>
-      <w:bookmarkStart w:id="13" w:name="__RefHeading___Toc442_253614021"/>
+      <w:bookmarkStart w:id="13" w:name="__RefHeading___Toc435_1283528634"/>
       <w:bookmarkEnd w:id="13"/>
       <w:r>
         <w:rPr>
@@ -8922,7 +8922,7 @@
         <w:bidi w:val="1"/>
         <w:spacing w:lineRule="auto" w:line="360" w:before="0" w:after="120"/>
         <w:ind w:firstLine="567"/>
-        <w:jc w:val="both"/>
+        <w:jc w:val="left"/>
         <w:rPr/>
       </w:pPr>
       <w:r>
@@ -9240,7 +9240,7 @@
         <w:bidi w:val="1"/>
         <w:spacing w:lineRule="auto" w:line="360" w:before="0" w:after="120"/>
         <w:ind w:firstLine="567"/>
-        <w:jc w:val="both"/>
+        <w:jc w:val="left"/>
         <w:rPr/>
       </w:pPr>
       <w:r>
@@ -9523,7 +9523,7 @@
         <w:bidi w:val="1"/>
         <w:spacing w:lineRule="auto" w:line="360" w:before="0" w:after="120"/>
         <w:ind w:firstLine="567"/>
-        <w:jc w:val="both"/>
+        <w:jc w:val="left"/>
         <w:rPr/>
       </w:pPr>
       <w:r>
@@ -9756,7 +9756,7 @@
         <w:bidi w:val="1"/>
         <w:spacing w:lineRule="auto" w:line="360" w:before="0" w:after="120"/>
         <w:ind w:firstLine="567"/>
-        <w:jc w:val="both"/>
+        <w:jc w:val="left"/>
         <w:rPr/>
       </w:pPr>
       <w:r>
@@ -9975,7 +9975,7 @@
         <w:jc w:val="right"/>
         <w:rPr/>
       </w:pPr>
-      <w:bookmarkStart w:id="14" w:name="__RefHeading___Toc444_253614021"/>
+      <w:bookmarkStart w:id="14" w:name="__RefHeading___Toc437_1283528634"/>
       <w:bookmarkEnd w:id="14"/>
       <w:r>
         <w:rPr>
@@ -10018,7 +10018,7 @@
         <w:bidi w:val="1"/>
         <w:spacing w:lineRule="auto" w:line="360" w:before="0" w:after="120"/>
         <w:ind w:firstLine="567"/>
-        <w:jc w:val="both"/>
+        <w:jc w:val="left"/>
         <w:rPr/>
       </w:pPr>
       <w:r>
@@ -10345,7 +10345,7 @@
         <w:bidi w:val="1"/>
         <w:spacing w:lineRule="auto" w:line="360" w:before="0" w:after="120"/>
         <w:ind w:firstLine="567"/>
-        <w:jc w:val="both"/>
+        <w:jc w:val="left"/>
         <w:rPr/>
       </w:pPr>
       <w:r>
@@ -10528,7 +10528,7 @@
         <w:jc w:val="right"/>
         <w:rPr/>
       </w:pPr>
-      <w:bookmarkStart w:id="15" w:name="__RefHeading___Toc446_253614021"/>
+      <w:bookmarkStart w:id="15" w:name="__RefHeading___Toc439_1283528634"/>
       <w:bookmarkEnd w:id="15"/>
       <w:r>
         <w:rPr>
@@ -10595,7 +10595,7 @@
         <w:bidi w:val="1"/>
         <w:spacing w:lineRule="auto" w:line="360" w:before="0" w:after="120"/>
         <w:ind w:firstLine="567"/>
-        <w:jc w:val="both"/>
+        <w:jc w:val="left"/>
         <w:rPr/>
       </w:pPr>
       <w:r>
@@ -10900,7 +10900,7 @@
         <w:bidi w:val="1"/>
         <w:spacing w:lineRule="auto" w:line="360" w:before="0" w:after="120"/>
         <w:ind w:firstLine="567"/>
-        <w:jc w:val="both"/>
+        <w:jc w:val="left"/>
         <w:rPr/>
       </w:pPr>
       <w:r>
@@ -11219,7 +11219,7 @@
         <w:bidi w:val="1"/>
         <w:spacing w:lineRule="auto" w:line="360" w:before="0" w:after="120"/>
         <w:ind w:firstLine="567"/>
-        <w:jc w:val="both"/>
+        <w:jc w:val="left"/>
         <w:rPr/>
       </w:pPr>
       <w:r>
@@ -11421,7 +11421,7 @@
         <w:jc w:val="right"/>
         <w:rPr/>
       </w:pPr>
-      <w:bookmarkStart w:id="16" w:name="__RefHeading___Toc448_253614021"/>
+      <w:bookmarkStart w:id="16" w:name="__RefHeading___Toc441_1283528634"/>
       <w:bookmarkEnd w:id="16"/>
       <w:r>
         <w:rPr>
@@ -11538,7 +11538,7 @@
         <w:jc w:val="right"/>
         <w:rPr/>
       </w:pPr>
-      <w:bookmarkStart w:id="17" w:name="__RefHeading___Toc450_253614021"/>
+      <w:bookmarkStart w:id="17" w:name="__RefHeading___Toc443_1283528634"/>
       <w:bookmarkEnd w:id="17"/>
       <w:r>
         <w:rPr>
@@ -11629,7 +11629,7 @@
         <w:bidi w:val="1"/>
         <w:spacing w:lineRule="auto" w:line="360" w:before="0" w:after="120"/>
         <w:ind w:firstLine="567"/>
-        <w:jc w:val="both"/>
+        <w:jc w:val="left"/>
         <w:rPr/>
       </w:pPr>
       <w:r>
@@ -11884,7 +11884,7 @@
         <w:bidi w:val="1"/>
         <w:spacing w:lineRule="auto" w:line="360" w:before="0" w:after="120"/>
         <w:ind w:firstLine="567"/>
-        <w:jc w:val="both"/>
+        <w:jc w:val="left"/>
         <w:rPr/>
       </w:pPr>
       <w:r>
@@ -12350,7 +12350,7 @@
         <w:bidi w:val="1"/>
         <w:spacing w:lineRule="auto" w:line="360" w:before="0" w:after="120"/>
         <w:ind w:firstLine="567"/>
-        <w:jc w:val="both"/>
+        <w:jc w:val="left"/>
         <w:rPr/>
       </w:pPr>
       <w:r>
@@ -12624,7 +12624,7 @@
         <w:bidi w:val="1"/>
         <w:spacing w:lineRule="auto" w:line="360" w:before="0" w:after="120"/>
         <w:ind w:firstLine="567"/>
-        <w:jc w:val="both"/>
+        <w:jc w:val="left"/>
         <w:rPr/>
       </w:pPr>
       <w:r>
@@ -13133,7 +13133,7 @@
         <w:jc w:val="right"/>
         <w:rPr/>
       </w:pPr>
-      <w:bookmarkStart w:id="18" w:name="__RefHeading___Toc452_253614021"/>
+      <w:bookmarkStart w:id="18" w:name="__RefHeading___Toc445_1283528634"/>
       <w:bookmarkEnd w:id="18"/>
       <w:r>
         <w:rPr>
@@ -13200,7 +13200,7 @@
         <w:bidi w:val="1"/>
         <w:spacing w:lineRule="auto" w:line="360" w:before="0" w:after="120"/>
         <w:ind w:firstLine="567"/>
-        <w:jc w:val="both"/>
+        <w:jc w:val="left"/>
         <w:rPr/>
       </w:pPr>
       <w:r>
@@ -13588,7 +13588,7 @@
         <w:bidi w:val="1"/>
         <w:spacing w:lineRule="auto" w:line="360" w:before="0" w:after="120"/>
         <w:ind w:firstLine="567"/>
-        <w:jc w:val="both"/>
+        <w:jc w:val="left"/>
         <w:rPr/>
       </w:pPr>
       <w:r>
@@ -13826,7 +13826,7 @@
         <w:bidi w:val="1"/>
         <w:spacing w:lineRule="auto" w:line="360" w:before="0" w:after="120"/>
         <w:ind w:firstLine="567"/>
-        <w:jc w:val="both"/>
+        <w:jc w:val="left"/>
         <w:rPr/>
       </w:pPr>
       <w:r>
@@ -14076,74 +14076,65 @@
       </w:r>
       <w:r>
         <w:rPr>
+          <w:rFonts w:eastAsia="David" w:cs="David"/>
+          <w:sz w:val="24"/>
+          <w:szCs w:val="24"/>
+          <w:rtl w:val="true"/>
+        </w:rPr>
+        <w:t>(</w:t>
+      </w:r>
+      <w:r>
+        <w:rPr>
+          <w:rFonts w:ascii="David" w:hAnsi="David" w:eastAsia="David"/>
+          <w:sz w:val="24"/>
+          <w:sz w:val="24"/>
+          <w:szCs w:val="24"/>
+          <w:rtl w:val="true"/>
+        </w:rPr>
+        <w:t>שטנגר ופדה</w:t>
+      </w:r>
+      <w:r>
+        <w:rPr>
+          <w:rFonts w:eastAsia="David" w:cs="David"/>
+          <w:sz w:val="24"/>
+          <w:szCs w:val="24"/>
+          <w:rtl w:val="true"/>
+        </w:rPr>
+        <w:t xml:space="preserve">, </w:t>
+      </w:r>
+      <w:r>
+        <w:rPr>
+          <w:rFonts w:eastAsia="David" w:cs="David"/>
+          <w:sz w:val="24"/>
+          <w:szCs w:val="24"/>
+        </w:rPr>
+        <w:t>2020</w:t>
+      </w:r>
+      <w:r>
+        <w:rPr>
+          <w:rFonts w:eastAsia="David" w:cs="David"/>
+          <w:sz w:val="24"/>
+          <w:szCs w:val="24"/>
+          <w:rtl w:val="true"/>
+        </w:rPr>
+        <w:t xml:space="preserve">; </w:t>
+      </w:r>
+      <w:r>
+        <w:rPr>
           <w:rFonts w:eastAsia="Times New Roman" w:cs="Times New Roman" w:ascii="Times New Roman" w:hAnsi="Times New Roman"/>
           <w:sz w:val="24"/>
           <w:szCs w:val="24"/>
-          <w:rtl w:val="true"/>
-        </w:rPr>
-        <w:t>(</w:t>
-      </w:r>
-      <w:r>
-        <w:rPr>
-          <w:rFonts w:eastAsia="Times New Roman" w:cs="Times New Roman" w:ascii="Times New Roman" w:hAnsi="Times New Roman"/>
-          <w:sz w:val="24"/>
-          <w:szCs w:val="24"/>
         </w:rPr>
         <w:t>Binns et al., 2022</w:t>
       </w:r>
       <w:r>
         <w:rPr>
-          <w:rFonts w:eastAsia="Times New Roman" w:cs="Times New Roman" w:ascii="Times New Roman" w:hAnsi="Times New Roman"/>
-          <w:sz w:val="24"/>
-          <w:szCs w:val="24"/>
-          <w:rtl w:val="true"/>
-        </w:rPr>
-        <w:t xml:space="preserve">; </w:t>
-      </w:r>
-      <w:r>
-        <w:rPr>
-          <w:rFonts w:ascii="Times New Roman" w:hAnsi="Times New Roman" w:eastAsia="Times New Roman" w:cs="Times New Roman"/>
-          <w:sz w:val="24"/>
-          <w:sz w:val="24"/>
-          <w:szCs w:val="24"/>
-          <w:rtl w:val="true"/>
-        </w:rPr>
-        <w:t>שטנגר ופדה</w:t>
-      </w:r>
-      <w:r>
-        <w:rPr>
-          <w:rFonts w:eastAsia="Times New Roman" w:cs="Times New Roman" w:ascii="Times New Roman" w:hAnsi="Times New Roman"/>
-          <w:sz w:val="24"/>
-          <w:szCs w:val="24"/>
-          <w:rtl w:val="true"/>
-        </w:rPr>
-        <w:t xml:space="preserve">, </w:t>
-      </w:r>
-      <w:r>
-        <w:rPr>
-          <w:rFonts w:eastAsia="Times New Roman" w:cs="Times New Roman" w:ascii="Times New Roman" w:hAnsi="Times New Roman"/>
-          <w:sz w:val="24"/>
-          <w:szCs w:val="24"/>
-        </w:rPr>
-        <w:t>2020</w:t>
-      </w:r>
-      <w:r>
-        <w:rPr>
-          <w:rFonts w:eastAsia="Times New Roman" w:cs="Times New Roman" w:ascii="Times New Roman" w:hAnsi="Times New Roman"/>
-          <w:sz w:val="24"/>
-          <w:szCs w:val="24"/>
-          <w:rtl w:val="true"/>
-        </w:rPr>
-        <w:t>)</w:t>
-      </w:r>
-      <w:r>
-        <w:rPr>
-          <w:rFonts w:eastAsia="David" w:cs="David"/>
-          <w:sz w:val="24"/>
-          <w:szCs w:val="24"/>
-          <w:rtl w:val="true"/>
-        </w:rPr>
-        <w:t xml:space="preserve">. </w:t>
+          <w:rFonts w:eastAsia="David" w:cs="David"/>
+          <w:sz w:val="24"/>
+          <w:szCs w:val="24"/>
+          <w:rtl w:val="true"/>
+        </w:rPr>
+        <w:t xml:space="preserve">). </w:t>
       </w:r>
       <w:r>
         <w:rPr>
@@ -14266,7 +14257,7 @@
         <w:bidi w:val="1"/>
         <w:spacing w:lineRule="auto" w:line="360" w:before="0" w:after="120"/>
         <w:ind w:firstLine="567"/>
-        <w:jc w:val="both"/>
+        <w:jc w:val="left"/>
         <w:rPr/>
       </w:pPr>
       <w:r>
@@ -14700,7 +14691,7 @@
         <w:bidi w:val="1"/>
         <w:spacing w:lineRule="auto" w:line="360" w:before="0" w:after="120"/>
         <w:ind w:firstLine="567"/>
-        <w:jc w:val="both"/>
+        <w:jc w:val="left"/>
         <w:rPr/>
       </w:pPr>
       <w:r>
@@ -15052,7 +15043,7 @@
         <w:jc w:val="right"/>
         <w:rPr/>
       </w:pPr>
-      <w:bookmarkStart w:id="19" w:name="__RefHeading___Toc454_253614021"/>
+      <w:bookmarkStart w:id="19" w:name="__RefHeading___Toc447_1283528634"/>
       <w:bookmarkEnd w:id="19"/>
       <w:r>
         <w:rPr>
@@ -15140,7 +15131,7 @@
         <w:bidi w:val="1"/>
         <w:spacing w:lineRule="auto" w:line="360" w:before="0" w:after="120"/>
         <w:ind w:firstLine="567"/>
-        <w:jc w:val="both"/>
+        <w:jc w:val="left"/>
         <w:rPr/>
       </w:pPr>
       <w:r>
@@ -15485,7 +15476,7 @@
         <w:bidi w:val="1"/>
         <w:spacing w:lineRule="auto" w:line="360" w:before="0" w:after="120"/>
         <w:ind w:firstLine="567"/>
-        <w:jc w:val="both"/>
+        <w:jc w:val="left"/>
         <w:rPr/>
       </w:pPr>
       <w:r>
@@ -15789,7 +15780,7 @@
         <w:jc w:val="right"/>
         <w:rPr/>
       </w:pPr>
-      <w:bookmarkStart w:id="20" w:name="__RefHeading___Toc456_253614021"/>
+      <w:bookmarkStart w:id="20" w:name="__RefHeading___Toc449_1283528634"/>
       <w:bookmarkEnd w:id="20"/>
       <w:r>
         <w:rPr>
@@ -15856,7 +15847,7 @@
         <w:bidi w:val="1"/>
         <w:spacing w:lineRule="auto" w:line="360" w:before="0" w:after="120"/>
         <w:ind w:firstLine="567"/>
-        <w:jc w:val="both"/>
+        <w:jc w:val="left"/>
         <w:rPr/>
       </w:pPr>
       <w:r>
@@ -16063,7 +16054,7 @@
         <w:bidi w:val="1"/>
         <w:spacing w:lineRule="auto" w:line="360" w:before="0" w:after="120"/>
         <w:ind w:firstLine="567"/>
-        <w:jc w:val="both"/>
+        <w:jc w:val="left"/>
         <w:rPr/>
       </w:pPr>
       <w:r>
@@ -16289,7 +16280,7 @@
         <w:bidi w:val="1"/>
         <w:spacing w:lineRule="auto" w:line="360" w:before="0" w:after="120"/>
         <w:ind w:firstLine="567"/>
-        <w:jc w:val="both"/>
+        <w:jc w:val="left"/>
         <w:rPr/>
       </w:pPr>
       <w:r>
@@ -16546,7 +16537,7 @@
         <w:jc w:val="right"/>
         <w:rPr/>
       </w:pPr>
-      <w:bookmarkStart w:id="21" w:name="__RefHeading___Toc458_253614021"/>
+      <w:bookmarkStart w:id="21" w:name="__RefHeading___Toc451_1283528634"/>
       <w:bookmarkEnd w:id="21"/>
       <w:r>
         <w:rPr>
@@ -16637,7 +16628,7 @@
         <w:bidi w:val="1"/>
         <w:spacing w:lineRule="auto" w:line="360" w:before="0" w:after="120"/>
         <w:ind w:firstLine="567"/>
-        <w:jc w:val="both"/>
+        <w:jc w:val="left"/>
         <w:rPr/>
       </w:pPr>
       <w:r>
@@ -16882,7 +16873,7 @@
         <w:bidi w:val="1"/>
         <w:spacing w:lineRule="auto" w:line="360" w:before="0" w:after="120"/>
         <w:ind w:firstLine="567"/>
-        <w:jc w:val="both"/>
+        <w:jc w:val="left"/>
         <w:rPr/>
       </w:pPr>
       <w:r>
@@ -17270,7 +17261,7 @@
         <w:bidi w:val="1"/>
         <w:spacing w:lineRule="auto" w:line="360" w:before="0" w:after="120"/>
         <w:ind w:firstLine="567"/>
-        <w:jc w:val="both"/>
+        <w:jc w:val="left"/>
         <w:rPr/>
       </w:pPr>
       <w:r>
@@ -17534,7 +17525,7 @@
         <w:bidi w:val="1"/>
         <w:spacing w:lineRule="auto" w:line="360" w:before="0" w:after="120"/>
         <w:ind w:firstLine="567"/>
-        <w:jc w:val="both"/>
+        <w:jc w:val="left"/>
         <w:rPr/>
       </w:pPr>
       <w:r>
@@ -17717,7 +17708,7 @@
         <w:jc w:val="right"/>
         <w:rPr/>
       </w:pPr>
-      <w:bookmarkStart w:id="22" w:name="__RefHeading___Toc460_253614021"/>
+      <w:bookmarkStart w:id="22" w:name="__RefHeading___Toc453_1283528634"/>
       <w:bookmarkEnd w:id="22"/>
       <w:r>
         <w:rPr>
@@ -17810,7 +17801,7 @@
         <w:jc w:val="right"/>
         <w:rPr/>
       </w:pPr>
-      <w:bookmarkStart w:id="23" w:name="__RefHeading___Toc462_253614021"/>
+      <w:bookmarkStart w:id="23" w:name="__RefHeading___Toc455_1283528634"/>
       <w:bookmarkEnd w:id="23"/>
       <w:r>
         <w:rPr>
@@ -17853,7 +17844,7 @@
         <w:bidi w:val="1"/>
         <w:spacing w:lineRule="auto" w:line="360" w:before="0" w:after="120"/>
         <w:ind w:firstLine="567"/>
-        <w:jc w:val="both"/>
+        <w:jc w:val="left"/>
         <w:rPr/>
       </w:pPr>
       <w:r>
@@ -18136,7 +18127,7 @@
         <w:bidi w:val="1"/>
         <w:spacing w:lineRule="auto" w:line="360" w:before="0" w:after="120"/>
         <w:ind w:firstLine="567"/>
-        <w:jc w:val="both"/>
+        <w:jc w:val="left"/>
         <w:rPr/>
       </w:pPr>
       <w:r>
@@ -18393,7 +18384,7 @@
         <w:bidi w:val="1"/>
         <w:spacing w:lineRule="auto" w:line="360" w:before="0" w:after="120"/>
         <w:ind w:firstLine="567"/>
-        <w:jc w:val="both"/>
+        <w:jc w:val="left"/>
         <w:rPr/>
       </w:pPr>
       <w:r>
@@ -18742,7 +18733,7 @@
         <w:jc w:val="right"/>
         <w:rPr/>
       </w:pPr>
-      <w:bookmarkStart w:id="24" w:name="__RefHeading___Toc464_253614021"/>
+      <w:bookmarkStart w:id="24" w:name="__RefHeading___Toc457_1283528634"/>
       <w:bookmarkEnd w:id="24"/>
       <w:r>
         <w:rPr>
@@ -18809,7 +18800,7 @@
         <w:bidi w:val="1"/>
         <w:spacing w:lineRule="auto" w:line="360" w:before="0" w:after="120"/>
         <w:ind w:firstLine="567"/>
-        <w:jc w:val="both"/>
+        <w:jc w:val="left"/>
         <w:rPr/>
       </w:pPr>
       <w:r>
@@ -19061,7 +19052,7 @@
         <w:bidi w:val="1"/>
         <w:spacing w:lineRule="auto" w:line="360" w:before="0" w:after="120"/>
         <w:ind w:firstLine="567"/>
-        <w:jc w:val="both"/>
+        <w:jc w:val="left"/>
         <w:rPr/>
       </w:pPr>
       <w:r>
@@ -19325,7 +19316,7 @@
         <w:bidi w:val="1"/>
         <w:spacing w:lineRule="auto" w:line="360" w:before="0" w:after="120"/>
         <w:ind w:firstLine="567"/>
-        <w:jc w:val="both"/>
+        <w:jc w:val="left"/>
         <w:rPr/>
       </w:pPr>
       <w:r>
@@ -19534,7 +19525,7 @@
         <w:jc w:val="right"/>
         <w:rPr/>
       </w:pPr>
-      <w:bookmarkStart w:id="25" w:name="__RefHeading___Toc466_253614021"/>
+      <w:bookmarkStart w:id="25" w:name="__RefHeading___Toc459_1283528634"/>
       <w:bookmarkEnd w:id="25"/>
       <w:r>
         <w:rPr>
@@ -19625,7 +19616,7 @@
         <w:bidi w:val="1"/>
         <w:spacing w:lineRule="auto" w:line="360" w:before="0" w:after="120"/>
         <w:ind w:firstLine="567"/>
-        <w:jc w:val="both"/>
+        <w:jc w:val="left"/>
         <w:rPr/>
       </w:pPr>
       <w:r>
@@ -19870,7 +19861,7 @@
         <w:bidi w:val="1"/>
         <w:spacing w:lineRule="auto" w:line="360" w:before="0" w:after="120"/>
         <w:ind w:firstLine="567"/>
-        <w:jc w:val="both"/>
+        <w:jc w:val="left"/>
         <w:rPr/>
       </w:pPr>
       <w:r>
@@ -20229,7 +20220,7 @@
         <w:bidi w:val="1"/>
         <w:spacing w:lineRule="auto" w:line="360" w:before="0" w:after="120"/>
         <w:ind w:firstLine="567"/>
-        <w:jc w:val="both"/>
+        <w:jc w:val="left"/>
         <w:rPr/>
       </w:pPr>
       <w:r>
@@ -20484,7 +20475,7 @@
         <w:bidi w:val="1"/>
         <w:spacing w:lineRule="auto" w:line="360" w:before="0" w:after="120"/>
         <w:ind w:firstLine="567"/>
-        <w:jc w:val="both"/>
+        <w:jc w:val="left"/>
         <w:rPr/>
       </w:pPr>
       <w:r>
@@ -20722,7 +20713,7 @@
         <w:jc w:val="right"/>
         <w:rPr/>
       </w:pPr>
-      <w:bookmarkStart w:id="26" w:name="__RefHeading___Toc468_253614021"/>
+      <w:bookmarkStart w:id="26" w:name="__RefHeading___Toc461_1283528634"/>
       <w:bookmarkEnd w:id="26"/>
       <w:r>
         <w:rPr>
@@ -20813,7 +20804,7 @@
         <w:bidi w:val="1"/>
         <w:spacing w:lineRule="auto" w:line="360" w:before="0" w:after="120"/>
         <w:ind w:firstLine="567"/>
-        <w:jc w:val="both"/>
+        <w:jc w:val="left"/>
         <w:rPr/>
       </w:pPr>
       <w:r>
@@ -21163,7 +21154,7 @@
         <w:bidi w:val="1"/>
         <w:spacing w:lineRule="auto" w:line="360" w:before="0" w:after="120"/>
         <w:ind w:firstLine="567"/>
-        <w:jc w:val="both"/>
+        <w:jc w:val="left"/>
         <w:rPr/>
       </w:pPr>
       <w:r>
@@ -21494,7 +21485,7 @@
         <w:bidi w:val="1"/>
         <w:spacing w:lineRule="auto" w:line="360" w:before="0" w:after="120"/>
         <w:ind w:firstLine="567"/>
-        <w:jc w:val="both"/>
+        <w:jc w:val="left"/>
         <w:rPr/>
       </w:pPr>
       <w:r>
@@ -21886,7 +21877,7 @@
         <w:jc w:val="right"/>
         <w:rPr/>
       </w:pPr>
-      <w:bookmarkStart w:id="27" w:name="__RefHeading___Toc470_253614021"/>
+      <w:bookmarkStart w:id="27" w:name="__RefHeading___Toc463_1283528634"/>
       <w:bookmarkEnd w:id="27"/>
       <w:r>
         <w:rPr>
@@ -21953,7 +21944,7 @@
         <w:bidi w:val="1"/>
         <w:spacing w:lineRule="auto" w:line="360" w:before="0" w:after="120"/>
         <w:ind w:firstLine="567"/>
-        <w:jc w:val="both"/>
+        <w:jc w:val="left"/>
         <w:rPr/>
       </w:pPr>
       <w:r>
@@ -22398,74 +22389,65 @@
       </w:r>
       <w:r>
         <w:rPr>
+          <w:rFonts w:eastAsia="David" w:cs="David"/>
+          <w:sz w:val="24"/>
+          <w:szCs w:val="24"/>
+          <w:rtl w:val="true"/>
+        </w:rPr>
+        <w:t>(</w:t>
+      </w:r>
+      <w:r>
+        <w:rPr>
+          <w:rFonts w:ascii="David" w:hAnsi="David" w:eastAsia="David"/>
+          <w:sz w:val="24"/>
+          <w:sz w:val="24"/>
+          <w:szCs w:val="24"/>
+          <w:rtl w:val="true"/>
+        </w:rPr>
+        <w:t>שטנגר ופדה</w:t>
+      </w:r>
+      <w:r>
+        <w:rPr>
+          <w:rFonts w:eastAsia="David" w:cs="David"/>
+          <w:sz w:val="24"/>
+          <w:szCs w:val="24"/>
+          <w:rtl w:val="true"/>
+        </w:rPr>
+        <w:t xml:space="preserve">, </w:t>
+      </w:r>
+      <w:r>
+        <w:rPr>
+          <w:rFonts w:eastAsia="David" w:cs="David"/>
+          <w:sz w:val="24"/>
+          <w:szCs w:val="24"/>
+        </w:rPr>
+        <w:t>2020</w:t>
+      </w:r>
+      <w:r>
+        <w:rPr>
+          <w:rFonts w:eastAsia="David" w:cs="David"/>
+          <w:sz w:val="24"/>
+          <w:szCs w:val="24"/>
+          <w:rtl w:val="true"/>
+        </w:rPr>
+        <w:t xml:space="preserve">; </w:t>
+      </w:r>
+      <w:r>
+        <w:rPr>
           <w:rFonts w:eastAsia="Times New Roman" w:cs="Times New Roman" w:ascii="Times New Roman" w:hAnsi="Times New Roman"/>
           <w:sz w:val="24"/>
           <w:szCs w:val="24"/>
-          <w:rtl w:val="true"/>
-        </w:rPr>
-        <w:t>(</w:t>
-      </w:r>
-      <w:r>
-        <w:rPr>
-          <w:rFonts w:eastAsia="Times New Roman" w:cs="Times New Roman" w:ascii="Times New Roman" w:hAnsi="Times New Roman"/>
-          <w:sz w:val="24"/>
-          <w:szCs w:val="24"/>
         </w:rPr>
         <w:t>Binns et al., 2022; Ryan et al., 2024</w:t>
       </w:r>
       <w:r>
         <w:rPr>
-          <w:rFonts w:eastAsia="Times New Roman" w:cs="Times New Roman" w:ascii="Times New Roman" w:hAnsi="Times New Roman"/>
-          <w:sz w:val="24"/>
-          <w:szCs w:val="24"/>
-          <w:rtl w:val="true"/>
-        </w:rPr>
-        <w:t xml:space="preserve">; </w:t>
-      </w:r>
-      <w:r>
-        <w:rPr>
-          <w:rFonts w:ascii="Times New Roman" w:hAnsi="Times New Roman" w:eastAsia="Times New Roman" w:cs="Times New Roman"/>
-          <w:sz w:val="24"/>
-          <w:sz w:val="24"/>
-          <w:szCs w:val="24"/>
-          <w:rtl w:val="true"/>
-        </w:rPr>
-        <w:t>שטנגר ופדה</w:t>
-      </w:r>
-      <w:r>
-        <w:rPr>
-          <w:rFonts w:eastAsia="Times New Roman" w:cs="Times New Roman" w:ascii="Times New Roman" w:hAnsi="Times New Roman"/>
-          <w:sz w:val="24"/>
-          <w:szCs w:val="24"/>
-          <w:rtl w:val="true"/>
-        </w:rPr>
-        <w:t xml:space="preserve">, </w:t>
-      </w:r>
-      <w:r>
-        <w:rPr>
-          <w:rFonts w:eastAsia="Times New Roman" w:cs="Times New Roman" w:ascii="Times New Roman" w:hAnsi="Times New Roman"/>
-          <w:sz w:val="24"/>
-          <w:szCs w:val="24"/>
-        </w:rPr>
-        <w:t>2020</w:t>
-      </w:r>
-      <w:r>
-        <w:rPr>
-          <w:rFonts w:eastAsia="Times New Roman" w:cs="Times New Roman" w:ascii="Times New Roman" w:hAnsi="Times New Roman"/>
-          <w:sz w:val="24"/>
-          <w:szCs w:val="24"/>
-          <w:rtl w:val="true"/>
-        </w:rPr>
-        <w:t>)</w:t>
-      </w:r>
-      <w:r>
-        <w:rPr>
-          <w:rFonts w:eastAsia="David" w:cs="David"/>
-          <w:sz w:val="24"/>
-          <w:szCs w:val="24"/>
-          <w:rtl w:val="true"/>
-        </w:rPr>
-        <w:t>.</w:t>
+          <w:rFonts w:eastAsia="David" w:cs="David"/>
+          <w:sz w:val="24"/>
+          <w:szCs w:val="24"/>
+          <w:rtl w:val="true"/>
+        </w:rPr>
+        <w:t>).</w:t>
       </w:r>
     </w:p>
     <w:p>
@@ -22474,7 +22456,7 @@
         <w:bidi w:val="1"/>
         <w:spacing w:lineRule="auto" w:line="360" w:before="0" w:after="120"/>
         <w:ind w:firstLine="567"/>
-        <w:jc w:val="both"/>
+        <w:jc w:val="left"/>
         <w:rPr/>
       </w:pPr>
       <w:r>
@@ -22688,7 +22670,7 @@
         <w:bidi w:val="1"/>
         <w:spacing w:lineRule="auto" w:line="360" w:before="0" w:after="120"/>
         <w:ind w:firstLine="567"/>
-        <w:jc w:val="both"/>
+        <w:jc w:val="left"/>
         <w:rPr/>
       </w:pPr>
       <w:r>
@@ -22948,7 +22930,7 @@
         <w:bidi w:val="1"/>
         <w:spacing w:lineRule="auto" w:line="360" w:before="0" w:after="120"/>
         <w:ind w:firstLine="567"/>
-        <w:jc w:val="both"/>
+        <w:jc w:val="left"/>
         <w:rPr/>
       </w:pPr>
       <w:r>
@@ -23215,7 +23197,7 @@
         <w:bidi w:val="1"/>
         <w:spacing w:lineRule="auto" w:line="360" w:before="0" w:after="120"/>
         <w:ind w:firstLine="567"/>
-        <w:jc w:val="both"/>
+        <w:jc w:val="left"/>
         <w:rPr/>
       </w:pPr>
       <w:r>
@@ -23870,7 +23852,7 @@
         <w:bidi w:val="1"/>
         <w:spacing w:lineRule="auto" w:line="360" w:before="0" w:after="120"/>
         <w:ind w:firstLine="567"/>
-        <w:jc w:val="both"/>
+        <w:jc w:val="left"/>
         <w:rPr/>
       </w:pPr>
       <w:r>
@@ -24234,7 +24216,7 @@
         <w:bidi w:val="1"/>
         <w:spacing w:lineRule="auto" w:line="360" w:before="0" w:after="120"/>
         <w:ind w:firstLine="567"/>
-        <w:jc w:val="both"/>
+        <w:jc w:val="left"/>
         <w:rPr/>
       </w:pPr>
       <w:r>
@@ -24677,7 +24659,7 @@
         <w:bidi w:val="1"/>
         <w:spacing w:lineRule="auto" w:line="360" w:before="0" w:after="120"/>
         <w:ind w:firstLine="567"/>
-        <w:jc w:val="both"/>
+        <w:jc w:val="left"/>
         <w:rPr/>
       </w:pPr>
       <w:r>
@@ -25030,7 +25012,7 @@
         <w:bidi w:val="1"/>
         <w:spacing w:lineRule="auto" w:line="360" w:before="0" w:after="120"/>
         <w:ind w:firstLine="567"/>
-        <w:jc w:val="both"/>
+        <w:jc w:val="left"/>
         <w:rPr/>
       </w:pPr>
       <w:r>
@@ -25225,7 +25207,7 @@
         <w:jc w:val="right"/>
         <w:rPr/>
       </w:pPr>
-      <w:bookmarkStart w:id="28" w:name="__RefHeading___Toc472_253614021"/>
+      <w:bookmarkStart w:id="28" w:name="__RefHeading___Toc465_1283528634"/>
       <w:bookmarkEnd w:id="28"/>
       <w:r>
         <w:rPr>
@@ -25268,7 +25250,7 @@
         <w:bidi w:val="1"/>
         <w:spacing w:lineRule="auto" w:line="360" w:before="0" w:after="120"/>
         <w:ind w:firstLine="567"/>
-        <w:jc w:val="both"/>
+        <w:jc w:val="left"/>
         <w:rPr/>
       </w:pPr>
       <w:r>
@@ -25468,7 +25450,7 @@
         <w:bidi w:val="1"/>
         <w:spacing w:lineRule="auto" w:line="360" w:before="0" w:after="120"/>
         <w:ind w:firstLine="567"/>
-        <w:jc w:val="both"/>
+        <w:jc w:val="left"/>
         <w:rPr/>
       </w:pPr>
       <w:r>
@@ -26186,7 +26168,7 @@
         <w:bidi w:val="1"/>
         <w:spacing w:lineRule="auto" w:line="360" w:before="0" w:after="120"/>
         <w:ind w:firstLine="567"/>
-        <w:jc w:val="both"/>
+        <w:jc w:val="left"/>
         <w:rPr/>
       </w:pPr>
       <w:r>
@@ -27040,7 +27022,7 @@
         <w:bidi w:val="1"/>
         <w:spacing w:lineRule="auto" w:line="360" w:before="0" w:after="120"/>
         <w:ind w:firstLine="567"/>
-        <w:jc w:val="both"/>
+        <w:jc w:val="left"/>
         <w:rPr/>
       </w:pPr>
       <w:r>
@@ -27440,7 +27422,7 @@
         <w:bidi w:val="1"/>
         <w:spacing w:lineRule="auto" w:line="360" w:before="0" w:after="120"/>
         <w:ind w:firstLine="567"/>
-        <w:jc w:val="both"/>
+        <w:jc w:val="left"/>
         <w:rPr/>
       </w:pPr>
       <w:r>
@@ -28092,7 +28074,7 @@
         <w:bidi w:val="1"/>
         <w:spacing w:lineRule="auto" w:line="360" w:before="0" w:after="120"/>
         <w:ind w:firstLine="567"/>
-        <w:jc w:val="both"/>
+        <w:jc w:val="left"/>
         <w:rPr/>
       </w:pPr>
       <w:r>
@@ -28437,7 +28419,7 @@
         <w:bidi w:val="1"/>
         <w:spacing w:lineRule="auto" w:line="360" w:before="0" w:after="120"/>
         <w:ind w:firstLine="567"/>
-        <w:jc w:val="both"/>
+        <w:jc w:val="left"/>
         <w:rPr/>
       </w:pPr>
       <w:r>
@@ -28977,7 +28959,7 @@
         <w:bidi w:val="1"/>
         <w:spacing w:lineRule="auto" w:line="360" w:before="0" w:after="120"/>
         <w:ind w:firstLine="567"/>
-        <w:jc w:val="both"/>
+        <w:jc w:val="left"/>
         <w:rPr/>
       </w:pPr>
       <w:r>
@@ -29461,7 +29443,7 @@
         <w:bidi w:val="1"/>
         <w:spacing w:lineRule="auto" w:line="360" w:before="0" w:after="120"/>
         <w:ind w:firstLine="567"/>
-        <w:jc w:val="both"/>
+        <w:jc w:val="left"/>
         <w:rPr/>
       </w:pPr>
       <w:r>
@@ -30191,7 +30173,7 @@
         <w:bidi w:val="1"/>
         <w:spacing w:lineRule="auto" w:line="360" w:before="0" w:after="120"/>
         <w:ind w:firstLine="567"/>
-        <w:jc w:val="both"/>
+        <w:jc w:val="left"/>
         <w:rPr/>
       </w:pPr>
       <w:r>
@@ -30676,7 +30658,7 @@
         <w:bidi w:val="1"/>
         <w:spacing w:lineRule="auto" w:line="360" w:before="0" w:after="120"/>
         <w:ind w:firstLine="567"/>
-        <w:jc w:val="both"/>
+        <w:jc w:val="left"/>
         <w:rPr/>
       </w:pPr>
       <w:r>
@@ -31104,7 +31086,7 @@
         <w:bidi w:val="1"/>
         <w:spacing w:lineRule="auto" w:line="360" w:before="0" w:after="120"/>
         <w:ind w:firstLine="567"/>
-        <w:jc w:val="both"/>
+        <w:jc w:val="left"/>
         <w:rPr/>
       </w:pPr>
       <w:r>
@@ -31652,7 +31634,7 @@
         <w:bidi w:val="1"/>
         <w:spacing w:lineRule="auto" w:line="360" w:before="0" w:after="120"/>
         <w:ind w:firstLine="567"/>
-        <w:jc w:val="both"/>
+        <w:jc w:val="left"/>
         <w:rPr/>
       </w:pPr>
       <w:r>
@@ -32166,7 +32148,7 @@
         <w:jc w:val="right"/>
         <w:rPr/>
       </w:pPr>
-      <w:bookmarkStart w:id="29" w:name="__RefHeading___Toc474_253614021"/>
+      <w:bookmarkStart w:id="29" w:name="__RefHeading___Toc467_1283528634"/>
       <w:bookmarkEnd w:id="29"/>
       <w:r>
         <w:rPr>
@@ -32209,7 +32191,7 @@
         <w:bidi w:val="1"/>
         <w:spacing w:lineRule="auto" w:line="360" w:before="0" w:after="120"/>
         <w:ind w:firstLine="567"/>
-        <w:jc w:val="both"/>
+        <w:jc w:val="left"/>
         <w:rPr/>
       </w:pPr>
       <w:r>
@@ -32542,7 +32524,7 @@
         <w:bidi w:val="1"/>
         <w:spacing w:lineRule="auto" w:line="360" w:before="0" w:after="120"/>
         <w:ind w:firstLine="567"/>
-        <w:jc w:val="both"/>
+        <w:jc w:val="left"/>
         <w:rPr/>
       </w:pPr>
       <w:r>
@@ -32875,7 +32857,7 @@
         <w:bidi w:val="1"/>
         <w:spacing w:lineRule="auto" w:line="360" w:before="0" w:after="120"/>
         <w:ind w:firstLine="567"/>
-        <w:jc w:val="both"/>
+        <w:jc w:val="left"/>
         <w:rPr/>
       </w:pPr>
       <w:r>
@@ -33322,7 +33304,7 @@
         <w:bidi w:val="1"/>
         <w:spacing w:lineRule="auto" w:line="360" w:before="0" w:after="120"/>
         <w:ind w:firstLine="567"/>
-        <w:jc w:val="both"/>
+        <w:jc w:val="left"/>
         <w:rPr/>
       </w:pPr>
       <w:r>
@@ -33824,7 +33806,7 @@
         <w:bidi w:val="1"/>
         <w:spacing w:lineRule="auto" w:line="360" w:before="0" w:after="120"/>
         <w:ind w:firstLine="567"/>
-        <w:jc w:val="both"/>
+        <w:jc w:val="left"/>
         <w:rPr/>
       </w:pPr>
       <w:r>
@@ -34190,7 +34172,7 @@
         <w:jc w:val="right"/>
         <w:rPr/>
       </w:pPr>
-      <w:bookmarkStart w:id="30" w:name="__RefHeading___Toc476_253614021"/>
+      <w:bookmarkStart w:id="30" w:name="__RefHeading___Toc469_1283528634"/>
       <w:bookmarkEnd w:id="30"/>
       <w:r>
         <w:rPr>
@@ -34285,7 +34267,7 @@
           <w:szCs w:val="24"/>
           <w:rtl w:val="true"/>
         </w:rPr>
-        <w:t xml:space="preserve">', </w:t>
+        <w:t xml:space="preserve">. </w:t>
       </w:r>
       <w:r>
         <w:rPr>
@@ -34333,7 +34315,7 @@
           <w:szCs w:val="24"/>
           <w:rtl w:val="true"/>
         </w:rPr>
-        <w:t>' (</w:t>
+        <w:t>. (</w:t>
       </w:r>
       <w:r>
         <w:rPr>
@@ -34472,6 +34454,109 @@
           <w:rtl w:val="true"/>
         </w:rPr>
         <w:t xml:space="preserve">. </w:t>
+      </w:r>
+      <w:r>
+        <w:rPr>
+          <w:rFonts w:ascii="David" w:hAnsi="David" w:eastAsia="David"/>
+          <w:i w:val="false"/>
+          <w:i w:val="false"/>
+          <w:iCs w:val="false"/>
+          <w:sz w:val="24"/>
+          <w:sz w:val="24"/>
+          <w:szCs w:val="24"/>
+          <w:rtl w:val="true"/>
+        </w:rPr>
+        <w:t>אוחזר ב</w:t>
+      </w:r>
+      <w:r>
+        <w:rPr>
+          <w:rFonts w:eastAsia="David" w:cs="David"/>
+          <w:i w:val="false"/>
+          <w:iCs w:val="false"/>
+          <w:sz w:val="24"/>
+          <w:szCs w:val="24"/>
+          <w:rtl w:val="true"/>
+        </w:rPr>
+        <w:t>-</w:t>
+      </w:r>
+      <w:r>
+        <w:rPr>
+          <w:rFonts w:eastAsia="David" w:cs="David"/>
+          <w:i w:val="false"/>
+          <w:iCs w:val="false"/>
+          <w:sz w:val="24"/>
+          <w:szCs w:val="24"/>
+        </w:rPr>
+        <w:t>16</w:t>
+      </w:r>
+      <w:r>
+        <w:rPr>
+          <w:rFonts w:eastAsia="David" w:cs="David"/>
+          <w:i w:val="false"/>
+          <w:iCs w:val="false"/>
+          <w:sz w:val="24"/>
+          <w:szCs w:val="24"/>
+          <w:rtl w:val="true"/>
+        </w:rPr>
+        <w:t xml:space="preserve"> </w:t>
+      </w:r>
+      <w:r>
+        <w:rPr>
+          <w:rFonts w:ascii="David" w:hAnsi="David" w:eastAsia="David"/>
+          <w:i w:val="false"/>
+          <w:i w:val="false"/>
+          <w:iCs w:val="false"/>
+          <w:sz w:val="24"/>
+          <w:sz w:val="24"/>
+          <w:szCs w:val="24"/>
+          <w:rtl w:val="true"/>
+        </w:rPr>
+        <w:t>בספטמבר</w:t>
+      </w:r>
+      <w:r>
+        <w:rPr>
+          <w:rFonts w:eastAsia="David" w:cs="David"/>
+          <w:i w:val="false"/>
+          <w:iCs w:val="false"/>
+          <w:sz w:val="24"/>
+          <w:szCs w:val="24"/>
+          <w:rtl w:val="true"/>
+        </w:rPr>
+        <w:t xml:space="preserve">, </w:t>
+      </w:r>
+      <w:r>
+        <w:rPr>
+          <w:rFonts w:eastAsia="David" w:cs="David"/>
+          <w:i w:val="false"/>
+          <w:iCs w:val="false"/>
+          <w:sz w:val="24"/>
+          <w:szCs w:val="24"/>
+        </w:rPr>
+        <w:t>2026</w:t>
+      </w:r>
+      <w:r>
+        <w:rPr>
+          <w:rFonts w:eastAsia="David" w:cs="David"/>
+          <w:i w:val="false"/>
+          <w:iCs w:val="false"/>
+          <w:sz w:val="24"/>
+          <w:szCs w:val="24"/>
+          <w:rtl w:val="true"/>
+        </w:rPr>
+        <w:t xml:space="preserve">, </w:t>
+      </w:r>
+      <w:r>
+        <w:rPr>
+          <w:rFonts w:ascii="David" w:hAnsi="David" w:eastAsia="David"/>
+          <w:i w:val="false"/>
+          <w:i w:val="false"/>
+          <w:iCs w:val="false"/>
+          <w:sz w:val="24"/>
+          <w:sz w:val="24"/>
+          <w:szCs w:val="24"/>
+          <w:rtl w:val="true"/>
+        </w:rPr>
+        <w:t xml:space="preserve">מתוך </w:t>
       </w:r>
       <w:r>
         <w:rPr>
@@ -34539,6 +34624,54 @@
           <w:szCs w:val="24"/>
           <w:rtl w:val="true"/>
         </w:rPr>
+        <w:t xml:space="preserve">., </w:t>
+      </w:r>
+      <w:r>
+        <w:rPr>
+          <w:rFonts w:ascii="David" w:hAnsi="David" w:eastAsia="David"/>
+          <w:i w:val="false"/>
+          <w:i w:val="false"/>
+          <w:iCs w:val="false"/>
+          <w:sz w:val="24"/>
+          <w:sz w:val="24"/>
+          <w:szCs w:val="24"/>
+          <w:rtl w:val="true"/>
+        </w:rPr>
+        <w:t>שניצר</w:t>
+      </w:r>
+      <w:r>
+        <w:rPr>
+          <w:rFonts w:eastAsia="David" w:cs="David"/>
+          <w:i w:val="false"/>
+          <w:iCs w:val="false"/>
+          <w:sz w:val="24"/>
+          <w:szCs w:val="24"/>
+          <w:rtl w:val="true"/>
+        </w:rPr>
+        <w:t>-</w:t>
+      </w:r>
+      <w:r>
+        <w:rPr>
+          <w:rFonts w:ascii="David" w:hAnsi="David" w:eastAsia="David"/>
+          <w:i w:val="false"/>
+          <w:i w:val="false"/>
+          <w:iCs w:val="false"/>
+          <w:sz w:val="24"/>
+          <w:sz w:val="24"/>
+          <w:szCs w:val="24"/>
+          <w:rtl w:val="true"/>
+        </w:rPr>
+        <w:t>מאירוביץ</w:t>
+      </w:r>
+      <w:r>
+        <w:rPr>
+          <w:rFonts w:eastAsia="David" w:cs="David"/>
+          <w:i w:val="false"/>
+          <w:iCs w:val="false"/>
+          <w:sz w:val="24"/>
+          <w:szCs w:val="24"/>
+          <w:rtl w:val="true"/>
+        </w:rPr>
         <w:t xml:space="preserve">', </w:t>
       </w:r>
       <w:r>
@@ -34552,7 +34685,7 @@
           <w:szCs w:val="24"/>
           <w:rtl w:val="true"/>
         </w:rPr>
-        <w:t>שניצר</w:t>
+        <w:t>ש</w:t>
       </w:r>
       <w:r>
         <w:rPr>
@@ -34563,7 +34696,7 @@
           <w:szCs w:val="24"/>
           <w:rtl w:val="true"/>
         </w:rPr>
-        <w:t>-</w:t>
+        <w:t xml:space="preserve">., </w:t>
       </w:r>
       <w:r>
         <w:rPr>
@@ -34576,7 +34709,7 @@
           <w:szCs w:val="24"/>
           <w:rtl w:val="true"/>
         </w:rPr>
-        <w:t>מאירוביץ</w:t>
+        <w:t>רייך</w:t>
       </w:r>
       <w:r>
         <w:rPr>
@@ -34587,7 +34720,7 @@
           <w:szCs w:val="24"/>
           <w:rtl w:val="true"/>
         </w:rPr>
-        <w:t xml:space="preserve">', </w:t>
+        <w:t xml:space="preserve">, </w:t>
       </w:r>
       <w:r>
         <w:rPr>
@@ -34600,7 +34733,7 @@
           <w:szCs w:val="24"/>
           <w:rtl w:val="true"/>
         </w:rPr>
-        <w:t>ש</w:t>
+        <w:t>א</w:t>
       </w:r>
       <w:r>
         <w:rPr>
@@ -34611,7 +34744,7 @@
           <w:szCs w:val="24"/>
           <w:rtl w:val="true"/>
         </w:rPr>
-        <w:t xml:space="preserve">', </w:t>
+        <w:t xml:space="preserve">., </w:t>
       </w:r>
       <w:r>
         <w:rPr>
@@ -34624,7 +34757,7 @@
           <w:szCs w:val="24"/>
           <w:rtl w:val="true"/>
         </w:rPr>
-        <w:t>רייך</w:t>
+        <w:t>ליפשיץ</w:t>
       </w:r>
       <w:r>
         <w:rPr>
@@ -34648,6 +34781,78 @@
           <w:szCs w:val="24"/>
           <w:rtl w:val="true"/>
         </w:rPr>
+        <w:t>ח</w:t>
+      </w:r>
+      <w:r>
+        <w:rPr>
+          <w:rFonts w:eastAsia="David" w:cs="David"/>
+          <w:i w:val="false"/>
+          <w:iCs w:val="false"/>
+          <w:sz w:val="24"/>
+          <w:szCs w:val="24"/>
+          <w:rtl w:val="true"/>
+        </w:rPr>
+        <w:t xml:space="preserve">. </w:t>
+      </w:r>
+      <w:r>
+        <w:rPr>
+          <w:rFonts w:ascii="David" w:hAnsi="David" w:eastAsia="David"/>
+          <w:i w:val="false"/>
+          <w:i w:val="false"/>
+          <w:iCs w:val="false"/>
+          <w:sz w:val="24"/>
+          <w:sz w:val="24"/>
+          <w:szCs w:val="24"/>
+          <w:rtl w:val="true"/>
+        </w:rPr>
+        <w:t>ב</w:t>
+      </w:r>
+      <w:r>
+        <w:rPr>
+          <w:rFonts w:eastAsia="David" w:cs="David"/>
+          <w:i w:val="false"/>
+          <w:iCs w:val="false"/>
+          <w:sz w:val="24"/>
+          <w:szCs w:val="24"/>
+          <w:rtl w:val="true"/>
+        </w:rPr>
+        <w:t xml:space="preserve">., </w:t>
+      </w:r>
+      <w:r>
+        <w:rPr>
+          <w:rFonts w:ascii="David" w:hAnsi="David" w:eastAsia="David"/>
+          <w:i w:val="false"/>
+          <w:i w:val="false"/>
+          <w:iCs w:val="false"/>
+          <w:sz w:val="24"/>
+          <w:sz w:val="24"/>
+          <w:szCs w:val="24"/>
+          <w:rtl w:val="true"/>
+        </w:rPr>
+        <w:t>וגור</w:t>
+      </w:r>
+      <w:r>
+        <w:rPr>
+          <w:rFonts w:eastAsia="David" w:cs="David"/>
+          <w:i w:val="false"/>
+          <w:iCs w:val="false"/>
+          <w:sz w:val="24"/>
+          <w:szCs w:val="24"/>
+          <w:rtl w:val="true"/>
+        </w:rPr>
+        <w:t xml:space="preserve">, </w:t>
+      </w:r>
+      <w:r>
+        <w:rPr>
+          <w:rFonts w:ascii="David" w:hAnsi="David" w:eastAsia="David"/>
+          <w:i w:val="false"/>
+          <w:i w:val="false"/>
+          <w:iCs w:val="false"/>
+          <w:sz w:val="24"/>
+          <w:sz w:val="24"/>
+          <w:szCs w:val="24"/>
+          <w:rtl w:val="true"/>
+        </w:rPr>
         <w:t>א</w:t>
       </w:r>
       <w:r>
@@ -34659,127 +34864,7 @@
           <w:szCs w:val="24"/>
           <w:rtl w:val="true"/>
         </w:rPr>
-        <w:t xml:space="preserve">', </w:t>
-      </w:r>
-      <w:r>
-        <w:rPr>
-          <w:rFonts w:ascii="David" w:hAnsi="David" w:eastAsia="David"/>
-          <w:i w:val="false"/>
-          <w:i w:val="false"/>
-          <w:iCs w:val="false"/>
-          <w:sz w:val="24"/>
-          <w:sz w:val="24"/>
-          <w:szCs w:val="24"/>
-          <w:rtl w:val="true"/>
-        </w:rPr>
-        <w:t>ליפשיץ</w:t>
-      </w:r>
-      <w:r>
-        <w:rPr>
-          <w:rFonts w:eastAsia="David" w:cs="David"/>
-          <w:i w:val="false"/>
-          <w:iCs w:val="false"/>
-          <w:sz w:val="24"/>
-          <w:szCs w:val="24"/>
-          <w:rtl w:val="true"/>
-        </w:rPr>
-        <w:t xml:space="preserve">, </w:t>
-      </w:r>
-      <w:r>
-        <w:rPr>
-          <w:rFonts w:ascii="David" w:hAnsi="David" w:eastAsia="David"/>
-          <w:i w:val="false"/>
-          <w:i w:val="false"/>
-          <w:iCs w:val="false"/>
-          <w:sz w:val="24"/>
-          <w:sz w:val="24"/>
-          <w:szCs w:val="24"/>
-          <w:rtl w:val="true"/>
-        </w:rPr>
-        <w:t>ח</w:t>
-      </w:r>
-      <w:r>
-        <w:rPr>
-          <w:rFonts w:eastAsia="David" w:cs="David"/>
-          <w:i w:val="false"/>
-          <w:iCs w:val="false"/>
-          <w:sz w:val="24"/>
-          <w:szCs w:val="24"/>
-          <w:rtl w:val="true"/>
-        </w:rPr>
-        <w:t xml:space="preserve">' </w:t>
-      </w:r>
-      <w:r>
-        <w:rPr>
-          <w:rFonts w:ascii="David" w:hAnsi="David" w:eastAsia="David"/>
-          <w:i w:val="false"/>
-          <w:i w:val="false"/>
-          <w:iCs w:val="false"/>
-          <w:sz w:val="24"/>
-          <w:sz w:val="24"/>
-          <w:szCs w:val="24"/>
-          <w:rtl w:val="true"/>
-        </w:rPr>
-        <w:t>ב</w:t>
-      </w:r>
-      <w:r>
-        <w:rPr>
-          <w:rFonts w:eastAsia="David" w:cs="David"/>
-          <w:i w:val="false"/>
-          <w:iCs w:val="false"/>
-          <w:sz w:val="24"/>
-          <w:szCs w:val="24"/>
-          <w:rtl w:val="true"/>
-        </w:rPr>
-        <w:t xml:space="preserve">', </w:t>
-      </w:r>
-      <w:r>
-        <w:rPr>
-          <w:rFonts w:ascii="David" w:hAnsi="David" w:eastAsia="David"/>
-          <w:i w:val="false"/>
-          <w:i w:val="false"/>
-          <w:iCs w:val="false"/>
-          <w:sz w:val="24"/>
-          <w:sz w:val="24"/>
-          <w:szCs w:val="24"/>
-          <w:rtl w:val="true"/>
-        </w:rPr>
-        <w:t>וגור</w:t>
-      </w:r>
-      <w:r>
-        <w:rPr>
-          <w:rFonts w:eastAsia="David" w:cs="David"/>
-          <w:i w:val="false"/>
-          <w:iCs w:val="false"/>
-          <w:sz w:val="24"/>
-          <w:szCs w:val="24"/>
-          <w:rtl w:val="true"/>
-        </w:rPr>
-        <w:t xml:space="preserve">, </w:t>
-      </w:r>
-      <w:r>
-        <w:rPr>
-          <w:rFonts w:ascii="David" w:hAnsi="David" w:eastAsia="David"/>
-          <w:i w:val="false"/>
-          <w:i w:val="false"/>
-          <w:iCs w:val="false"/>
-          <w:sz w:val="24"/>
-          <w:sz w:val="24"/>
-          <w:szCs w:val="24"/>
-          <w:rtl w:val="true"/>
-        </w:rPr>
-        <w:t>א</w:t>
-      </w:r>
-      <w:r>
-        <w:rPr>
-          <w:rFonts w:eastAsia="David" w:cs="David"/>
-          <w:i w:val="false"/>
-          <w:iCs w:val="false"/>
-          <w:sz w:val="24"/>
-          <w:szCs w:val="24"/>
-          <w:rtl w:val="true"/>
-        </w:rPr>
-        <w:t>' (</w:t>
+        <w:t>. (</w:t>
       </w:r>
       <w:r>
         <w:rPr>
@@ -34915,6 +35000,109 @@
           <w:rtl w:val="true"/>
         </w:rPr>
         <w:t xml:space="preserve">. </w:t>
+      </w:r>
+      <w:r>
+        <w:rPr>
+          <w:rFonts w:ascii="David" w:hAnsi="David" w:eastAsia="David"/>
+          <w:i w:val="false"/>
+          <w:i w:val="false"/>
+          <w:iCs w:val="false"/>
+          <w:sz w:val="24"/>
+          <w:sz w:val="24"/>
+          <w:szCs w:val="24"/>
+          <w:rtl w:val="true"/>
+        </w:rPr>
+        <w:t>אוחזר ב</w:t>
+      </w:r>
+      <w:r>
+        <w:rPr>
+          <w:rFonts w:eastAsia="David" w:cs="David"/>
+          <w:i w:val="false"/>
+          <w:iCs w:val="false"/>
+          <w:sz w:val="24"/>
+          <w:szCs w:val="24"/>
+          <w:rtl w:val="true"/>
+        </w:rPr>
+        <w:t>-</w:t>
+      </w:r>
+      <w:r>
+        <w:rPr>
+          <w:rFonts w:eastAsia="David" w:cs="David"/>
+          <w:i w:val="false"/>
+          <w:iCs w:val="false"/>
+          <w:sz w:val="24"/>
+          <w:szCs w:val="24"/>
+        </w:rPr>
+        <w:t>16</w:t>
+      </w:r>
+      <w:r>
+        <w:rPr>
+          <w:rFonts w:eastAsia="David" w:cs="David"/>
+          <w:i w:val="false"/>
+          <w:iCs w:val="false"/>
+          <w:sz w:val="24"/>
+          <w:szCs w:val="24"/>
+          <w:rtl w:val="true"/>
+        </w:rPr>
+        <w:t xml:space="preserve"> </w:t>
+      </w:r>
+      <w:r>
+        <w:rPr>
+          <w:rFonts w:ascii="David" w:hAnsi="David" w:eastAsia="David"/>
+          <w:i w:val="false"/>
+          <w:i w:val="false"/>
+          <w:iCs w:val="false"/>
+          <w:sz w:val="24"/>
+          <w:sz w:val="24"/>
+          <w:szCs w:val="24"/>
+          <w:rtl w:val="true"/>
+        </w:rPr>
+        <w:t>בספטמבר</w:t>
+      </w:r>
+      <w:r>
+        <w:rPr>
+          <w:rFonts w:eastAsia="David" w:cs="David"/>
+          <w:i w:val="false"/>
+          <w:iCs w:val="false"/>
+          <w:sz w:val="24"/>
+          <w:szCs w:val="24"/>
+          <w:rtl w:val="true"/>
+        </w:rPr>
+        <w:t xml:space="preserve">, </w:t>
+      </w:r>
+      <w:r>
+        <w:rPr>
+          <w:rFonts w:eastAsia="David" w:cs="David"/>
+          <w:i w:val="false"/>
+          <w:iCs w:val="false"/>
+          <w:sz w:val="24"/>
+          <w:szCs w:val="24"/>
+        </w:rPr>
+        <w:t>2026</w:t>
+      </w:r>
+      <w:r>
+        <w:rPr>
+          <w:rFonts w:eastAsia="David" w:cs="David"/>
+          <w:i w:val="false"/>
+          <w:iCs w:val="false"/>
+          <w:sz w:val="24"/>
+          <w:szCs w:val="24"/>
+          <w:rtl w:val="true"/>
+        </w:rPr>
+        <w:t xml:space="preserve">, </w:t>
+      </w:r>
+      <w:r>
+        <w:rPr>
+          <w:rFonts w:ascii="David" w:hAnsi="David" w:eastAsia="David"/>
+          <w:i w:val="false"/>
+          <w:i w:val="false"/>
+          <w:iCs w:val="false"/>
+          <w:sz w:val="24"/>
+          <w:sz w:val="24"/>
+          <w:szCs w:val="24"/>
+          <w:rtl w:val="true"/>
+        </w:rPr>
+        <w:t xml:space="preserve">מתוך </w:t>
       </w:r>
       <w:r>
         <w:rPr>
@@ -35017,6 +35205,102 @@
           <w:szCs w:val="24"/>
           <w:rtl w:val="true"/>
         </w:rPr>
+        <w:t xml:space="preserve">., </w:t>
+      </w:r>
+      <w:r>
+        <w:rPr>
+          <w:rFonts w:ascii="David" w:hAnsi="David" w:eastAsia="David"/>
+          <w:i w:val="false"/>
+          <w:i w:val="false"/>
+          <w:iCs w:val="false"/>
+          <w:sz w:val="24"/>
+          <w:sz w:val="24"/>
+          <w:szCs w:val="24"/>
+          <w:rtl w:val="true"/>
+        </w:rPr>
+        <w:t>גור</w:t>
+      </w:r>
+      <w:r>
+        <w:rPr>
+          <w:rFonts w:eastAsia="David" w:cs="David"/>
+          <w:i w:val="false"/>
+          <w:iCs w:val="false"/>
+          <w:sz w:val="24"/>
+          <w:szCs w:val="24"/>
+          <w:rtl w:val="true"/>
+        </w:rPr>
+        <w:t xml:space="preserve">, </w:t>
+      </w:r>
+      <w:r>
+        <w:rPr>
+          <w:rFonts w:ascii="David" w:hAnsi="David" w:eastAsia="David"/>
+          <w:i w:val="false"/>
+          <w:i w:val="false"/>
+          <w:iCs w:val="false"/>
+          <w:sz w:val="24"/>
+          <w:sz w:val="24"/>
+          <w:szCs w:val="24"/>
+          <w:rtl w:val="true"/>
+        </w:rPr>
+        <w:t>א</w:t>
+      </w:r>
+      <w:r>
+        <w:rPr>
+          <w:rFonts w:eastAsia="David" w:cs="David"/>
+          <w:i w:val="false"/>
+          <w:iCs w:val="false"/>
+          <w:sz w:val="24"/>
+          <w:szCs w:val="24"/>
+          <w:rtl w:val="true"/>
+        </w:rPr>
+        <w:t xml:space="preserve">., </w:t>
+      </w:r>
+      <w:r>
+        <w:rPr>
+          <w:rFonts w:ascii="David" w:hAnsi="David" w:eastAsia="David"/>
+          <w:i w:val="false"/>
+          <w:i w:val="false"/>
+          <w:iCs w:val="false"/>
+          <w:sz w:val="24"/>
+          <w:sz w:val="24"/>
+          <w:szCs w:val="24"/>
+          <w:rtl w:val="true"/>
+        </w:rPr>
+        <w:t>שניצר</w:t>
+      </w:r>
+      <w:r>
+        <w:rPr>
+          <w:rFonts w:eastAsia="David" w:cs="David"/>
+          <w:i w:val="false"/>
+          <w:iCs w:val="false"/>
+          <w:sz w:val="24"/>
+          <w:szCs w:val="24"/>
+          <w:rtl w:val="true"/>
+        </w:rPr>
+        <w:t>-</w:t>
+      </w:r>
+      <w:r>
+        <w:rPr>
+          <w:rFonts w:ascii="David" w:hAnsi="David" w:eastAsia="David"/>
+          <w:i w:val="false"/>
+          <w:i w:val="false"/>
+          <w:iCs w:val="false"/>
+          <w:sz w:val="24"/>
+          <w:sz w:val="24"/>
+          <w:szCs w:val="24"/>
+          <w:rtl w:val="true"/>
+        </w:rPr>
+        <w:t>מאירוביץ</w:t>
+      </w:r>
+      <w:r>
+        <w:rPr>
+          <w:rFonts w:eastAsia="David" w:cs="David"/>
+          <w:i w:val="false"/>
+          <w:iCs w:val="false"/>
+          <w:sz w:val="24"/>
+          <w:szCs w:val="24"/>
+          <w:rtl w:val="true"/>
+        </w:rPr>
         <w:t xml:space="preserve">', </w:t>
       </w:r>
       <w:r>
@@ -35030,7 +35314,7 @@
           <w:szCs w:val="24"/>
           <w:rtl w:val="true"/>
         </w:rPr>
-        <w:t>גור</w:t>
+        <w:t>ש</w:t>
       </w:r>
       <w:r>
         <w:rPr>
@@ -35041,103 +35325,7 @@
           <w:szCs w:val="24"/>
           <w:rtl w:val="true"/>
         </w:rPr>
-        <w:t xml:space="preserve">, </w:t>
-      </w:r>
-      <w:r>
-        <w:rPr>
-          <w:rFonts w:ascii="David" w:hAnsi="David" w:eastAsia="David"/>
-          <w:i w:val="false"/>
-          <w:i w:val="false"/>
-          <w:iCs w:val="false"/>
-          <w:sz w:val="24"/>
-          <w:sz w:val="24"/>
-          <w:szCs w:val="24"/>
-          <w:rtl w:val="true"/>
-        </w:rPr>
-        <w:t>א</w:t>
-      </w:r>
-      <w:r>
-        <w:rPr>
-          <w:rFonts w:eastAsia="David" w:cs="David"/>
-          <w:i w:val="false"/>
-          <w:iCs w:val="false"/>
-          <w:sz w:val="24"/>
-          <w:szCs w:val="24"/>
-          <w:rtl w:val="true"/>
-        </w:rPr>
-        <w:t xml:space="preserve">', </w:t>
-      </w:r>
-      <w:r>
-        <w:rPr>
-          <w:rFonts w:ascii="David" w:hAnsi="David" w:eastAsia="David"/>
-          <w:i w:val="false"/>
-          <w:i w:val="false"/>
-          <w:iCs w:val="false"/>
-          <w:sz w:val="24"/>
-          <w:sz w:val="24"/>
-          <w:szCs w:val="24"/>
-          <w:rtl w:val="true"/>
-        </w:rPr>
-        <w:t>שניצר</w:t>
-      </w:r>
-      <w:r>
-        <w:rPr>
-          <w:rFonts w:eastAsia="David" w:cs="David"/>
-          <w:i w:val="false"/>
-          <w:iCs w:val="false"/>
-          <w:sz w:val="24"/>
-          <w:szCs w:val="24"/>
-          <w:rtl w:val="true"/>
-        </w:rPr>
-        <w:t>-</w:t>
-      </w:r>
-      <w:r>
-        <w:rPr>
-          <w:rFonts w:ascii="David" w:hAnsi="David" w:eastAsia="David"/>
-          <w:i w:val="false"/>
-          <w:i w:val="false"/>
-          <w:iCs w:val="false"/>
-          <w:sz w:val="24"/>
-          <w:sz w:val="24"/>
-          <w:szCs w:val="24"/>
-          <w:rtl w:val="true"/>
-        </w:rPr>
-        <w:t>מאירוביץ</w:t>
-      </w:r>
-      <w:r>
-        <w:rPr>
-          <w:rFonts w:eastAsia="David" w:cs="David"/>
-          <w:i w:val="false"/>
-          <w:iCs w:val="false"/>
-          <w:sz w:val="24"/>
-          <w:szCs w:val="24"/>
-          <w:rtl w:val="true"/>
-        </w:rPr>
-        <w:t xml:space="preserve">', </w:t>
-      </w:r>
-      <w:r>
-        <w:rPr>
-          <w:rFonts w:ascii="David" w:hAnsi="David" w:eastAsia="David"/>
-          <w:i w:val="false"/>
-          <w:i w:val="false"/>
-          <w:iCs w:val="false"/>
-          <w:sz w:val="24"/>
-          <w:sz w:val="24"/>
-          <w:szCs w:val="24"/>
-          <w:rtl w:val="true"/>
-        </w:rPr>
-        <w:t>ש</w:t>
-      </w:r>
-      <w:r>
-        <w:rPr>
-          <w:rFonts w:eastAsia="David" w:cs="David"/>
-          <w:i w:val="false"/>
-          <w:iCs w:val="false"/>
-          <w:sz w:val="24"/>
-          <w:szCs w:val="24"/>
-          <w:rtl w:val="true"/>
-        </w:rPr>
-        <w:t xml:space="preserve">', </w:t>
+        <w:t xml:space="preserve">., </w:t>
       </w:r>
       <w:r>
         <w:rPr>
@@ -35424,6 +35612,109 @@
           <w:rtl w:val="true"/>
         </w:rPr>
         <w:t xml:space="preserve">. </w:t>
+      </w:r>
+      <w:r>
+        <w:rPr>
+          <w:rFonts w:ascii="David" w:hAnsi="David" w:eastAsia="David"/>
+          <w:i w:val="false"/>
+          <w:i w:val="false"/>
+          <w:iCs w:val="false"/>
+          <w:sz w:val="24"/>
+          <w:sz w:val="24"/>
+          <w:szCs w:val="24"/>
+          <w:rtl w:val="true"/>
+        </w:rPr>
+        <w:t>אוחזר ב</w:t>
+      </w:r>
+      <w:r>
+        <w:rPr>
+          <w:rFonts w:eastAsia="David" w:cs="David"/>
+          <w:i w:val="false"/>
+          <w:iCs w:val="false"/>
+          <w:sz w:val="24"/>
+          <w:szCs w:val="24"/>
+          <w:rtl w:val="true"/>
+        </w:rPr>
+        <w:t>-</w:t>
+      </w:r>
+      <w:r>
+        <w:rPr>
+          <w:rFonts w:eastAsia="David" w:cs="David"/>
+          <w:i w:val="false"/>
+          <w:iCs w:val="false"/>
+          <w:sz w:val="24"/>
+          <w:szCs w:val="24"/>
+        </w:rPr>
+        <w:t>16</w:t>
+      </w:r>
+      <w:r>
+        <w:rPr>
+          <w:rFonts w:eastAsia="David" w:cs="David"/>
+          <w:i w:val="false"/>
+          <w:iCs w:val="false"/>
+          <w:sz w:val="24"/>
+          <w:szCs w:val="24"/>
+          <w:rtl w:val="true"/>
+        </w:rPr>
+        <w:t xml:space="preserve"> </w:t>
+      </w:r>
+      <w:r>
+        <w:rPr>
+          <w:rFonts w:ascii="David" w:hAnsi="David" w:eastAsia="David"/>
+          <w:i w:val="false"/>
+          <w:i w:val="false"/>
+          <w:iCs w:val="false"/>
+          <w:sz w:val="24"/>
+          <w:sz w:val="24"/>
+          <w:szCs w:val="24"/>
+          <w:rtl w:val="true"/>
+        </w:rPr>
+        <w:t>בספטמבר</w:t>
+      </w:r>
+      <w:r>
+        <w:rPr>
+          <w:rFonts w:eastAsia="David" w:cs="David"/>
+          <w:i w:val="false"/>
+          <w:iCs w:val="false"/>
+          <w:sz w:val="24"/>
+          <w:szCs w:val="24"/>
+          <w:rtl w:val="true"/>
+        </w:rPr>
+        <w:t xml:space="preserve">, </w:t>
+      </w:r>
+      <w:r>
+        <w:rPr>
+          <w:rFonts w:eastAsia="David" w:cs="David"/>
+          <w:i w:val="false"/>
+          <w:iCs w:val="false"/>
+          <w:sz w:val="24"/>
+          <w:szCs w:val="24"/>
+        </w:rPr>
+        <w:t>2026</w:t>
+      </w:r>
+      <w:r>
+        <w:rPr>
+          <w:rFonts w:eastAsia="David" w:cs="David"/>
+          <w:i w:val="false"/>
+          <w:iCs w:val="false"/>
+          <w:sz w:val="24"/>
+          <w:szCs w:val="24"/>
+          <w:rtl w:val="true"/>
+        </w:rPr>
+        <w:t xml:space="preserve">, </w:t>
+      </w:r>
+      <w:r>
+        <w:rPr>
+          <w:rFonts w:ascii="David" w:hAnsi="David" w:eastAsia="David"/>
+          <w:i w:val="false"/>
+          <w:i w:val="false"/>
+          <w:iCs w:val="false"/>
+          <w:sz w:val="24"/>
+          <w:sz w:val="24"/>
+          <w:szCs w:val="24"/>
+          <w:rtl w:val="true"/>
+        </w:rPr>
+        <w:t xml:space="preserve">מתוך </w:t>
       </w:r>
       <w:r>
         <w:rPr>
@@ -35491,7 +35782,7 @@
           <w:szCs w:val="24"/>
           <w:rtl w:val="true"/>
         </w:rPr>
-        <w:t>' (</w:t>
+        <w:t>. (</w:t>
       </w:r>
       <w:r>
         <w:rPr>
@@ -35621,18 +35912,9 @@
           <w:iCs w:val="false"/>
           <w:sz w:val="24"/>
           <w:szCs w:val="24"/>
-        </w:rPr>
-        <w:t xml:space="preserve">. </w:t>
-      </w:r>
-      <w:r>
-        <w:rPr>
-          <w:rFonts w:eastAsia="Times New Roman" w:cs="Times New Roman" w:ascii="Times New Roman" w:hAnsi="Times New Roman"/>
-          <w:i w:val="false"/>
-          <w:iCs w:val="false"/>
-          <w:sz w:val="24"/>
-          <w:szCs w:val="24"/>
-        </w:rPr>
-        <w:t>https://www.jstor.org/stable/23469950</w:t>
+          <w:rtl w:val="true"/>
+        </w:rPr>
+        <w:t>.</w:t>
       </w:r>
     </w:p>
     <w:p>
@@ -35690,7 +35972,7 @@
           <w:szCs w:val="24"/>
           <w:rtl w:val="true"/>
         </w:rPr>
-        <w:t xml:space="preserve">', </w:t>
+        <w:t xml:space="preserve">., </w:t>
       </w:r>
       <w:r>
         <w:rPr>
@@ -35738,7 +36020,7 @@
           <w:szCs w:val="24"/>
           <w:rtl w:val="true"/>
         </w:rPr>
-        <w:t xml:space="preserve">', </w:t>
+        <w:t xml:space="preserve">., </w:t>
       </w:r>
       <w:r>
         <w:rPr>
@@ -35810,7 +36092,7 @@
           <w:szCs w:val="24"/>
           <w:rtl w:val="true"/>
         </w:rPr>
-        <w:t>' (</w:t>
+        <w:t>. (</w:t>
       </w:r>
       <w:r>
         <w:rPr>
@@ -35970,6 +36252,109 @@
           <w:rtl w:val="true"/>
         </w:rPr>
         <w:t xml:space="preserve">. </w:t>
+      </w:r>
+      <w:r>
+        <w:rPr>
+          <w:rFonts w:ascii="David" w:hAnsi="David" w:eastAsia="David"/>
+          <w:i w:val="false"/>
+          <w:i w:val="false"/>
+          <w:iCs w:val="false"/>
+          <w:sz w:val="24"/>
+          <w:sz w:val="24"/>
+          <w:szCs w:val="24"/>
+          <w:rtl w:val="true"/>
+        </w:rPr>
+        <w:t>אוחזר ב</w:t>
+      </w:r>
+      <w:r>
+        <w:rPr>
+          <w:rFonts w:eastAsia="David" w:cs="David"/>
+          <w:i w:val="false"/>
+          <w:iCs w:val="false"/>
+          <w:sz w:val="24"/>
+          <w:szCs w:val="24"/>
+          <w:rtl w:val="true"/>
+        </w:rPr>
+        <w:t>-</w:t>
+      </w:r>
+      <w:r>
+        <w:rPr>
+          <w:rFonts w:eastAsia="David" w:cs="David"/>
+          <w:i w:val="false"/>
+          <w:iCs w:val="false"/>
+          <w:sz w:val="24"/>
+          <w:szCs w:val="24"/>
+        </w:rPr>
+        <w:t>16</w:t>
+      </w:r>
+      <w:r>
+        <w:rPr>
+          <w:rFonts w:eastAsia="David" w:cs="David"/>
+          <w:i w:val="false"/>
+          <w:iCs w:val="false"/>
+          <w:sz w:val="24"/>
+          <w:szCs w:val="24"/>
+          <w:rtl w:val="true"/>
+        </w:rPr>
+        <w:t xml:space="preserve"> </w:t>
+      </w:r>
+      <w:r>
+        <w:rPr>
+          <w:rFonts w:ascii="David" w:hAnsi="David" w:eastAsia="David"/>
+          <w:i w:val="false"/>
+          <w:i w:val="false"/>
+          <w:iCs w:val="false"/>
+          <w:sz w:val="24"/>
+          <w:sz w:val="24"/>
+          <w:szCs w:val="24"/>
+          <w:rtl w:val="true"/>
+        </w:rPr>
+        <w:t>בספטמבר</w:t>
+      </w:r>
+      <w:r>
+        <w:rPr>
+          <w:rFonts w:eastAsia="David" w:cs="David"/>
+          <w:i w:val="false"/>
+          <w:iCs w:val="false"/>
+          <w:sz w:val="24"/>
+          <w:szCs w:val="24"/>
+          <w:rtl w:val="true"/>
+        </w:rPr>
+        <w:t xml:space="preserve">, </w:t>
+      </w:r>
+      <w:r>
+        <w:rPr>
+          <w:rFonts w:eastAsia="David" w:cs="David"/>
+          <w:i w:val="false"/>
+          <w:iCs w:val="false"/>
+          <w:sz w:val="24"/>
+          <w:szCs w:val="24"/>
+        </w:rPr>
+        <w:t>2026</w:t>
+      </w:r>
+      <w:r>
+        <w:rPr>
+          <w:rFonts w:eastAsia="David" w:cs="David"/>
+          <w:i w:val="false"/>
+          <w:iCs w:val="false"/>
+          <w:sz w:val="24"/>
+          <w:szCs w:val="24"/>
+          <w:rtl w:val="true"/>
+        </w:rPr>
+        <w:t xml:space="preserve">, </w:t>
+      </w:r>
+      <w:r>
+        <w:rPr>
+          <w:rFonts w:ascii="David" w:hAnsi="David" w:eastAsia="David"/>
+          <w:i w:val="false"/>
+          <w:i w:val="false"/>
+          <w:iCs w:val="false"/>
+          <w:sz w:val="24"/>
+          <w:sz w:val="24"/>
+          <w:szCs w:val="24"/>
+          <w:rtl w:val="true"/>
+        </w:rPr>
+        <w:t xml:space="preserve">מתוך </w:t>
       </w:r>
       <w:r>
         <w:rPr>
@@ -36048,7 +36433,7 @@
           <w:szCs w:val="24"/>
           <w:rtl w:val="true"/>
         </w:rPr>
-        <w:t xml:space="preserve">', </w:t>
+        <w:t xml:space="preserve">. </w:t>
       </w:r>
       <w:r>
         <w:rPr>
@@ -36096,7 +36481,7 @@
           <w:szCs w:val="24"/>
           <w:rtl w:val="true"/>
         </w:rPr>
-        <w:t>' (</w:t>
+        <w:t>. (</w:t>
       </w:r>
       <w:r>
         <w:rPr>
@@ -36250,18 +36635,9 @@
           <w:iCs w:val="false"/>
           <w:sz w:val="24"/>
           <w:szCs w:val="24"/>
-        </w:rPr>
-        <w:t xml:space="preserve">. </w:t>
-      </w:r>
-      <w:r>
-        <w:rPr>
-          <w:rFonts w:eastAsia="Times New Roman" w:cs="Times New Roman" w:ascii="Times New Roman" w:hAnsi="Times New Roman"/>
-          <w:i w:val="false"/>
-          <w:iCs w:val="false"/>
-          <w:sz w:val="24"/>
-          <w:szCs w:val="24"/>
-        </w:rPr>
-        <w:t>https://isot.org.il</w:t>
+          <w:rtl w:val="true"/>
+        </w:rPr>
+        <w:t>.</w:t>
       </w:r>
     </w:p>
     <w:p>
@@ -36319,7 +36695,7 @@
           <w:szCs w:val="24"/>
           <w:rtl w:val="true"/>
         </w:rPr>
-        <w:t>' (</w:t>
+        <w:t>. (</w:t>
       </w:r>
       <w:r>
         <w:rPr>
@@ -36475,17 +36851,7 @@
           <w:szCs w:val="24"/>
           <w:rtl w:val="true"/>
         </w:rPr>
-        <w:t xml:space="preserve">. </w:t>
-      </w:r>
-      <w:r>
-        <w:rPr>
-          <w:rFonts w:eastAsia="Times New Roman" w:cs="Times New Roman" w:ascii="Times New Roman" w:hAnsi="Times New Roman"/>
-          <w:i w:val="false"/>
-          <w:iCs w:val="false"/>
-          <w:sz w:val="24"/>
-          <w:szCs w:val="24"/>
-        </w:rPr>
-        <w:t>https://www.jstor.org/stable/23453297</w:t>
+        <w:t>.</w:t>
       </w:r>
     </w:p>
     <w:p>
@@ -36567,7 +36933,7 @@
           <w:szCs w:val="24"/>
           <w:rtl w:val="true"/>
         </w:rPr>
-        <w:t xml:space="preserve">', </w:t>
+        <w:t xml:space="preserve">., </w:t>
       </w:r>
       <w:r>
         <w:rPr>
@@ -36615,7 +36981,7 @@
           <w:szCs w:val="24"/>
           <w:rtl w:val="true"/>
         </w:rPr>
-        <w:t xml:space="preserve">', </w:t>
+        <w:t xml:space="preserve">., </w:t>
       </w:r>
       <w:r>
         <w:rPr>
@@ -36663,7 +37029,7 @@
           <w:szCs w:val="24"/>
           <w:rtl w:val="true"/>
         </w:rPr>
-        <w:t xml:space="preserve">', </w:t>
+        <w:t xml:space="preserve">., </w:t>
       </w:r>
       <w:r>
         <w:rPr>
@@ -36735,7 +37101,7 @@
           <w:szCs w:val="24"/>
           <w:rtl w:val="true"/>
         </w:rPr>
-        <w:t xml:space="preserve">', </w:t>
+        <w:t xml:space="preserve">., </w:t>
       </w:r>
       <w:r>
         <w:rPr>
@@ -36783,7 +37149,7 @@
           <w:szCs w:val="24"/>
           <w:rtl w:val="true"/>
         </w:rPr>
-        <w:t xml:space="preserve">', </w:t>
+        <w:t xml:space="preserve">., </w:t>
       </w:r>
       <w:r>
         <w:rPr>
@@ -36831,7 +37197,7 @@
           <w:szCs w:val="24"/>
           <w:rtl w:val="true"/>
         </w:rPr>
-        <w:t>' (</w:t>
+        <w:t>. (</w:t>
       </w:r>
       <w:r>
         <w:rPr>
@@ -37009,18 +37375,9 @@
           <w:iCs w:val="false"/>
           <w:sz w:val="24"/>
           <w:szCs w:val="24"/>
-        </w:rPr>
-        <w:t xml:space="preserve">. </w:t>
-      </w:r>
-      <w:r>
-        <w:rPr>
-          <w:rFonts w:eastAsia="Times New Roman" w:cs="Times New Roman" w:ascii="Times New Roman" w:hAnsi="Times New Roman"/>
-          <w:i w:val="false"/>
-          <w:iCs w:val="false"/>
-          <w:sz w:val="24"/>
-          <w:szCs w:val="24"/>
-        </w:rPr>
-        <w:t>https://isot.org.il</w:t>
+          <w:rtl w:val="true"/>
+        </w:rPr>
+        <w:t>.</w:t>
       </w:r>
     </w:p>
     <w:p>
@@ -37078,6 +37435,54 @@
           <w:szCs w:val="24"/>
           <w:rtl w:val="true"/>
         </w:rPr>
+        <w:t xml:space="preserve">., </w:t>
+      </w:r>
+      <w:r>
+        <w:rPr>
+          <w:rFonts w:ascii="David" w:hAnsi="David" w:eastAsia="David"/>
+          <w:i w:val="false"/>
+          <w:i w:val="false"/>
+          <w:iCs w:val="false"/>
+          <w:sz w:val="24"/>
+          <w:sz w:val="24"/>
+          <w:szCs w:val="24"/>
+          <w:rtl w:val="true"/>
+        </w:rPr>
+        <w:t>חן</w:t>
+      </w:r>
+      <w:r>
+        <w:rPr>
+          <w:rFonts w:eastAsia="David" w:cs="David"/>
+          <w:i w:val="false"/>
+          <w:iCs w:val="false"/>
+          <w:sz w:val="24"/>
+          <w:szCs w:val="24"/>
+          <w:rtl w:val="true"/>
+        </w:rPr>
+        <w:t>-</w:t>
+      </w:r>
+      <w:r>
+        <w:rPr>
+          <w:rFonts w:ascii="David" w:hAnsi="David" w:eastAsia="David"/>
+          <w:i w:val="false"/>
+          <w:i w:val="false"/>
+          <w:iCs w:val="false"/>
+          <w:sz w:val="24"/>
+          <w:sz w:val="24"/>
+          <w:szCs w:val="24"/>
+          <w:rtl w:val="true"/>
+        </w:rPr>
+        <w:t>מרקוביץ</w:t>
+      </w:r>
+      <w:r>
+        <w:rPr>
+          <w:rFonts w:eastAsia="David" w:cs="David"/>
+          <w:i w:val="false"/>
+          <w:iCs w:val="false"/>
+          <w:sz w:val="24"/>
+          <w:szCs w:val="24"/>
+          <w:rtl w:val="true"/>
+        </w:rPr>
         <w:t xml:space="preserve">', </w:t>
       </w:r>
       <w:r>
@@ -37091,7 +37496,7 @@
           <w:szCs w:val="24"/>
           <w:rtl w:val="true"/>
         </w:rPr>
-        <w:t>חן</w:t>
+        <w:t>ג</w:t>
       </w:r>
       <w:r>
         <w:rPr>
@@ -37102,6 +37507,30 @@
           <w:szCs w:val="24"/>
           <w:rtl w:val="true"/>
         </w:rPr>
+        <w:t xml:space="preserve">., </w:t>
+      </w:r>
+      <w:r>
+        <w:rPr>
+          <w:rFonts w:ascii="David" w:hAnsi="David" w:eastAsia="David"/>
+          <w:i w:val="false"/>
+          <w:i w:val="false"/>
+          <w:iCs w:val="false"/>
+          <w:sz w:val="24"/>
+          <w:sz w:val="24"/>
+          <w:szCs w:val="24"/>
+          <w:rtl w:val="true"/>
+        </w:rPr>
+        <w:t>רון</w:t>
+      </w:r>
+      <w:r>
+        <w:rPr>
+          <w:rFonts w:eastAsia="David" w:cs="David"/>
+          <w:i w:val="false"/>
+          <w:iCs w:val="false"/>
+          <w:sz w:val="24"/>
+          <w:szCs w:val="24"/>
+          <w:rtl w:val="true"/>
+        </w:rPr>
         <w:t>-</w:t>
       </w:r>
       <w:r>
@@ -37115,7 +37544,7 @@
           <w:szCs w:val="24"/>
           <w:rtl w:val="true"/>
         </w:rPr>
-        <w:t>מרקוביץ</w:t>
+        <w:t>בצל</w:t>
       </w:r>
       <w:r>
         <w:rPr>
@@ -37126,7 +37555,7 @@
           <w:szCs w:val="24"/>
           <w:rtl w:val="true"/>
         </w:rPr>
-        <w:t xml:space="preserve">', </w:t>
+        <w:t xml:space="preserve">, </w:t>
       </w:r>
       <w:r>
         <w:rPr>
@@ -37139,7 +37568,7 @@
           <w:szCs w:val="24"/>
           <w:rtl w:val="true"/>
         </w:rPr>
-        <w:t>ג</w:t>
+        <w:t>ב</w:t>
       </w:r>
       <w:r>
         <w:rPr>
@@ -37150,7 +37579,7 @@
           <w:szCs w:val="24"/>
           <w:rtl w:val="true"/>
         </w:rPr>
-        <w:t xml:space="preserve">', </w:t>
+        <w:t xml:space="preserve">., </w:t>
       </w:r>
       <w:r>
         <w:rPr>
@@ -37163,7 +37592,7 @@
           <w:szCs w:val="24"/>
           <w:rtl w:val="true"/>
         </w:rPr>
-        <w:t>רון</w:t>
+        <w:t>מושיוב</w:t>
       </w:r>
       <w:r>
         <w:rPr>
@@ -37174,6 +37603,102 @@
           <w:szCs w:val="24"/>
           <w:rtl w:val="true"/>
         </w:rPr>
+        <w:t xml:space="preserve">, </w:t>
+      </w:r>
+      <w:r>
+        <w:rPr>
+          <w:rFonts w:ascii="David" w:hAnsi="David" w:eastAsia="David"/>
+          <w:i w:val="false"/>
+          <w:i w:val="false"/>
+          <w:iCs w:val="false"/>
+          <w:sz w:val="24"/>
+          <w:sz w:val="24"/>
+          <w:szCs w:val="24"/>
+          <w:rtl w:val="true"/>
+        </w:rPr>
+        <w:t>ח</w:t>
+      </w:r>
+      <w:r>
+        <w:rPr>
+          <w:rFonts w:eastAsia="David" w:cs="David"/>
+          <w:i w:val="false"/>
+          <w:iCs w:val="false"/>
+          <w:sz w:val="24"/>
+          <w:szCs w:val="24"/>
+          <w:rtl w:val="true"/>
+        </w:rPr>
+        <w:t xml:space="preserve">., </w:t>
+      </w:r>
+      <w:r>
+        <w:rPr>
+          <w:rFonts w:ascii="David" w:hAnsi="David" w:eastAsia="David"/>
+          <w:i w:val="false"/>
+          <w:i w:val="false"/>
+          <w:iCs w:val="false"/>
+          <w:sz w:val="24"/>
+          <w:sz w:val="24"/>
+          <w:szCs w:val="24"/>
+          <w:rtl w:val="true"/>
+        </w:rPr>
+        <w:t>דרורי</w:t>
+      </w:r>
+      <w:r>
+        <w:rPr>
+          <w:rFonts w:eastAsia="David" w:cs="David"/>
+          <w:i w:val="false"/>
+          <w:iCs w:val="false"/>
+          <w:sz w:val="24"/>
+          <w:szCs w:val="24"/>
+          <w:rtl w:val="true"/>
+        </w:rPr>
+        <w:t xml:space="preserve">, </w:t>
+      </w:r>
+      <w:r>
+        <w:rPr>
+          <w:rFonts w:ascii="David" w:hAnsi="David" w:eastAsia="David"/>
+          <w:i w:val="false"/>
+          <w:i w:val="false"/>
+          <w:iCs w:val="false"/>
+          <w:sz w:val="24"/>
+          <w:sz w:val="24"/>
+          <w:szCs w:val="24"/>
+          <w:rtl w:val="true"/>
+        </w:rPr>
+        <w:t>י</w:t>
+      </w:r>
+      <w:r>
+        <w:rPr>
+          <w:rFonts w:eastAsia="David" w:cs="David"/>
+          <w:i w:val="false"/>
+          <w:iCs w:val="false"/>
+          <w:sz w:val="24"/>
+          <w:szCs w:val="24"/>
+          <w:rtl w:val="true"/>
+        </w:rPr>
+        <w:t xml:space="preserve">., </w:t>
+      </w:r>
+      <w:r>
+        <w:rPr>
+          <w:rFonts w:ascii="David" w:hAnsi="David" w:eastAsia="David"/>
+          <w:i w:val="false"/>
+          <w:i w:val="false"/>
+          <w:iCs w:val="false"/>
+          <w:sz w:val="24"/>
+          <w:sz w:val="24"/>
+          <w:szCs w:val="24"/>
+          <w:rtl w:val="true"/>
+        </w:rPr>
+        <w:t>שנרך</w:t>
+      </w:r>
+      <w:r>
+        <w:rPr>
+          <w:rFonts w:eastAsia="David" w:cs="David"/>
+          <w:i w:val="false"/>
+          <w:iCs w:val="false"/>
+          <w:sz w:val="24"/>
+          <w:szCs w:val="24"/>
+          <w:rtl w:val="true"/>
+        </w:rPr>
         <w:t>-</w:t>
       </w:r>
       <w:r>
@@ -37187,7 +37712,7 @@
           <w:szCs w:val="24"/>
           <w:rtl w:val="true"/>
         </w:rPr>
-        <w:t>בצל</w:t>
+        <w:t>וודה</w:t>
       </w:r>
       <w:r>
         <w:rPr>
@@ -37211,7 +37736,7 @@
           <w:szCs w:val="24"/>
           <w:rtl w:val="true"/>
         </w:rPr>
-        <w:t>ב</w:t>
+        <w:t>מ</w:t>
       </w:r>
       <w:r>
         <w:rPr>
@@ -37222,175 +37747,7 @@
           <w:szCs w:val="24"/>
           <w:rtl w:val="true"/>
         </w:rPr>
-        <w:t xml:space="preserve">', </w:t>
-      </w:r>
-      <w:r>
-        <w:rPr>
-          <w:rFonts w:ascii="David" w:hAnsi="David" w:eastAsia="David"/>
-          <w:i w:val="false"/>
-          <w:i w:val="false"/>
-          <w:iCs w:val="false"/>
-          <w:sz w:val="24"/>
-          <w:sz w:val="24"/>
-          <w:szCs w:val="24"/>
-          <w:rtl w:val="true"/>
-        </w:rPr>
-        <w:t>מושיוב</w:t>
-      </w:r>
-      <w:r>
-        <w:rPr>
-          <w:rFonts w:eastAsia="David" w:cs="David"/>
-          <w:i w:val="false"/>
-          <w:iCs w:val="false"/>
-          <w:sz w:val="24"/>
-          <w:szCs w:val="24"/>
-          <w:rtl w:val="true"/>
-        </w:rPr>
-        <w:t xml:space="preserve">, </w:t>
-      </w:r>
-      <w:r>
-        <w:rPr>
-          <w:rFonts w:ascii="David" w:hAnsi="David" w:eastAsia="David"/>
-          <w:i w:val="false"/>
-          <w:i w:val="false"/>
-          <w:iCs w:val="false"/>
-          <w:sz w:val="24"/>
-          <w:sz w:val="24"/>
-          <w:szCs w:val="24"/>
-          <w:rtl w:val="true"/>
-        </w:rPr>
-        <w:t>ח</w:t>
-      </w:r>
-      <w:r>
-        <w:rPr>
-          <w:rFonts w:eastAsia="David" w:cs="David"/>
-          <w:i w:val="false"/>
-          <w:iCs w:val="false"/>
-          <w:sz w:val="24"/>
-          <w:szCs w:val="24"/>
-          <w:rtl w:val="true"/>
-        </w:rPr>
-        <w:t xml:space="preserve">', </w:t>
-      </w:r>
-      <w:r>
-        <w:rPr>
-          <w:rFonts w:ascii="David" w:hAnsi="David" w:eastAsia="David"/>
-          <w:i w:val="false"/>
-          <w:i w:val="false"/>
-          <w:iCs w:val="false"/>
-          <w:sz w:val="24"/>
-          <w:sz w:val="24"/>
-          <w:szCs w:val="24"/>
-          <w:rtl w:val="true"/>
-        </w:rPr>
-        <w:t>דרורי</w:t>
-      </w:r>
-      <w:r>
-        <w:rPr>
-          <w:rFonts w:eastAsia="David" w:cs="David"/>
-          <w:i w:val="false"/>
-          <w:iCs w:val="false"/>
-          <w:sz w:val="24"/>
-          <w:szCs w:val="24"/>
-          <w:rtl w:val="true"/>
-        </w:rPr>
-        <w:t xml:space="preserve">, </w:t>
-      </w:r>
-      <w:r>
-        <w:rPr>
-          <w:rFonts w:ascii="David" w:hAnsi="David" w:eastAsia="David"/>
-          <w:i w:val="false"/>
-          <w:i w:val="false"/>
-          <w:iCs w:val="false"/>
-          <w:sz w:val="24"/>
-          <w:sz w:val="24"/>
-          <w:szCs w:val="24"/>
-          <w:rtl w:val="true"/>
-        </w:rPr>
-        <w:t>י</w:t>
-      </w:r>
-      <w:r>
-        <w:rPr>
-          <w:rFonts w:eastAsia="David" w:cs="David"/>
-          <w:i w:val="false"/>
-          <w:iCs w:val="false"/>
-          <w:sz w:val="24"/>
-          <w:szCs w:val="24"/>
-          <w:rtl w:val="true"/>
-        </w:rPr>
-        <w:t xml:space="preserve">', </w:t>
-      </w:r>
-      <w:r>
-        <w:rPr>
-          <w:rFonts w:ascii="David" w:hAnsi="David" w:eastAsia="David"/>
-          <w:i w:val="false"/>
-          <w:i w:val="false"/>
-          <w:iCs w:val="false"/>
-          <w:sz w:val="24"/>
-          <w:sz w:val="24"/>
-          <w:szCs w:val="24"/>
-          <w:rtl w:val="true"/>
-        </w:rPr>
-        <w:t>שנרך</w:t>
-      </w:r>
-      <w:r>
-        <w:rPr>
-          <w:rFonts w:eastAsia="David" w:cs="David"/>
-          <w:i w:val="false"/>
-          <w:iCs w:val="false"/>
-          <w:sz w:val="24"/>
-          <w:szCs w:val="24"/>
-          <w:rtl w:val="true"/>
-        </w:rPr>
-        <w:t>-</w:t>
-      </w:r>
-      <w:r>
-        <w:rPr>
-          <w:rFonts w:ascii="David" w:hAnsi="David" w:eastAsia="David"/>
-          <w:i w:val="false"/>
-          <w:i w:val="false"/>
-          <w:iCs w:val="false"/>
-          <w:sz w:val="24"/>
-          <w:sz w:val="24"/>
-          <w:szCs w:val="24"/>
-          <w:rtl w:val="true"/>
-        </w:rPr>
-        <w:t>וודה</w:t>
-      </w:r>
-      <w:r>
-        <w:rPr>
-          <w:rFonts w:eastAsia="David" w:cs="David"/>
-          <w:i w:val="false"/>
-          <w:iCs w:val="false"/>
-          <w:sz w:val="24"/>
-          <w:szCs w:val="24"/>
-          <w:rtl w:val="true"/>
-        </w:rPr>
-        <w:t xml:space="preserve">, </w:t>
-      </w:r>
-      <w:r>
-        <w:rPr>
-          <w:rFonts w:ascii="David" w:hAnsi="David" w:eastAsia="David"/>
-          <w:i w:val="false"/>
-          <w:i w:val="false"/>
-          <w:iCs w:val="false"/>
-          <w:sz w:val="24"/>
-          <w:sz w:val="24"/>
-          <w:szCs w:val="24"/>
-          <w:rtl w:val="true"/>
-        </w:rPr>
-        <w:t>מ</w:t>
-      </w:r>
-      <w:r>
-        <w:rPr>
-          <w:rFonts w:eastAsia="David" w:cs="David"/>
-          <w:i w:val="false"/>
-          <w:iCs w:val="false"/>
-          <w:sz w:val="24"/>
-          <w:szCs w:val="24"/>
-          <w:rtl w:val="true"/>
-        </w:rPr>
-        <w:t xml:space="preserve">', </w:t>
+        <w:t xml:space="preserve">., </w:t>
       </w:r>
       <w:r>
         <w:rPr>
@@ -37603,18 +37960,9 @@
           <w:iCs w:val="false"/>
           <w:sz w:val="24"/>
           <w:szCs w:val="24"/>
-        </w:rPr>
-        <w:t xml:space="preserve">. </w:t>
-      </w:r>
-      <w:r>
-        <w:rPr>
-          <w:rFonts w:eastAsia="Times New Roman" w:cs="Times New Roman" w:ascii="Times New Roman" w:hAnsi="Times New Roman"/>
-          <w:i w:val="false"/>
-          <w:iCs w:val="false"/>
-          <w:sz w:val="24"/>
-          <w:szCs w:val="24"/>
-        </w:rPr>
-        <w:t>https://isot.org.il</w:t>
+          <w:rtl w:val="true"/>
+        </w:rPr>
+        <w:t>.</w:t>
       </w:r>
     </w:p>
     <w:p>
@@ -37672,7 +38020,7 @@
           <w:szCs w:val="24"/>
           <w:rtl w:val="true"/>
         </w:rPr>
-        <w:t xml:space="preserve">', </w:t>
+        <w:t xml:space="preserve">. </w:t>
       </w:r>
       <w:r>
         <w:rPr>
@@ -37720,7 +38068,7 @@
           <w:szCs w:val="24"/>
           <w:rtl w:val="true"/>
         </w:rPr>
-        <w:t>' (</w:t>
+        <w:t>. (</w:t>
       </w:r>
       <w:r>
         <w:rPr>
@@ -37879,17 +38227,7 @@
           <w:szCs w:val="24"/>
           <w:rtl w:val="true"/>
         </w:rPr>
-        <w:t xml:space="preserve">. </w:t>
-      </w:r>
-      <w:r>
-        <w:rPr>
-          <w:rFonts w:eastAsia="Times New Roman" w:cs="Times New Roman" w:ascii="Times New Roman" w:hAnsi="Times New Roman"/>
-          <w:i w:val="false"/>
-          <w:iCs w:val="false"/>
-          <w:sz w:val="24"/>
-          <w:szCs w:val="24"/>
-        </w:rPr>
-        <w:t>https://www.efshar.org.il</w:t>
+        <w:t>.</w:t>
       </w:r>
     </w:p>
     <w:p>
@@ -37947,7 +38285,7 @@
           <w:szCs w:val="24"/>
           <w:rtl w:val="true"/>
         </w:rPr>
-        <w:t xml:space="preserve">', </w:t>
+        <w:t xml:space="preserve">. </w:t>
       </w:r>
       <w:r>
         <w:rPr>
@@ -37995,7 +38333,7 @@
           <w:szCs w:val="24"/>
           <w:rtl w:val="true"/>
         </w:rPr>
-        <w:t>' (</w:t>
+        <w:t>. (</w:t>
       </w:r>
       <w:r>
         <w:rPr>
@@ -38125,18 +38463,9 @@
           <w:iCs w:val="false"/>
           <w:sz w:val="24"/>
           <w:szCs w:val="24"/>
-        </w:rPr>
-        <w:t xml:space="preserve">. </w:t>
-      </w:r>
-      <w:r>
-        <w:rPr>
-          <w:rFonts w:eastAsia="Times New Roman" w:cs="Times New Roman" w:ascii="Times New Roman" w:hAnsi="Times New Roman"/>
-          <w:i w:val="false"/>
-          <w:iCs w:val="false"/>
-          <w:sz w:val="24"/>
-          <w:szCs w:val="24"/>
-        </w:rPr>
-        <w:t>https://isot.org.il</w:t>
+          <w:rtl w:val="true"/>
+        </w:rPr>
+        <w:t>.</w:t>
       </w:r>
     </w:p>
     <w:p>
@@ -38194,7 +38523,7 @@
           <w:szCs w:val="24"/>
           <w:rtl w:val="true"/>
         </w:rPr>
-        <w:t>' (</w:t>
+        <w:t>. (</w:t>
       </w:r>
       <w:r>
         <w:rPr>
@@ -38354,6 +38683,109 @@
           <w:rtl w:val="true"/>
         </w:rPr>
         <w:t xml:space="preserve">. </w:t>
+      </w:r>
+      <w:r>
+        <w:rPr>
+          <w:rFonts w:ascii="David" w:hAnsi="David" w:eastAsia="David"/>
+          <w:i w:val="false"/>
+          <w:i w:val="false"/>
+          <w:iCs w:val="false"/>
+          <w:sz w:val="24"/>
+          <w:sz w:val="24"/>
+          <w:szCs w:val="24"/>
+          <w:rtl w:val="true"/>
+        </w:rPr>
+        <w:t>אוחזר ב</w:t>
+      </w:r>
+      <w:r>
+        <w:rPr>
+          <w:rFonts w:eastAsia="David" w:cs="David"/>
+          <w:i w:val="false"/>
+          <w:iCs w:val="false"/>
+          <w:sz w:val="24"/>
+          <w:szCs w:val="24"/>
+          <w:rtl w:val="true"/>
+        </w:rPr>
+        <w:t>-</w:t>
+      </w:r>
+      <w:r>
+        <w:rPr>
+          <w:rFonts w:eastAsia="David" w:cs="David"/>
+          <w:i w:val="false"/>
+          <w:iCs w:val="false"/>
+          <w:sz w:val="24"/>
+          <w:szCs w:val="24"/>
+        </w:rPr>
+        <w:t>16</w:t>
+      </w:r>
+      <w:r>
+        <w:rPr>
+          <w:rFonts w:eastAsia="David" w:cs="David"/>
+          <w:i w:val="false"/>
+          <w:iCs w:val="false"/>
+          <w:sz w:val="24"/>
+          <w:szCs w:val="24"/>
+          <w:rtl w:val="true"/>
+        </w:rPr>
+        <w:t xml:space="preserve"> </w:t>
+      </w:r>
+      <w:r>
+        <w:rPr>
+          <w:rFonts w:ascii="David" w:hAnsi="David" w:eastAsia="David"/>
+          <w:i w:val="false"/>
+          <w:i w:val="false"/>
+          <w:iCs w:val="false"/>
+          <w:sz w:val="24"/>
+          <w:sz w:val="24"/>
+          <w:szCs w:val="24"/>
+          <w:rtl w:val="true"/>
+        </w:rPr>
+        <w:t>בספטמבר</w:t>
+      </w:r>
+      <w:r>
+        <w:rPr>
+          <w:rFonts w:eastAsia="David" w:cs="David"/>
+          <w:i w:val="false"/>
+          <w:iCs w:val="false"/>
+          <w:sz w:val="24"/>
+          <w:szCs w:val="24"/>
+          <w:rtl w:val="true"/>
+        </w:rPr>
+        <w:t xml:space="preserve">, </w:t>
+      </w:r>
+      <w:r>
+        <w:rPr>
+          <w:rFonts w:eastAsia="David" w:cs="David"/>
+          <w:i w:val="false"/>
+          <w:iCs w:val="false"/>
+          <w:sz w:val="24"/>
+          <w:szCs w:val="24"/>
+        </w:rPr>
+        <w:t>2026</w:t>
+      </w:r>
+      <w:r>
+        <w:rPr>
+          <w:rFonts w:eastAsia="David" w:cs="David"/>
+          <w:i w:val="false"/>
+          <w:iCs w:val="false"/>
+          <w:sz w:val="24"/>
+          <w:szCs w:val="24"/>
+          <w:rtl w:val="true"/>
+        </w:rPr>
+        <w:t xml:space="preserve">, </w:t>
+      </w:r>
+      <w:r>
+        <w:rPr>
+          <w:rFonts w:ascii="David" w:hAnsi="David" w:eastAsia="David"/>
+          <w:i w:val="false"/>
+          <w:i w:val="false"/>
+          <w:iCs w:val="false"/>
+          <w:sz w:val="24"/>
+          <w:sz w:val="24"/>
+          <w:szCs w:val="24"/>
+          <w:rtl w:val="true"/>
+        </w:rPr>
+        <w:t xml:space="preserve">מתוך </w:t>
       </w:r>
       <w:r>
         <w:rPr>

</xml_diff>

<commit_message>
Restore justified alignment for body text
Co-Authored-By: Claude Fable 5.1 <noreply@anthropic.com>
Claude-Session: https://claude.ai/code/session_01AGMAnS6o1o3m246uMW2ium
</commit_message>
<xml_diff>
--- a/seminar/סמינריון - תפקודים ניהוליים - הייכל מרווה.docx
+++ b/seminar/סמינריון - תפקודים ניהוליים - הייכל מרווה.docx
@@ -522,7 +522,7 @@
             </w:rPr>
             <w:fldChar w:fldCharType="separate"/>
           </w:r>
-          <w:hyperlink w:anchor="__RefHeading___Toc409_1283528634">
+          <w:hyperlink w:anchor="__RefHeading___Toc409_1970309342">
             <w:r>
               <w:rPr>
                 <w:rStyle w:val="IndexLink"/>
@@ -559,7 +559,7 @@
             </w:tabs>
             <w:rPr/>
           </w:pPr>
-          <w:hyperlink w:anchor="__RefHeading___Toc411_1283528634">
+          <w:hyperlink w:anchor="__RefHeading___Toc411_1970309342">
             <w:r>
               <w:rPr>
                 <w:rStyle w:val="IndexLink"/>
@@ -596,7 +596,7 @@
             </w:tabs>
             <w:rPr/>
           </w:pPr>
-          <w:hyperlink w:anchor="__RefHeading___Toc413_1283528634">
+          <w:hyperlink w:anchor="__RefHeading___Toc413_1970309342">
             <w:r>
               <w:rPr>
                 <w:rStyle w:val="IndexLink"/>
@@ -633,7 +633,7 @@
             </w:tabs>
             <w:rPr/>
           </w:pPr>
-          <w:hyperlink w:anchor="__RefHeading___Toc415_1283528634">
+          <w:hyperlink w:anchor="__RefHeading___Toc415_1970309342">
             <w:r>
               <w:rPr>
                 <w:rStyle w:val="IndexLink"/>
@@ -670,7 +670,7 @@
             </w:tabs>
             <w:rPr/>
           </w:pPr>
-          <w:hyperlink w:anchor="__RefHeading___Toc417_1283528634">
+          <w:hyperlink w:anchor="__RefHeading___Toc417_1970309342">
             <w:r>
               <w:rPr>
                 <w:rStyle w:val="IndexLink"/>
@@ -721,7 +721,7 @@
             </w:tabs>
             <w:rPr/>
           </w:pPr>
-          <w:hyperlink w:anchor="__RefHeading___Toc419_1283528634">
+          <w:hyperlink w:anchor="__RefHeading___Toc419_1970309342">
             <w:r>
               <w:rPr>
                 <w:rStyle w:val="IndexLink"/>
@@ -758,7 +758,7 @@
             </w:tabs>
             <w:rPr/>
           </w:pPr>
-          <w:hyperlink w:anchor="__RefHeading___Toc421_1283528634">
+          <w:hyperlink w:anchor="__RefHeading___Toc421_1970309342">
             <w:r>
               <w:rPr>
                 <w:rStyle w:val="IndexLink"/>
@@ -795,7 +795,7 @@
             </w:tabs>
             <w:rPr/>
           </w:pPr>
-          <w:hyperlink w:anchor="__RefHeading___Toc423_1283528634">
+          <w:hyperlink w:anchor="__RefHeading___Toc423_1970309342">
             <w:r>
               <w:rPr>
                 <w:rStyle w:val="IndexLink"/>
@@ -832,7 +832,7 @@
             </w:tabs>
             <w:rPr/>
           </w:pPr>
-          <w:hyperlink w:anchor="__RefHeading___Toc425_1283528634">
+          <w:hyperlink w:anchor="__RefHeading___Toc425_1970309342">
             <w:r>
               <w:rPr>
                 <w:rStyle w:val="IndexLink"/>
@@ -869,7 +869,7 @@
             </w:tabs>
             <w:rPr/>
           </w:pPr>
-          <w:hyperlink w:anchor="__RefHeading___Toc427_1283528634">
+          <w:hyperlink w:anchor="__RefHeading___Toc427_1970309342">
             <w:r>
               <w:rPr>
                 <w:rStyle w:val="IndexLink"/>
@@ -906,7 +906,7 @@
             </w:tabs>
             <w:rPr/>
           </w:pPr>
-          <w:hyperlink w:anchor="__RefHeading___Toc429_1283528634">
+          <w:hyperlink w:anchor="__RefHeading___Toc429_1970309342">
             <w:r>
               <w:rPr>
                 <w:rStyle w:val="IndexLink"/>
@@ -943,7 +943,7 @@
             </w:tabs>
             <w:rPr/>
           </w:pPr>
-          <w:hyperlink w:anchor="__RefHeading___Toc431_1283528634">
+          <w:hyperlink w:anchor="__RefHeading___Toc431_1970309342">
             <w:r>
               <w:rPr>
                 <w:rStyle w:val="IndexLink"/>
@@ -980,7 +980,7 @@
             </w:tabs>
             <w:rPr/>
           </w:pPr>
-          <w:hyperlink w:anchor="__RefHeading___Toc433_1283528634">
+          <w:hyperlink w:anchor="__RefHeading___Toc433_1970309342">
             <w:r>
               <w:rPr>
                 <w:rStyle w:val="IndexLink"/>
@@ -1045,7 +1045,7 @@
             </w:tabs>
             <w:rPr/>
           </w:pPr>
-          <w:hyperlink w:anchor="__RefHeading___Toc435_1283528634">
+          <w:hyperlink w:anchor="__RefHeading___Toc435_1970309342">
             <w:r>
               <w:rPr>
                 <w:rStyle w:val="IndexLink"/>
@@ -1082,7 +1082,7 @@
             </w:tabs>
             <w:rPr/>
           </w:pPr>
-          <w:hyperlink w:anchor="__RefHeading___Toc437_1283528634">
+          <w:hyperlink w:anchor="__RefHeading___Toc437_1970309342">
             <w:r>
               <w:rPr>
                 <w:rStyle w:val="IndexLink"/>
@@ -1119,7 +1119,7 @@
             </w:tabs>
             <w:rPr/>
           </w:pPr>
-          <w:hyperlink w:anchor="__RefHeading___Toc439_1283528634">
+          <w:hyperlink w:anchor="__RefHeading___Toc439_1970309342">
             <w:r>
               <w:rPr>
                 <w:rStyle w:val="IndexLink"/>
@@ -1170,7 +1170,7 @@
             </w:tabs>
             <w:rPr/>
           </w:pPr>
-          <w:hyperlink w:anchor="__RefHeading___Toc441_1283528634">
+          <w:hyperlink w:anchor="__RefHeading___Toc441_1970309342">
             <w:r>
               <w:rPr>
                 <w:rStyle w:val="IndexLink"/>
@@ -1236,7 +1236,7 @@
               <w:rPr>
                 <w:rStyle w:val="IndexLink"/>
               </w:rPr>
-              <w:t>10</w:t>
+              <w:t>9</w:t>
             </w:r>
           </w:hyperlink>
         </w:p>
@@ -1249,7 +1249,7 @@
             </w:tabs>
             <w:rPr/>
           </w:pPr>
-          <w:hyperlink w:anchor="__RefHeading___Toc443_1283528634">
+          <w:hyperlink w:anchor="__RefHeading___Toc443_1970309342">
             <w:r>
               <w:rPr>
                 <w:rStyle w:val="IndexLink"/>
@@ -1301,7 +1301,7 @@
               <w:rPr>
                 <w:rStyle w:val="IndexLink"/>
               </w:rPr>
-              <w:t>10</w:t>
+              <w:t>9</w:t>
             </w:r>
           </w:hyperlink>
         </w:p>
@@ -1314,7 +1314,7 @@
             </w:tabs>
             <w:rPr/>
           </w:pPr>
-          <w:hyperlink w:anchor="__RefHeading___Toc445_1283528634">
+          <w:hyperlink w:anchor="__RefHeading___Toc445_1970309342">
             <w:r>
               <w:rPr>
                 <w:rStyle w:val="IndexLink"/>
@@ -1352,7 +1352,7 @@
               <w:rPr>
                 <w:rStyle w:val="IndexLink"/>
               </w:rPr>
-              <w:t>11</w:t>
+              <w:t>10</w:t>
             </w:r>
           </w:hyperlink>
         </w:p>
@@ -1365,7 +1365,7 @@
             </w:tabs>
             <w:rPr/>
           </w:pPr>
-          <w:hyperlink w:anchor="__RefHeading___Toc447_1283528634">
+          <w:hyperlink w:anchor="__RefHeading___Toc447_1970309342">
             <w:r>
               <w:rPr>
                 <w:rStyle w:val="IndexLink"/>
@@ -1412,7 +1412,7 @@
             </w:tabs>
             <w:rPr/>
           </w:pPr>
-          <w:hyperlink w:anchor="__RefHeading___Toc449_1283528634">
+          <w:hyperlink w:anchor="__RefHeading___Toc449_1970309342">
             <w:r>
               <w:rPr>
                 <w:rStyle w:val="IndexLink"/>
@@ -1463,7 +1463,7 @@
             </w:tabs>
             <w:rPr/>
           </w:pPr>
-          <w:hyperlink w:anchor="__RefHeading___Toc451_1283528634">
+          <w:hyperlink w:anchor="__RefHeading___Toc451_1970309342">
             <w:r>
               <w:rPr>
                 <w:rStyle w:val="IndexLink"/>
@@ -1528,7 +1528,7 @@
             </w:tabs>
             <w:rPr/>
           </w:pPr>
-          <w:hyperlink w:anchor="__RefHeading___Toc453_1283528634">
+          <w:hyperlink w:anchor="__RefHeading___Toc453_1970309342">
             <w:r>
               <w:rPr>
                 <w:rStyle w:val="IndexLink"/>
@@ -1593,7 +1593,7 @@
             </w:tabs>
             <w:rPr/>
           </w:pPr>
-          <w:hyperlink w:anchor="__RefHeading___Toc455_1283528634">
+          <w:hyperlink w:anchor="__RefHeading___Toc455_1970309342">
             <w:r>
               <w:rPr>
                 <w:rStyle w:val="IndexLink"/>
@@ -1630,7 +1630,7 @@
             </w:tabs>
             <w:rPr/>
           </w:pPr>
-          <w:hyperlink w:anchor="__RefHeading___Toc457_1283528634">
+          <w:hyperlink w:anchor="__RefHeading___Toc457_1970309342">
             <w:r>
               <w:rPr>
                 <w:rStyle w:val="IndexLink"/>
@@ -1668,7 +1668,7 @@
               <w:rPr>
                 <w:rStyle w:val="IndexLink"/>
               </w:rPr>
-              <w:t>15</w:t>
+              <w:t>14</w:t>
             </w:r>
           </w:hyperlink>
         </w:p>
@@ -1681,7 +1681,7 @@
             </w:tabs>
             <w:rPr/>
           </w:pPr>
-          <w:hyperlink w:anchor="__RefHeading___Toc459_1283528634">
+          <w:hyperlink w:anchor="__RefHeading___Toc459_1970309342">
             <w:r>
               <w:rPr>
                 <w:rStyle w:val="IndexLink"/>
@@ -1746,7 +1746,7 @@
             </w:tabs>
             <w:rPr/>
           </w:pPr>
-          <w:hyperlink w:anchor="__RefHeading___Toc461_1283528634">
+          <w:hyperlink w:anchor="__RefHeading___Toc461_1970309342">
             <w:r>
               <w:rPr>
                 <w:rStyle w:val="IndexLink"/>
@@ -1811,7 +1811,7 @@
             </w:tabs>
             <w:rPr/>
           </w:pPr>
-          <w:hyperlink w:anchor="__RefHeading___Toc463_1283528634">
+          <w:hyperlink w:anchor="__RefHeading___Toc463_1970309342">
             <w:r>
               <w:rPr>
                 <w:rStyle w:val="IndexLink"/>
@@ -1849,7 +1849,7 @@
               <w:rPr>
                 <w:rStyle w:val="IndexLink"/>
               </w:rPr>
-              <w:t>17</w:t>
+              <w:t>16</w:t>
             </w:r>
           </w:hyperlink>
         </w:p>
@@ -1862,7 +1862,7 @@
             </w:tabs>
             <w:rPr/>
           </w:pPr>
-          <w:hyperlink w:anchor="__RefHeading___Toc465_1283528634">
+          <w:hyperlink w:anchor="__RefHeading___Toc465_1970309342">
             <w:r>
               <w:rPr>
                 <w:rStyle w:val="IndexLink"/>
@@ -1886,7 +1886,7 @@
               <w:rPr>
                 <w:rStyle w:val="IndexLink"/>
               </w:rPr>
-              <w:t>20</w:t>
+              <w:t>19</w:t>
             </w:r>
           </w:hyperlink>
         </w:p>
@@ -1899,7 +1899,7 @@
             </w:tabs>
             <w:rPr/>
           </w:pPr>
-          <w:hyperlink w:anchor="__RefHeading___Toc467_1283528634">
+          <w:hyperlink w:anchor="__RefHeading___Toc467_1970309342">
             <w:r>
               <w:rPr>
                 <w:rStyle w:val="IndexLink"/>
@@ -1923,7 +1923,7 @@
               <w:rPr>
                 <w:rStyle w:val="IndexLink"/>
               </w:rPr>
-              <w:t>25</w:t>
+              <w:t>24</w:t>
             </w:r>
           </w:hyperlink>
         </w:p>
@@ -1936,7 +1936,7 @@
             </w:tabs>
             <w:rPr/>
           </w:pPr>
-          <w:hyperlink w:anchor="__RefHeading___Toc469_1283528634">
+          <w:hyperlink w:anchor="__RefHeading___Toc469_1970309342">
             <w:r>
               <w:rPr>
                 <w:rStyle w:val="IndexLink"/>
@@ -1954,7 +1954,7 @@
               <w:rPr>
                 <w:rStyle w:val="IndexLink"/>
               </w:rPr>
-              <w:t>27</w:t>
+              <w:t>26</w:t>
             </w:r>
           </w:hyperlink>
           <w:r>
@@ -1996,7 +1996,7 @@
         <w:jc w:val="right"/>
         <w:rPr/>
       </w:pPr>
-      <w:bookmarkStart w:id="0" w:name="__RefHeading___Toc409_1283528634"/>
+      <w:bookmarkStart w:id="0" w:name="__RefHeading___Toc409_1970309342"/>
       <w:bookmarkEnd w:id="0"/>
       <w:r>
         <w:rPr>
@@ -2041,7 +2041,7 @@
         <w:jc w:val="right"/>
         <w:rPr/>
       </w:pPr>
-      <w:bookmarkStart w:id="1" w:name="__RefHeading___Toc411_1283528634"/>
+      <w:bookmarkStart w:id="1" w:name="__RefHeading___Toc411_1970309342"/>
       <w:bookmarkEnd w:id="1"/>
       <w:r>
         <w:rPr>
@@ -2084,7 +2084,7 @@
         <w:bidi w:val="1"/>
         <w:spacing w:lineRule="auto" w:line="360" w:before="0" w:after="120"/>
         <w:ind w:firstLine="567"/>
-        <w:jc w:val="left"/>
+        <w:jc w:val="both"/>
         <w:rPr/>
       </w:pPr>
       <w:r>
@@ -2393,7 +2393,7 @@
         <w:bidi w:val="1"/>
         <w:spacing w:lineRule="auto" w:line="360" w:before="0" w:after="120"/>
         <w:ind w:firstLine="567"/>
-        <w:jc w:val="left"/>
+        <w:jc w:val="both"/>
         <w:rPr/>
       </w:pPr>
       <w:r>
@@ -2709,7 +2709,7 @@
         <w:jc w:val="right"/>
         <w:rPr/>
       </w:pPr>
-      <w:bookmarkStart w:id="2" w:name="__RefHeading___Toc413_1283528634"/>
+      <w:bookmarkStart w:id="2" w:name="__RefHeading___Toc413_1970309342"/>
       <w:bookmarkEnd w:id="2"/>
       <w:r>
         <w:rPr>
@@ -2752,7 +2752,7 @@
         <w:bidi w:val="1"/>
         <w:spacing w:lineRule="auto" w:line="360" w:before="0" w:after="120"/>
         <w:ind w:firstLine="567"/>
-        <w:jc w:val="left"/>
+        <w:jc w:val="both"/>
         <w:rPr/>
       </w:pPr>
       <w:r>
@@ -3110,7 +3110,7 @@
         <w:jc w:val="right"/>
         <w:rPr/>
       </w:pPr>
-      <w:bookmarkStart w:id="3" w:name="__RefHeading___Toc415_1283528634"/>
+      <w:bookmarkStart w:id="3" w:name="__RefHeading___Toc415_1970309342"/>
       <w:bookmarkEnd w:id="3"/>
       <w:r>
         <w:rPr>
@@ -3153,7 +3153,7 @@
         <w:bidi w:val="1"/>
         <w:spacing w:lineRule="auto" w:line="360" w:before="0" w:after="120"/>
         <w:ind w:firstLine="567"/>
-        <w:jc w:val="left"/>
+        <w:jc w:val="both"/>
         <w:rPr/>
       </w:pPr>
       <w:r>
@@ -3493,7 +3493,7 @@
         <w:bidi w:val="1"/>
         <w:spacing w:lineRule="auto" w:line="360" w:before="0" w:after="120"/>
         <w:ind w:firstLine="567"/>
-        <w:jc w:val="left"/>
+        <w:jc w:val="both"/>
         <w:rPr/>
       </w:pPr>
       <w:r>
@@ -3731,7 +3731,7 @@
         <w:bidi w:val="1"/>
         <w:spacing w:lineRule="auto" w:line="360" w:before="0" w:after="120"/>
         <w:ind w:firstLine="567"/>
-        <w:jc w:val="left"/>
+        <w:jc w:val="both"/>
         <w:rPr/>
       </w:pPr>
       <w:r>
@@ -3967,7 +3967,7 @@
         <w:jc w:val="right"/>
         <w:rPr/>
       </w:pPr>
-      <w:bookmarkStart w:id="4" w:name="__RefHeading___Toc417_1283528634"/>
+      <w:bookmarkStart w:id="4" w:name="__RefHeading___Toc417_1970309342"/>
       <w:bookmarkEnd w:id="4"/>
       <w:r>
         <w:rPr>
@@ -4034,7 +4034,7 @@
         <w:bidi w:val="1"/>
         <w:spacing w:lineRule="auto" w:line="360" w:before="0" w:after="120"/>
         <w:ind w:firstLine="567"/>
-        <w:jc w:val="left"/>
+        <w:jc w:val="both"/>
         <w:rPr/>
       </w:pPr>
       <w:r>
@@ -4215,7 +4215,7 @@
         <w:bidi w:val="1"/>
         <w:spacing w:lineRule="auto" w:line="360" w:before="0" w:after="120"/>
         <w:ind w:firstLine="567"/>
-        <w:jc w:val="left"/>
+        <w:jc w:val="both"/>
         <w:rPr/>
       </w:pPr>
       <w:r>
@@ -4384,7 +4384,7 @@
         <w:bidi w:val="1"/>
         <w:spacing w:lineRule="auto" w:line="360" w:before="0" w:after="120"/>
         <w:ind w:firstLine="567"/>
-        <w:jc w:val="left"/>
+        <w:jc w:val="both"/>
         <w:rPr/>
       </w:pPr>
       <w:r>
@@ -4582,7 +4582,7 @@
         <w:bidi w:val="1"/>
         <w:spacing w:lineRule="auto" w:line="360" w:before="0" w:after="120"/>
         <w:ind w:firstLine="567"/>
-        <w:jc w:val="left"/>
+        <w:jc w:val="both"/>
         <w:rPr/>
       </w:pPr>
       <w:r>
@@ -4765,7 +4765,7 @@
         <w:jc w:val="right"/>
         <w:rPr/>
       </w:pPr>
-      <w:bookmarkStart w:id="5" w:name="__RefHeading___Toc419_1283528634"/>
+      <w:bookmarkStart w:id="5" w:name="__RefHeading___Toc419_1970309342"/>
       <w:bookmarkEnd w:id="5"/>
       <w:r>
         <w:rPr>
@@ -4808,7 +4808,7 @@
         <w:bidi w:val="1"/>
         <w:spacing w:lineRule="auto" w:line="360" w:before="0" w:after="120"/>
         <w:ind w:firstLine="567"/>
-        <w:jc w:val="left"/>
+        <w:jc w:val="both"/>
         <w:rPr/>
       </w:pPr>
       <w:r>
@@ -4953,7 +4953,7 @@
         <w:jc w:val="right"/>
         <w:rPr/>
       </w:pPr>
-      <w:bookmarkStart w:id="6" w:name="__RefHeading___Toc421_1283528634"/>
+      <w:bookmarkStart w:id="6" w:name="__RefHeading___Toc421_1970309342"/>
       <w:bookmarkEnd w:id="6"/>
       <w:r>
         <w:rPr>
@@ -4996,7 +4996,7 @@
         <w:bidi w:val="1"/>
         <w:spacing w:lineRule="auto" w:line="360" w:before="0" w:after="120"/>
         <w:ind w:firstLine="567"/>
-        <w:jc w:val="left"/>
+        <w:jc w:val="both"/>
         <w:rPr/>
       </w:pPr>
       <w:r>
@@ -5274,7 +5274,7 @@
         <w:jc w:val="right"/>
         <w:rPr/>
       </w:pPr>
-      <w:bookmarkStart w:id="7" w:name="__RefHeading___Toc423_1283528634"/>
+      <w:bookmarkStart w:id="7" w:name="__RefHeading___Toc423_1970309342"/>
       <w:bookmarkEnd w:id="7"/>
       <w:r>
         <w:rPr>
@@ -5317,7 +5317,7 @@
         <w:bidi w:val="1"/>
         <w:spacing w:lineRule="auto" w:line="360" w:before="0" w:after="120"/>
         <w:ind w:firstLine="567"/>
-        <w:jc w:val="left"/>
+        <w:jc w:val="both"/>
         <w:rPr/>
       </w:pPr>
       <w:r>
@@ -5519,7 +5519,7 @@
         <w:jc w:val="right"/>
         <w:rPr/>
       </w:pPr>
-      <w:bookmarkStart w:id="8" w:name="__RefHeading___Toc425_1283528634"/>
+      <w:bookmarkStart w:id="8" w:name="__RefHeading___Toc425_1970309342"/>
       <w:bookmarkEnd w:id="8"/>
       <w:r>
         <w:rPr>
@@ -5562,7 +5562,7 @@
         <w:bidi w:val="1"/>
         <w:spacing w:lineRule="auto" w:line="360" w:before="0" w:after="120"/>
         <w:ind w:firstLine="567"/>
-        <w:jc w:val="left"/>
+        <w:jc w:val="both"/>
         <w:rPr/>
       </w:pPr>
       <w:r>
@@ -5814,7 +5814,7 @@
         <w:jc w:val="right"/>
         <w:rPr/>
       </w:pPr>
-      <w:bookmarkStart w:id="9" w:name="__RefHeading___Toc427_1283528634"/>
+      <w:bookmarkStart w:id="9" w:name="__RefHeading___Toc427_1970309342"/>
       <w:bookmarkEnd w:id="9"/>
       <w:r>
         <w:rPr>
@@ -5859,7 +5859,7 @@
         <w:jc w:val="right"/>
         <w:rPr/>
       </w:pPr>
-      <w:bookmarkStart w:id="10" w:name="__RefHeading___Toc429_1283528634"/>
+      <w:bookmarkStart w:id="10" w:name="__RefHeading___Toc429_1970309342"/>
       <w:bookmarkEnd w:id="10"/>
       <w:r>
         <w:rPr>
@@ -5904,7 +5904,7 @@
         <w:jc w:val="right"/>
         <w:rPr/>
       </w:pPr>
-      <w:bookmarkStart w:id="11" w:name="__RefHeading___Toc431_1283528634"/>
+      <w:bookmarkStart w:id="11" w:name="__RefHeading___Toc431_1970309342"/>
       <w:bookmarkEnd w:id="11"/>
       <w:r>
         <w:rPr>
@@ -5947,7 +5947,7 @@
         <w:bidi w:val="1"/>
         <w:spacing w:lineRule="auto" w:line="360" w:before="0" w:after="120"/>
         <w:ind w:firstLine="567"/>
-        <w:jc w:val="left"/>
+        <w:jc w:val="both"/>
         <w:rPr/>
       </w:pPr>
       <w:r>
@@ -6268,7 +6268,7 @@
         <w:bidi w:val="1"/>
         <w:spacing w:lineRule="auto" w:line="360" w:before="0" w:after="120"/>
         <w:ind w:firstLine="567"/>
-        <w:jc w:val="left"/>
+        <w:jc w:val="both"/>
         <w:rPr/>
       </w:pPr>
       <w:r>
@@ -6551,7 +6551,7 @@
         <w:bidi w:val="1"/>
         <w:spacing w:lineRule="auto" w:line="360" w:before="0" w:after="120"/>
         <w:ind w:firstLine="567"/>
-        <w:jc w:val="left"/>
+        <w:jc w:val="both"/>
         <w:rPr/>
       </w:pPr>
       <w:r>
@@ -6953,7 +6953,7 @@
         <w:bidi w:val="1"/>
         <w:spacing w:lineRule="auto" w:line="360" w:before="0" w:after="120"/>
         <w:ind w:firstLine="567"/>
-        <w:jc w:val="left"/>
+        <w:jc w:val="both"/>
         <w:rPr/>
       </w:pPr>
       <w:r>
@@ -7307,7 +7307,7 @@
         <w:jc w:val="right"/>
         <w:rPr/>
       </w:pPr>
-      <w:bookmarkStart w:id="12" w:name="__RefHeading___Toc433_1283528634"/>
+      <w:bookmarkStart w:id="12" w:name="__RefHeading___Toc433_1970309342"/>
       <w:bookmarkEnd w:id="12"/>
       <w:r>
         <w:rPr>
@@ -7398,7 +7398,7 @@
         <w:bidi w:val="1"/>
         <w:spacing w:lineRule="auto" w:line="360" w:before="0" w:after="120"/>
         <w:ind w:firstLine="567"/>
-        <w:jc w:val="left"/>
+        <w:jc w:val="both"/>
         <w:rPr/>
       </w:pPr>
       <w:r>
@@ -7689,7 +7689,7 @@
         <w:bidi w:val="1"/>
         <w:spacing w:lineRule="auto" w:line="360" w:before="0" w:after="120"/>
         <w:ind w:firstLine="567"/>
-        <w:jc w:val="left"/>
+        <w:jc w:val="both"/>
         <w:rPr/>
       </w:pPr>
       <w:r>
@@ -8213,7 +8213,7 @@
         <w:bidi w:val="1"/>
         <w:spacing w:lineRule="auto" w:line="360" w:before="0" w:after="120"/>
         <w:ind w:firstLine="567"/>
-        <w:jc w:val="left"/>
+        <w:jc w:val="both"/>
         <w:rPr/>
       </w:pPr>
       <w:r>
@@ -8563,7 +8563,7 @@
         <w:bidi w:val="1"/>
         <w:spacing w:lineRule="auto" w:line="360" w:before="0" w:after="120"/>
         <w:ind w:firstLine="567"/>
-        <w:jc w:val="left"/>
+        <w:jc w:val="both"/>
         <w:rPr/>
       </w:pPr>
       <w:r>
@@ -8879,7 +8879,7 @@
         <w:jc w:val="right"/>
         <w:rPr/>
       </w:pPr>
-      <w:bookmarkStart w:id="13" w:name="__RefHeading___Toc435_1283528634"/>
+      <w:bookmarkStart w:id="13" w:name="__RefHeading___Toc435_1970309342"/>
       <w:bookmarkEnd w:id="13"/>
       <w:r>
         <w:rPr>
@@ -8922,7 +8922,7 @@
         <w:bidi w:val="1"/>
         <w:spacing w:lineRule="auto" w:line="360" w:before="0" w:after="120"/>
         <w:ind w:firstLine="567"/>
-        <w:jc w:val="left"/>
+        <w:jc w:val="both"/>
         <w:rPr/>
       </w:pPr>
       <w:r>
@@ -9240,7 +9240,7 @@
         <w:bidi w:val="1"/>
         <w:spacing w:lineRule="auto" w:line="360" w:before="0" w:after="120"/>
         <w:ind w:firstLine="567"/>
-        <w:jc w:val="left"/>
+        <w:jc w:val="both"/>
         <w:rPr/>
       </w:pPr>
       <w:r>
@@ -9523,7 +9523,7 @@
         <w:bidi w:val="1"/>
         <w:spacing w:lineRule="auto" w:line="360" w:before="0" w:after="120"/>
         <w:ind w:firstLine="567"/>
-        <w:jc w:val="left"/>
+        <w:jc w:val="both"/>
         <w:rPr/>
       </w:pPr>
       <w:r>
@@ -9756,7 +9756,7 @@
         <w:bidi w:val="1"/>
         <w:spacing w:lineRule="auto" w:line="360" w:before="0" w:after="120"/>
         <w:ind w:firstLine="567"/>
-        <w:jc w:val="left"/>
+        <w:jc w:val="both"/>
         <w:rPr/>
       </w:pPr>
       <w:r>
@@ -9975,7 +9975,7 @@
         <w:jc w:val="right"/>
         <w:rPr/>
       </w:pPr>
-      <w:bookmarkStart w:id="14" w:name="__RefHeading___Toc437_1283528634"/>
+      <w:bookmarkStart w:id="14" w:name="__RefHeading___Toc437_1970309342"/>
       <w:bookmarkEnd w:id="14"/>
       <w:r>
         <w:rPr>
@@ -10018,7 +10018,7 @@
         <w:bidi w:val="1"/>
         <w:spacing w:lineRule="auto" w:line="360" w:before="0" w:after="120"/>
         <w:ind w:firstLine="567"/>
-        <w:jc w:val="left"/>
+        <w:jc w:val="both"/>
         <w:rPr/>
       </w:pPr>
       <w:r>
@@ -10345,7 +10345,7 @@
         <w:bidi w:val="1"/>
         <w:spacing w:lineRule="auto" w:line="360" w:before="0" w:after="120"/>
         <w:ind w:firstLine="567"/>
-        <w:jc w:val="left"/>
+        <w:jc w:val="both"/>
         <w:rPr/>
       </w:pPr>
       <w:r>
@@ -10528,7 +10528,7 @@
         <w:jc w:val="right"/>
         <w:rPr/>
       </w:pPr>
-      <w:bookmarkStart w:id="15" w:name="__RefHeading___Toc439_1283528634"/>
+      <w:bookmarkStart w:id="15" w:name="__RefHeading___Toc439_1970309342"/>
       <w:bookmarkEnd w:id="15"/>
       <w:r>
         <w:rPr>
@@ -10595,7 +10595,7 @@
         <w:bidi w:val="1"/>
         <w:spacing w:lineRule="auto" w:line="360" w:before="0" w:after="120"/>
         <w:ind w:firstLine="567"/>
-        <w:jc w:val="left"/>
+        <w:jc w:val="both"/>
         <w:rPr/>
       </w:pPr>
       <w:r>
@@ -10900,7 +10900,7 @@
         <w:bidi w:val="1"/>
         <w:spacing w:lineRule="auto" w:line="360" w:before="0" w:after="120"/>
         <w:ind w:firstLine="567"/>
-        <w:jc w:val="left"/>
+        <w:jc w:val="both"/>
         <w:rPr/>
       </w:pPr>
       <w:r>
@@ -11219,7 +11219,7 @@
         <w:bidi w:val="1"/>
         <w:spacing w:lineRule="auto" w:line="360" w:before="0" w:after="120"/>
         <w:ind w:firstLine="567"/>
-        <w:jc w:val="left"/>
+        <w:jc w:val="both"/>
         <w:rPr/>
       </w:pPr>
       <w:r>
@@ -11421,7 +11421,7 @@
         <w:jc w:val="right"/>
         <w:rPr/>
       </w:pPr>
-      <w:bookmarkStart w:id="16" w:name="__RefHeading___Toc441_1283528634"/>
+      <w:bookmarkStart w:id="16" w:name="__RefHeading___Toc441_1970309342"/>
       <w:bookmarkEnd w:id="16"/>
       <w:r>
         <w:rPr>
@@ -11538,7 +11538,7 @@
         <w:jc w:val="right"/>
         <w:rPr/>
       </w:pPr>
-      <w:bookmarkStart w:id="17" w:name="__RefHeading___Toc443_1283528634"/>
+      <w:bookmarkStart w:id="17" w:name="__RefHeading___Toc443_1970309342"/>
       <w:bookmarkEnd w:id="17"/>
       <w:r>
         <w:rPr>
@@ -11629,7 +11629,7 @@
         <w:bidi w:val="1"/>
         <w:spacing w:lineRule="auto" w:line="360" w:before="0" w:after="120"/>
         <w:ind w:firstLine="567"/>
-        <w:jc w:val="left"/>
+        <w:jc w:val="both"/>
         <w:rPr/>
       </w:pPr>
       <w:r>
@@ -11884,7 +11884,7 @@
         <w:bidi w:val="1"/>
         <w:spacing w:lineRule="auto" w:line="360" w:before="0" w:after="120"/>
         <w:ind w:firstLine="567"/>
-        <w:jc w:val="left"/>
+        <w:jc w:val="both"/>
         <w:rPr/>
       </w:pPr>
       <w:r>
@@ -12350,7 +12350,7 @@
         <w:bidi w:val="1"/>
         <w:spacing w:lineRule="auto" w:line="360" w:before="0" w:after="120"/>
         <w:ind w:firstLine="567"/>
-        <w:jc w:val="left"/>
+        <w:jc w:val="both"/>
         <w:rPr/>
       </w:pPr>
       <w:r>
@@ -12624,7 +12624,7 @@
         <w:bidi w:val="1"/>
         <w:spacing w:lineRule="auto" w:line="360" w:before="0" w:after="120"/>
         <w:ind w:firstLine="567"/>
-        <w:jc w:val="left"/>
+        <w:jc w:val="both"/>
         <w:rPr/>
       </w:pPr>
       <w:r>
@@ -13133,7 +13133,7 @@
         <w:jc w:val="right"/>
         <w:rPr/>
       </w:pPr>
-      <w:bookmarkStart w:id="18" w:name="__RefHeading___Toc445_1283528634"/>
+      <w:bookmarkStart w:id="18" w:name="__RefHeading___Toc445_1970309342"/>
       <w:bookmarkEnd w:id="18"/>
       <w:r>
         <w:rPr>
@@ -13200,7 +13200,7 @@
         <w:bidi w:val="1"/>
         <w:spacing w:lineRule="auto" w:line="360" w:before="0" w:after="120"/>
         <w:ind w:firstLine="567"/>
-        <w:jc w:val="left"/>
+        <w:jc w:val="both"/>
         <w:rPr/>
       </w:pPr>
       <w:r>
@@ -13588,7 +13588,7 @@
         <w:bidi w:val="1"/>
         <w:spacing w:lineRule="auto" w:line="360" w:before="0" w:after="120"/>
         <w:ind w:firstLine="567"/>
-        <w:jc w:val="left"/>
+        <w:jc w:val="both"/>
         <w:rPr/>
       </w:pPr>
       <w:r>
@@ -13826,7 +13826,7 @@
         <w:bidi w:val="1"/>
         <w:spacing w:lineRule="auto" w:line="360" w:before="0" w:after="120"/>
         <w:ind w:firstLine="567"/>
-        <w:jc w:val="left"/>
+        <w:jc w:val="both"/>
         <w:rPr/>
       </w:pPr>
       <w:r>
@@ -14257,7 +14257,7 @@
         <w:bidi w:val="1"/>
         <w:spacing w:lineRule="auto" w:line="360" w:before="0" w:after="120"/>
         <w:ind w:firstLine="567"/>
-        <w:jc w:val="left"/>
+        <w:jc w:val="both"/>
         <w:rPr/>
       </w:pPr>
       <w:r>
@@ -14691,7 +14691,7 @@
         <w:bidi w:val="1"/>
         <w:spacing w:lineRule="auto" w:line="360" w:before="0" w:after="120"/>
         <w:ind w:firstLine="567"/>
-        <w:jc w:val="left"/>
+        <w:jc w:val="both"/>
         <w:rPr/>
       </w:pPr>
       <w:r>
@@ -15043,7 +15043,7 @@
         <w:jc w:val="right"/>
         <w:rPr/>
       </w:pPr>
-      <w:bookmarkStart w:id="19" w:name="__RefHeading___Toc447_1283528634"/>
+      <w:bookmarkStart w:id="19" w:name="__RefHeading___Toc447_1970309342"/>
       <w:bookmarkEnd w:id="19"/>
       <w:r>
         <w:rPr>
@@ -15131,7 +15131,7 @@
         <w:bidi w:val="1"/>
         <w:spacing w:lineRule="auto" w:line="360" w:before="0" w:after="120"/>
         <w:ind w:firstLine="567"/>
-        <w:jc w:val="left"/>
+        <w:jc w:val="both"/>
         <w:rPr/>
       </w:pPr>
       <w:r>
@@ -15476,7 +15476,7 @@
         <w:bidi w:val="1"/>
         <w:spacing w:lineRule="auto" w:line="360" w:before="0" w:after="120"/>
         <w:ind w:firstLine="567"/>
-        <w:jc w:val="left"/>
+        <w:jc w:val="both"/>
         <w:rPr/>
       </w:pPr>
       <w:r>
@@ -15780,7 +15780,7 @@
         <w:jc w:val="right"/>
         <w:rPr/>
       </w:pPr>
-      <w:bookmarkStart w:id="20" w:name="__RefHeading___Toc449_1283528634"/>
+      <w:bookmarkStart w:id="20" w:name="__RefHeading___Toc449_1970309342"/>
       <w:bookmarkEnd w:id="20"/>
       <w:r>
         <w:rPr>
@@ -15847,7 +15847,7 @@
         <w:bidi w:val="1"/>
         <w:spacing w:lineRule="auto" w:line="360" w:before="0" w:after="120"/>
         <w:ind w:firstLine="567"/>
-        <w:jc w:val="left"/>
+        <w:jc w:val="both"/>
         <w:rPr/>
       </w:pPr>
       <w:r>
@@ -16054,7 +16054,7 @@
         <w:bidi w:val="1"/>
         <w:spacing w:lineRule="auto" w:line="360" w:before="0" w:after="120"/>
         <w:ind w:firstLine="567"/>
-        <w:jc w:val="left"/>
+        <w:jc w:val="both"/>
         <w:rPr/>
       </w:pPr>
       <w:r>
@@ -16280,7 +16280,7 @@
         <w:bidi w:val="1"/>
         <w:spacing w:lineRule="auto" w:line="360" w:before="0" w:after="120"/>
         <w:ind w:firstLine="567"/>
-        <w:jc w:val="left"/>
+        <w:jc w:val="both"/>
         <w:rPr/>
       </w:pPr>
       <w:r>
@@ -16537,7 +16537,7 @@
         <w:jc w:val="right"/>
         <w:rPr/>
       </w:pPr>
-      <w:bookmarkStart w:id="21" w:name="__RefHeading___Toc451_1283528634"/>
+      <w:bookmarkStart w:id="21" w:name="__RefHeading___Toc451_1970309342"/>
       <w:bookmarkEnd w:id="21"/>
       <w:r>
         <w:rPr>
@@ -16628,7 +16628,7 @@
         <w:bidi w:val="1"/>
         <w:spacing w:lineRule="auto" w:line="360" w:before="0" w:after="120"/>
         <w:ind w:firstLine="567"/>
-        <w:jc w:val="left"/>
+        <w:jc w:val="both"/>
         <w:rPr/>
       </w:pPr>
       <w:r>
@@ -16873,7 +16873,7 @@
         <w:bidi w:val="1"/>
         <w:spacing w:lineRule="auto" w:line="360" w:before="0" w:after="120"/>
         <w:ind w:firstLine="567"/>
-        <w:jc w:val="left"/>
+        <w:jc w:val="both"/>
         <w:rPr/>
       </w:pPr>
       <w:r>
@@ -17261,7 +17261,7 @@
         <w:bidi w:val="1"/>
         <w:spacing w:lineRule="auto" w:line="360" w:before="0" w:after="120"/>
         <w:ind w:firstLine="567"/>
-        <w:jc w:val="left"/>
+        <w:jc w:val="both"/>
         <w:rPr/>
       </w:pPr>
       <w:r>
@@ -17525,7 +17525,7 @@
         <w:bidi w:val="1"/>
         <w:spacing w:lineRule="auto" w:line="360" w:before="0" w:after="120"/>
         <w:ind w:firstLine="567"/>
-        <w:jc w:val="left"/>
+        <w:jc w:val="both"/>
         <w:rPr/>
       </w:pPr>
       <w:r>
@@ -17708,7 +17708,7 @@
         <w:jc w:val="right"/>
         <w:rPr/>
       </w:pPr>
-      <w:bookmarkStart w:id="22" w:name="__RefHeading___Toc453_1283528634"/>
+      <w:bookmarkStart w:id="22" w:name="__RefHeading___Toc453_1970309342"/>
       <w:bookmarkEnd w:id="22"/>
       <w:r>
         <w:rPr>
@@ -17801,7 +17801,7 @@
         <w:jc w:val="right"/>
         <w:rPr/>
       </w:pPr>
-      <w:bookmarkStart w:id="23" w:name="__RefHeading___Toc455_1283528634"/>
+      <w:bookmarkStart w:id="23" w:name="__RefHeading___Toc455_1970309342"/>
       <w:bookmarkEnd w:id="23"/>
       <w:r>
         <w:rPr>
@@ -17844,7 +17844,7 @@
         <w:bidi w:val="1"/>
         <w:spacing w:lineRule="auto" w:line="360" w:before="0" w:after="120"/>
         <w:ind w:firstLine="567"/>
-        <w:jc w:val="left"/>
+        <w:jc w:val="both"/>
         <w:rPr/>
       </w:pPr>
       <w:r>
@@ -18127,7 +18127,7 @@
         <w:bidi w:val="1"/>
         <w:spacing w:lineRule="auto" w:line="360" w:before="0" w:after="120"/>
         <w:ind w:firstLine="567"/>
-        <w:jc w:val="left"/>
+        <w:jc w:val="both"/>
         <w:rPr/>
       </w:pPr>
       <w:r>
@@ -18384,7 +18384,7 @@
         <w:bidi w:val="1"/>
         <w:spacing w:lineRule="auto" w:line="360" w:before="0" w:after="120"/>
         <w:ind w:firstLine="567"/>
-        <w:jc w:val="left"/>
+        <w:jc w:val="both"/>
         <w:rPr/>
       </w:pPr>
       <w:r>
@@ -18733,7 +18733,7 @@
         <w:jc w:val="right"/>
         <w:rPr/>
       </w:pPr>
-      <w:bookmarkStart w:id="24" w:name="__RefHeading___Toc457_1283528634"/>
+      <w:bookmarkStart w:id="24" w:name="__RefHeading___Toc457_1970309342"/>
       <w:bookmarkEnd w:id="24"/>
       <w:r>
         <w:rPr>
@@ -18800,7 +18800,7 @@
         <w:bidi w:val="1"/>
         <w:spacing w:lineRule="auto" w:line="360" w:before="0" w:after="120"/>
         <w:ind w:firstLine="567"/>
-        <w:jc w:val="left"/>
+        <w:jc w:val="both"/>
         <w:rPr/>
       </w:pPr>
       <w:r>
@@ -19052,7 +19052,7 @@
         <w:bidi w:val="1"/>
         <w:spacing w:lineRule="auto" w:line="360" w:before="0" w:after="120"/>
         <w:ind w:firstLine="567"/>
-        <w:jc w:val="left"/>
+        <w:jc w:val="both"/>
         <w:rPr/>
       </w:pPr>
       <w:r>
@@ -19316,7 +19316,7 @@
         <w:bidi w:val="1"/>
         <w:spacing w:lineRule="auto" w:line="360" w:before="0" w:after="120"/>
         <w:ind w:firstLine="567"/>
-        <w:jc w:val="left"/>
+        <w:jc w:val="both"/>
         <w:rPr/>
       </w:pPr>
       <w:r>
@@ -19525,7 +19525,7 @@
         <w:jc w:val="right"/>
         <w:rPr/>
       </w:pPr>
-      <w:bookmarkStart w:id="25" w:name="__RefHeading___Toc459_1283528634"/>
+      <w:bookmarkStart w:id="25" w:name="__RefHeading___Toc459_1970309342"/>
       <w:bookmarkEnd w:id="25"/>
       <w:r>
         <w:rPr>
@@ -19616,7 +19616,7 @@
         <w:bidi w:val="1"/>
         <w:spacing w:lineRule="auto" w:line="360" w:before="0" w:after="120"/>
         <w:ind w:firstLine="567"/>
-        <w:jc w:val="left"/>
+        <w:jc w:val="both"/>
         <w:rPr/>
       </w:pPr>
       <w:r>
@@ -19861,7 +19861,7 @@
         <w:bidi w:val="1"/>
         <w:spacing w:lineRule="auto" w:line="360" w:before="0" w:after="120"/>
         <w:ind w:firstLine="567"/>
-        <w:jc w:val="left"/>
+        <w:jc w:val="both"/>
         <w:rPr/>
       </w:pPr>
       <w:r>
@@ -20220,7 +20220,7 @@
         <w:bidi w:val="1"/>
         <w:spacing w:lineRule="auto" w:line="360" w:before="0" w:after="120"/>
         <w:ind w:firstLine="567"/>
-        <w:jc w:val="left"/>
+        <w:jc w:val="both"/>
         <w:rPr/>
       </w:pPr>
       <w:r>
@@ -20475,7 +20475,7 @@
         <w:bidi w:val="1"/>
         <w:spacing w:lineRule="auto" w:line="360" w:before="0" w:after="120"/>
         <w:ind w:firstLine="567"/>
-        <w:jc w:val="left"/>
+        <w:jc w:val="both"/>
         <w:rPr/>
       </w:pPr>
       <w:r>
@@ -20713,7 +20713,7 @@
         <w:jc w:val="right"/>
         <w:rPr/>
       </w:pPr>
-      <w:bookmarkStart w:id="26" w:name="__RefHeading___Toc461_1283528634"/>
+      <w:bookmarkStart w:id="26" w:name="__RefHeading___Toc461_1970309342"/>
       <w:bookmarkEnd w:id="26"/>
       <w:r>
         <w:rPr>
@@ -20804,7 +20804,7 @@
         <w:bidi w:val="1"/>
         <w:spacing w:lineRule="auto" w:line="360" w:before="0" w:after="120"/>
         <w:ind w:firstLine="567"/>
-        <w:jc w:val="left"/>
+        <w:jc w:val="both"/>
         <w:rPr/>
       </w:pPr>
       <w:r>
@@ -21154,7 +21154,7 @@
         <w:bidi w:val="1"/>
         <w:spacing w:lineRule="auto" w:line="360" w:before="0" w:after="120"/>
         <w:ind w:firstLine="567"/>
-        <w:jc w:val="left"/>
+        <w:jc w:val="both"/>
         <w:rPr/>
       </w:pPr>
       <w:r>
@@ -21485,7 +21485,7 @@
         <w:bidi w:val="1"/>
         <w:spacing w:lineRule="auto" w:line="360" w:before="0" w:after="120"/>
         <w:ind w:firstLine="567"/>
-        <w:jc w:val="left"/>
+        <w:jc w:val="both"/>
         <w:rPr/>
       </w:pPr>
       <w:r>
@@ -21877,7 +21877,7 @@
         <w:jc w:val="right"/>
         <w:rPr/>
       </w:pPr>
-      <w:bookmarkStart w:id="27" w:name="__RefHeading___Toc463_1283528634"/>
+      <w:bookmarkStart w:id="27" w:name="__RefHeading___Toc463_1970309342"/>
       <w:bookmarkEnd w:id="27"/>
       <w:r>
         <w:rPr>
@@ -21944,7 +21944,7 @@
         <w:bidi w:val="1"/>
         <w:spacing w:lineRule="auto" w:line="360" w:before="0" w:after="120"/>
         <w:ind w:firstLine="567"/>
-        <w:jc w:val="left"/>
+        <w:jc w:val="both"/>
         <w:rPr/>
       </w:pPr>
       <w:r>
@@ -22456,7 +22456,7 @@
         <w:bidi w:val="1"/>
         <w:spacing w:lineRule="auto" w:line="360" w:before="0" w:after="120"/>
         <w:ind w:firstLine="567"/>
-        <w:jc w:val="left"/>
+        <w:jc w:val="both"/>
         <w:rPr/>
       </w:pPr>
       <w:r>
@@ -22670,7 +22670,7 @@
         <w:bidi w:val="1"/>
         <w:spacing w:lineRule="auto" w:line="360" w:before="0" w:after="120"/>
         <w:ind w:firstLine="567"/>
-        <w:jc w:val="left"/>
+        <w:jc w:val="both"/>
         <w:rPr/>
       </w:pPr>
       <w:r>
@@ -22930,7 +22930,7 @@
         <w:bidi w:val="1"/>
         <w:spacing w:lineRule="auto" w:line="360" w:before="0" w:after="120"/>
         <w:ind w:firstLine="567"/>
-        <w:jc w:val="left"/>
+        <w:jc w:val="both"/>
         <w:rPr/>
       </w:pPr>
       <w:r>
@@ -23197,7 +23197,7 @@
         <w:bidi w:val="1"/>
         <w:spacing w:lineRule="auto" w:line="360" w:before="0" w:after="120"/>
         <w:ind w:firstLine="567"/>
-        <w:jc w:val="left"/>
+        <w:jc w:val="both"/>
         <w:rPr/>
       </w:pPr>
       <w:r>
@@ -23852,7 +23852,7 @@
         <w:bidi w:val="1"/>
         <w:spacing w:lineRule="auto" w:line="360" w:before="0" w:after="120"/>
         <w:ind w:firstLine="567"/>
-        <w:jc w:val="left"/>
+        <w:jc w:val="both"/>
         <w:rPr/>
       </w:pPr>
       <w:r>
@@ -24216,7 +24216,7 @@
         <w:bidi w:val="1"/>
         <w:spacing w:lineRule="auto" w:line="360" w:before="0" w:after="120"/>
         <w:ind w:firstLine="567"/>
-        <w:jc w:val="left"/>
+        <w:jc w:val="both"/>
         <w:rPr/>
       </w:pPr>
       <w:r>
@@ -24659,7 +24659,7 @@
         <w:bidi w:val="1"/>
         <w:spacing w:lineRule="auto" w:line="360" w:before="0" w:after="120"/>
         <w:ind w:firstLine="567"/>
-        <w:jc w:val="left"/>
+        <w:jc w:val="both"/>
         <w:rPr/>
       </w:pPr>
       <w:r>
@@ -25012,7 +25012,7 @@
         <w:bidi w:val="1"/>
         <w:spacing w:lineRule="auto" w:line="360" w:before="0" w:after="120"/>
         <w:ind w:firstLine="567"/>
-        <w:jc w:val="left"/>
+        <w:jc w:val="both"/>
         <w:rPr/>
       </w:pPr>
       <w:r>
@@ -25207,7 +25207,7 @@
         <w:jc w:val="right"/>
         <w:rPr/>
       </w:pPr>
-      <w:bookmarkStart w:id="28" w:name="__RefHeading___Toc465_1283528634"/>
+      <w:bookmarkStart w:id="28" w:name="__RefHeading___Toc465_1970309342"/>
       <w:bookmarkEnd w:id="28"/>
       <w:r>
         <w:rPr>
@@ -25250,7 +25250,7 @@
         <w:bidi w:val="1"/>
         <w:spacing w:lineRule="auto" w:line="360" w:before="0" w:after="120"/>
         <w:ind w:firstLine="567"/>
-        <w:jc w:val="left"/>
+        <w:jc w:val="both"/>
         <w:rPr/>
       </w:pPr>
       <w:r>
@@ -25450,7 +25450,7 @@
         <w:bidi w:val="1"/>
         <w:spacing w:lineRule="auto" w:line="360" w:before="0" w:after="120"/>
         <w:ind w:firstLine="567"/>
-        <w:jc w:val="left"/>
+        <w:jc w:val="both"/>
         <w:rPr/>
       </w:pPr>
       <w:r>
@@ -26168,7 +26168,7 @@
         <w:bidi w:val="1"/>
         <w:spacing w:lineRule="auto" w:line="360" w:before="0" w:after="120"/>
         <w:ind w:firstLine="567"/>
-        <w:jc w:val="left"/>
+        <w:jc w:val="both"/>
         <w:rPr/>
       </w:pPr>
       <w:r>
@@ -27022,7 +27022,7 @@
         <w:bidi w:val="1"/>
         <w:spacing w:lineRule="auto" w:line="360" w:before="0" w:after="120"/>
         <w:ind w:firstLine="567"/>
-        <w:jc w:val="left"/>
+        <w:jc w:val="both"/>
         <w:rPr/>
       </w:pPr>
       <w:r>
@@ -27422,7 +27422,7 @@
         <w:bidi w:val="1"/>
         <w:spacing w:lineRule="auto" w:line="360" w:before="0" w:after="120"/>
         <w:ind w:firstLine="567"/>
-        <w:jc w:val="left"/>
+        <w:jc w:val="both"/>
         <w:rPr/>
       </w:pPr>
       <w:r>
@@ -28074,7 +28074,7 @@
         <w:bidi w:val="1"/>
         <w:spacing w:lineRule="auto" w:line="360" w:before="0" w:after="120"/>
         <w:ind w:firstLine="567"/>
-        <w:jc w:val="left"/>
+        <w:jc w:val="both"/>
         <w:rPr/>
       </w:pPr>
       <w:r>
@@ -28419,7 +28419,7 @@
         <w:bidi w:val="1"/>
         <w:spacing w:lineRule="auto" w:line="360" w:before="0" w:after="120"/>
         <w:ind w:firstLine="567"/>
-        <w:jc w:val="left"/>
+        <w:jc w:val="both"/>
         <w:rPr/>
       </w:pPr>
       <w:r>
@@ -28959,7 +28959,7 @@
         <w:bidi w:val="1"/>
         <w:spacing w:lineRule="auto" w:line="360" w:before="0" w:after="120"/>
         <w:ind w:firstLine="567"/>
-        <w:jc w:val="left"/>
+        <w:jc w:val="both"/>
         <w:rPr/>
       </w:pPr>
       <w:r>
@@ -29443,7 +29443,7 @@
         <w:bidi w:val="1"/>
         <w:spacing w:lineRule="auto" w:line="360" w:before="0" w:after="120"/>
         <w:ind w:firstLine="567"/>
-        <w:jc w:val="left"/>
+        <w:jc w:val="both"/>
         <w:rPr/>
       </w:pPr>
       <w:r>
@@ -30173,7 +30173,7 @@
         <w:bidi w:val="1"/>
         <w:spacing w:lineRule="auto" w:line="360" w:before="0" w:after="120"/>
         <w:ind w:firstLine="567"/>
-        <w:jc w:val="left"/>
+        <w:jc w:val="both"/>
         <w:rPr/>
       </w:pPr>
       <w:r>
@@ -30658,7 +30658,7 @@
         <w:bidi w:val="1"/>
         <w:spacing w:lineRule="auto" w:line="360" w:before="0" w:after="120"/>
         <w:ind w:firstLine="567"/>
-        <w:jc w:val="left"/>
+        <w:jc w:val="both"/>
         <w:rPr/>
       </w:pPr>
       <w:r>
@@ -31086,7 +31086,7 @@
         <w:bidi w:val="1"/>
         <w:spacing w:lineRule="auto" w:line="360" w:before="0" w:after="120"/>
         <w:ind w:firstLine="567"/>
-        <w:jc w:val="left"/>
+        <w:jc w:val="both"/>
         <w:rPr/>
       </w:pPr>
       <w:r>
@@ -31634,7 +31634,7 @@
         <w:bidi w:val="1"/>
         <w:spacing w:lineRule="auto" w:line="360" w:before="0" w:after="120"/>
         <w:ind w:firstLine="567"/>
-        <w:jc w:val="left"/>
+        <w:jc w:val="both"/>
         <w:rPr/>
       </w:pPr>
       <w:r>
@@ -32148,7 +32148,7 @@
         <w:jc w:val="right"/>
         <w:rPr/>
       </w:pPr>
-      <w:bookmarkStart w:id="29" w:name="__RefHeading___Toc467_1283528634"/>
+      <w:bookmarkStart w:id="29" w:name="__RefHeading___Toc467_1970309342"/>
       <w:bookmarkEnd w:id="29"/>
       <w:r>
         <w:rPr>
@@ -32191,7 +32191,7 @@
         <w:bidi w:val="1"/>
         <w:spacing w:lineRule="auto" w:line="360" w:before="0" w:after="120"/>
         <w:ind w:firstLine="567"/>
-        <w:jc w:val="left"/>
+        <w:jc w:val="both"/>
         <w:rPr/>
       </w:pPr>
       <w:r>
@@ -32524,7 +32524,7 @@
         <w:bidi w:val="1"/>
         <w:spacing w:lineRule="auto" w:line="360" w:before="0" w:after="120"/>
         <w:ind w:firstLine="567"/>
-        <w:jc w:val="left"/>
+        <w:jc w:val="both"/>
         <w:rPr/>
       </w:pPr>
       <w:r>
@@ -32857,7 +32857,7 @@
         <w:bidi w:val="1"/>
         <w:spacing w:lineRule="auto" w:line="360" w:before="0" w:after="120"/>
         <w:ind w:firstLine="567"/>
-        <w:jc w:val="left"/>
+        <w:jc w:val="both"/>
         <w:rPr/>
       </w:pPr>
       <w:r>
@@ -33304,7 +33304,7 @@
         <w:bidi w:val="1"/>
         <w:spacing w:lineRule="auto" w:line="360" w:before="0" w:after="120"/>
         <w:ind w:firstLine="567"/>
-        <w:jc w:val="left"/>
+        <w:jc w:val="both"/>
         <w:rPr/>
       </w:pPr>
       <w:r>
@@ -33806,7 +33806,7 @@
         <w:bidi w:val="1"/>
         <w:spacing w:lineRule="auto" w:line="360" w:before="0" w:after="120"/>
         <w:ind w:firstLine="567"/>
-        <w:jc w:val="left"/>
+        <w:jc w:val="both"/>
         <w:rPr/>
       </w:pPr>
       <w:r>
@@ -34172,7 +34172,7 @@
         <w:jc w:val="right"/>
         <w:rPr/>
       </w:pPr>
-      <w:bookmarkStart w:id="30" w:name="__RefHeading___Toc469_1283528634"/>
+      <w:bookmarkStart w:id="30" w:name="__RefHeading___Toc469_1970309342"/>
       <w:bookmarkEnd w:id="30"/>
       <w:r>
         <w:rPr>
@@ -39301,7 +39301,7 @@
     </w:r>
     <w:r>
       <w:rPr/>
-      <w:t>29</w:t>
+      <w:t>28</w:t>
     </w:r>
     <w:r>
       <w:rPr/>
@@ -39333,7 +39333,7 @@
     </w:r>
     <w:r>
       <w:rPr/>
-      <w:t>29</w:t>
+      <w:t>28</w:t>
     </w:r>
     <w:r>
       <w:rPr/>

</xml_diff>

<commit_message>
Remove URLs from Hebrew references per Ono APA guide
Co-Authored-By: Claude Fable 5.1 <noreply@anthropic.com>
Claude-Session: https://claude.ai/code/session_01AGMAnS6o1o3m246uMW2ium
</commit_message>
<xml_diff>
--- a/seminar/סמינריון - תפקודים ניהוליים - הייכל מרווה.docx
+++ b/seminar/סמינריון - תפקודים ניהוליים - הייכל מרווה.docx
@@ -522,7 +522,7 @@
             </w:rPr>
             <w:fldChar w:fldCharType="separate"/>
           </w:r>
-          <w:hyperlink w:anchor="__RefHeading___Toc409_1970309342">
+          <w:hyperlink w:anchor="__RefHeading___Toc404_3329718844">
             <w:r>
               <w:rPr>
                 <w:rStyle w:val="IndexLink"/>
@@ -559,7 +559,7 @@
             </w:tabs>
             <w:rPr/>
           </w:pPr>
-          <w:hyperlink w:anchor="__RefHeading___Toc411_1970309342">
+          <w:hyperlink w:anchor="__RefHeading___Toc406_3329718844">
             <w:r>
               <w:rPr>
                 <w:rStyle w:val="IndexLink"/>
@@ -596,7 +596,7 @@
             </w:tabs>
             <w:rPr/>
           </w:pPr>
-          <w:hyperlink w:anchor="__RefHeading___Toc413_1970309342">
+          <w:hyperlink w:anchor="__RefHeading___Toc408_3329718844">
             <w:r>
               <w:rPr>
                 <w:rStyle w:val="IndexLink"/>
@@ -633,7 +633,7 @@
             </w:tabs>
             <w:rPr/>
           </w:pPr>
-          <w:hyperlink w:anchor="__RefHeading___Toc415_1970309342">
+          <w:hyperlink w:anchor="__RefHeading___Toc410_3329718844">
             <w:r>
               <w:rPr>
                 <w:rStyle w:val="IndexLink"/>
@@ -670,7 +670,7 @@
             </w:tabs>
             <w:rPr/>
           </w:pPr>
-          <w:hyperlink w:anchor="__RefHeading___Toc417_1970309342">
+          <w:hyperlink w:anchor="__RefHeading___Toc412_3329718844">
             <w:r>
               <w:rPr>
                 <w:rStyle w:val="IndexLink"/>
@@ -721,7 +721,7 @@
             </w:tabs>
             <w:rPr/>
           </w:pPr>
-          <w:hyperlink w:anchor="__RefHeading___Toc419_1970309342">
+          <w:hyperlink w:anchor="__RefHeading___Toc414_3329718844">
             <w:r>
               <w:rPr>
                 <w:rStyle w:val="IndexLink"/>
@@ -758,7 +758,7 @@
             </w:tabs>
             <w:rPr/>
           </w:pPr>
-          <w:hyperlink w:anchor="__RefHeading___Toc421_1970309342">
+          <w:hyperlink w:anchor="__RefHeading___Toc416_3329718844">
             <w:r>
               <w:rPr>
                 <w:rStyle w:val="IndexLink"/>
@@ -795,7 +795,7 @@
             </w:tabs>
             <w:rPr/>
           </w:pPr>
-          <w:hyperlink w:anchor="__RefHeading___Toc423_1970309342">
+          <w:hyperlink w:anchor="__RefHeading___Toc418_3329718844">
             <w:r>
               <w:rPr>
                 <w:rStyle w:val="IndexLink"/>
@@ -832,7 +832,7 @@
             </w:tabs>
             <w:rPr/>
           </w:pPr>
-          <w:hyperlink w:anchor="__RefHeading___Toc425_1970309342">
+          <w:hyperlink w:anchor="__RefHeading___Toc420_3329718844">
             <w:r>
               <w:rPr>
                 <w:rStyle w:val="IndexLink"/>
@@ -869,7 +869,7 @@
             </w:tabs>
             <w:rPr/>
           </w:pPr>
-          <w:hyperlink w:anchor="__RefHeading___Toc427_1970309342">
+          <w:hyperlink w:anchor="__RefHeading___Toc422_3329718844">
             <w:r>
               <w:rPr>
                 <w:rStyle w:val="IndexLink"/>
@@ -906,7 +906,7 @@
             </w:tabs>
             <w:rPr/>
           </w:pPr>
-          <w:hyperlink w:anchor="__RefHeading___Toc429_1970309342">
+          <w:hyperlink w:anchor="__RefHeading___Toc424_3329718844">
             <w:r>
               <w:rPr>
                 <w:rStyle w:val="IndexLink"/>
@@ -943,7 +943,7 @@
             </w:tabs>
             <w:rPr/>
           </w:pPr>
-          <w:hyperlink w:anchor="__RefHeading___Toc431_1970309342">
+          <w:hyperlink w:anchor="__RefHeading___Toc426_3329718844">
             <w:r>
               <w:rPr>
                 <w:rStyle w:val="IndexLink"/>
@@ -980,7 +980,7 @@
             </w:tabs>
             <w:rPr/>
           </w:pPr>
-          <w:hyperlink w:anchor="__RefHeading___Toc433_1970309342">
+          <w:hyperlink w:anchor="__RefHeading___Toc428_3329718844">
             <w:r>
               <w:rPr>
                 <w:rStyle w:val="IndexLink"/>
@@ -1045,7 +1045,7 @@
             </w:tabs>
             <w:rPr/>
           </w:pPr>
-          <w:hyperlink w:anchor="__RefHeading___Toc435_1970309342">
+          <w:hyperlink w:anchor="__RefHeading___Toc430_3329718844">
             <w:r>
               <w:rPr>
                 <w:rStyle w:val="IndexLink"/>
@@ -1082,7 +1082,7 @@
             </w:tabs>
             <w:rPr/>
           </w:pPr>
-          <w:hyperlink w:anchor="__RefHeading___Toc437_1970309342">
+          <w:hyperlink w:anchor="__RefHeading___Toc432_3329718844">
             <w:r>
               <w:rPr>
                 <w:rStyle w:val="IndexLink"/>
@@ -1119,7 +1119,7 @@
             </w:tabs>
             <w:rPr/>
           </w:pPr>
-          <w:hyperlink w:anchor="__RefHeading___Toc439_1970309342">
+          <w:hyperlink w:anchor="__RefHeading___Toc434_3329718844">
             <w:r>
               <w:rPr>
                 <w:rStyle w:val="IndexLink"/>
@@ -1170,7 +1170,7 @@
             </w:tabs>
             <w:rPr/>
           </w:pPr>
-          <w:hyperlink w:anchor="__RefHeading___Toc441_1970309342">
+          <w:hyperlink w:anchor="__RefHeading___Toc436_3329718844">
             <w:r>
               <w:rPr>
                 <w:rStyle w:val="IndexLink"/>
@@ -1249,7 +1249,7 @@
             </w:tabs>
             <w:rPr/>
           </w:pPr>
-          <w:hyperlink w:anchor="__RefHeading___Toc443_1970309342">
+          <w:hyperlink w:anchor="__RefHeading___Toc438_3329718844">
             <w:r>
               <w:rPr>
                 <w:rStyle w:val="IndexLink"/>
@@ -1314,7 +1314,7 @@
             </w:tabs>
             <w:rPr/>
           </w:pPr>
-          <w:hyperlink w:anchor="__RefHeading___Toc445_1970309342">
+          <w:hyperlink w:anchor="__RefHeading___Toc440_3329718844">
             <w:r>
               <w:rPr>
                 <w:rStyle w:val="IndexLink"/>
@@ -1365,7 +1365,7 @@
             </w:tabs>
             <w:rPr/>
           </w:pPr>
-          <w:hyperlink w:anchor="__RefHeading___Toc447_1970309342">
+          <w:hyperlink w:anchor="__RefHeading___Toc442_3329718844">
             <w:r>
               <w:rPr>
                 <w:rStyle w:val="IndexLink"/>
@@ -1412,7 +1412,7 @@
             </w:tabs>
             <w:rPr/>
           </w:pPr>
-          <w:hyperlink w:anchor="__RefHeading___Toc449_1970309342">
+          <w:hyperlink w:anchor="__RefHeading___Toc444_3329718844">
             <w:r>
               <w:rPr>
                 <w:rStyle w:val="IndexLink"/>
@@ -1463,7 +1463,7 @@
             </w:tabs>
             <w:rPr/>
           </w:pPr>
-          <w:hyperlink w:anchor="__RefHeading___Toc451_1970309342">
+          <w:hyperlink w:anchor="__RefHeading___Toc446_3329718844">
             <w:r>
               <w:rPr>
                 <w:rStyle w:val="IndexLink"/>
@@ -1528,7 +1528,7 @@
             </w:tabs>
             <w:rPr/>
           </w:pPr>
-          <w:hyperlink w:anchor="__RefHeading___Toc453_1970309342">
+          <w:hyperlink w:anchor="__RefHeading___Toc448_3329718844">
             <w:r>
               <w:rPr>
                 <w:rStyle w:val="IndexLink"/>
@@ -1593,7 +1593,7 @@
             </w:tabs>
             <w:rPr/>
           </w:pPr>
-          <w:hyperlink w:anchor="__RefHeading___Toc455_1970309342">
+          <w:hyperlink w:anchor="__RefHeading___Toc450_3329718844">
             <w:r>
               <w:rPr>
                 <w:rStyle w:val="IndexLink"/>
@@ -1630,7 +1630,7 @@
             </w:tabs>
             <w:rPr/>
           </w:pPr>
-          <w:hyperlink w:anchor="__RefHeading___Toc457_1970309342">
+          <w:hyperlink w:anchor="__RefHeading___Toc452_3329718844">
             <w:r>
               <w:rPr>
                 <w:rStyle w:val="IndexLink"/>
@@ -1681,7 +1681,7 @@
             </w:tabs>
             <w:rPr/>
           </w:pPr>
-          <w:hyperlink w:anchor="__RefHeading___Toc459_1970309342">
+          <w:hyperlink w:anchor="__RefHeading___Toc454_3329718844">
             <w:r>
               <w:rPr>
                 <w:rStyle w:val="IndexLink"/>
@@ -1746,7 +1746,7 @@
             </w:tabs>
             <w:rPr/>
           </w:pPr>
-          <w:hyperlink w:anchor="__RefHeading___Toc461_1970309342">
+          <w:hyperlink w:anchor="__RefHeading___Toc456_3329718844">
             <w:r>
               <w:rPr>
                 <w:rStyle w:val="IndexLink"/>
@@ -1811,7 +1811,7 @@
             </w:tabs>
             <w:rPr/>
           </w:pPr>
-          <w:hyperlink w:anchor="__RefHeading___Toc463_1970309342">
+          <w:hyperlink w:anchor="__RefHeading___Toc458_3329718844">
             <w:r>
               <w:rPr>
                 <w:rStyle w:val="IndexLink"/>
@@ -1862,7 +1862,7 @@
             </w:tabs>
             <w:rPr/>
           </w:pPr>
-          <w:hyperlink w:anchor="__RefHeading___Toc465_1970309342">
+          <w:hyperlink w:anchor="__RefHeading___Toc460_3329718844">
             <w:r>
               <w:rPr>
                 <w:rStyle w:val="IndexLink"/>
@@ -1899,7 +1899,7 @@
             </w:tabs>
             <w:rPr/>
           </w:pPr>
-          <w:hyperlink w:anchor="__RefHeading___Toc467_1970309342">
+          <w:hyperlink w:anchor="__RefHeading___Toc462_3329718844">
             <w:r>
               <w:rPr>
                 <w:rStyle w:val="IndexLink"/>
@@ -1936,7 +1936,7 @@
             </w:tabs>
             <w:rPr/>
           </w:pPr>
-          <w:hyperlink w:anchor="__RefHeading___Toc469_1970309342">
+          <w:hyperlink w:anchor="__RefHeading___Toc464_3329718844">
             <w:r>
               <w:rPr>
                 <w:rStyle w:val="IndexLink"/>
@@ -1996,7 +1996,7 @@
         <w:jc w:val="right"/>
         <w:rPr/>
       </w:pPr>
-      <w:bookmarkStart w:id="0" w:name="__RefHeading___Toc409_1970309342"/>
+      <w:bookmarkStart w:id="0" w:name="__RefHeading___Toc404_3329718844"/>
       <w:bookmarkEnd w:id="0"/>
       <w:r>
         <w:rPr>
@@ -2041,7 +2041,7 @@
         <w:jc w:val="right"/>
         <w:rPr/>
       </w:pPr>
-      <w:bookmarkStart w:id="1" w:name="__RefHeading___Toc411_1970309342"/>
+      <w:bookmarkStart w:id="1" w:name="__RefHeading___Toc406_3329718844"/>
       <w:bookmarkEnd w:id="1"/>
       <w:r>
         <w:rPr>
@@ -2709,7 +2709,7 @@
         <w:jc w:val="right"/>
         <w:rPr/>
       </w:pPr>
-      <w:bookmarkStart w:id="2" w:name="__RefHeading___Toc413_1970309342"/>
+      <w:bookmarkStart w:id="2" w:name="__RefHeading___Toc408_3329718844"/>
       <w:bookmarkEnd w:id="2"/>
       <w:r>
         <w:rPr>
@@ -3110,7 +3110,7 @@
         <w:jc w:val="right"/>
         <w:rPr/>
       </w:pPr>
-      <w:bookmarkStart w:id="3" w:name="__RefHeading___Toc415_1970309342"/>
+      <w:bookmarkStart w:id="3" w:name="__RefHeading___Toc410_3329718844"/>
       <w:bookmarkEnd w:id="3"/>
       <w:r>
         <w:rPr>
@@ -3967,7 +3967,7 @@
         <w:jc w:val="right"/>
         <w:rPr/>
       </w:pPr>
-      <w:bookmarkStart w:id="4" w:name="__RefHeading___Toc417_1970309342"/>
+      <w:bookmarkStart w:id="4" w:name="__RefHeading___Toc412_3329718844"/>
       <w:bookmarkEnd w:id="4"/>
       <w:r>
         <w:rPr>
@@ -4765,7 +4765,7 @@
         <w:jc w:val="right"/>
         <w:rPr/>
       </w:pPr>
-      <w:bookmarkStart w:id="5" w:name="__RefHeading___Toc419_1970309342"/>
+      <w:bookmarkStart w:id="5" w:name="__RefHeading___Toc414_3329718844"/>
       <w:bookmarkEnd w:id="5"/>
       <w:r>
         <w:rPr>
@@ -4953,7 +4953,7 @@
         <w:jc w:val="right"/>
         <w:rPr/>
       </w:pPr>
-      <w:bookmarkStart w:id="6" w:name="__RefHeading___Toc421_1970309342"/>
+      <w:bookmarkStart w:id="6" w:name="__RefHeading___Toc416_3329718844"/>
       <w:bookmarkEnd w:id="6"/>
       <w:r>
         <w:rPr>
@@ -5274,7 +5274,7 @@
         <w:jc w:val="right"/>
         <w:rPr/>
       </w:pPr>
-      <w:bookmarkStart w:id="7" w:name="__RefHeading___Toc423_1970309342"/>
+      <w:bookmarkStart w:id="7" w:name="__RefHeading___Toc418_3329718844"/>
       <w:bookmarkEnd w:id="7"/>
       <w:r>
         <w:rPr>
@@ -5519,7 +5519,7 @@
         <w:jc w:val="right"/>
         <w:rPr/>
       </w:pPr>
-      <w:bookmarkStart w:id="8" w:name="__RefHeading___Toc425_1970309342"/>
+      <w:bookmarkStart w:id="8" w:name="__RefHeading___Toc420_3329718844"/>
       <w:bookmarkEnd w:id="8"/>
       <w:r>
         <w:rPr>
@@ -5814,7 +5814,7 @@
         <w:jc w:val="right"/>
         <w:rPr/>
       </w:pPr>
-      <w:bookmarkStart w:id="9" w:name="__RefHeading___Toc427_1970309342"/>
+      <w:bookmarkStart w:id="9" w:name="__RefHeading___Toc422_3329718844"/>
       <w:bookmarkEnd w:id="9"/>
       <w:r>
         <w:rPr>
@@ -5859,7 +5859,7 @@
         <w:jc w:val="right"/>
         <w:rPr/>
       </w:pPr>
-      <w:bookmarkStart w:id="10" w:name="__RefHeading___Toc429_1970309342"/>
+      <w:bookmarkStart w:id="10" w:name="__RefHeading___Toc424_3329718844"/>
       <w:bookmarkEnd w:id="10"/>
       <w:r>
         <w:rPr>
@@ -5904,7 +5904,7 @@
         <w:jc w:val="right"/>
         <w:rPr/>
       </w:pPr>
-      <w:bookmarkStart w:id="11" w:name="__RefHeading___Toc431_1970309342"/>
+      <w:bookmarkStart w:id="11" w:name="__RefHeading___Toc426_3329718844"/>
       <w:bookmarkEnd w:id="11"/>
       <w:r>
         <w:rPr>
@@ -7307,7 +7307,7 @@
         <w:jc w:val="right"/>
         <w:rPr/>
       </w:pPr>
-      <w:bookmarkStart w:id="12" w:name="__RefHeading___Toc433_1970309342"/>
+      <w:bookmarkStart w:id="12" w:name="__RefHeading___Toc428_3329718844"/>
       <w:bookmarkEnd w:id="12"/>
       <w:r>
         <w:rPr>
@@ -8879,7 +8879,7 @@
         <w:jc w:val="right"/>
         <w:rPr/>
       </w:pPr>
-      <w:bookmarkStart w:id="13" w:name="__RefHeading___Toc435_1970309342"/>
+      <w:bookmarkStart w:id="13" w:name="__RefHeading___Toc430_3329718844"/>
       <w:bookmarkEnd w:id="13"/>
       <w:r>
         <w:rPr>
@@ -9975,7 +9975,7 @@
         <w:jc w:val="right"/>
         <w:rPr/>
       </w:pPr>
-      <w:bookmarkStart w:id="14" w:name="__RefHeading___Toc437_1970309342"/>
+      <w:bookmarkStart w:id="14" w:name="__RefHeading___Toc432_3329718844"/>
       <w:bookmarkEnd w:id="14"/>
       <w:r>
         <w:rPr>
@@ -10528,7 +10528,7 @@
         <w:jc w:val="right"/>
         <w:rPr/>
       </w:pPr>
-      <w:bookmarkStart w:id="15" w:name="__RefHeading___Toc439_1970309342"/>
+      <w:bookmarkStart w:id="15" w:name="__RefHeading___Toc434_3329718844"/>
       <w:bookmarkEnd w:id="15"/>
       <w:r>
         <w:rPr>
@@ -11421,7 +11421,7 @@
         <w:jc w:val="right"/>
         <w:rPr/>
       </w:pPr>
-      <w:bookmarkStart w:id="16" w:name="__RefHeading___Toc441_1970309342"/>
+      <w:bookmarkStart w:id="16" w:name="__RefHeading___Toc436_3329718844"/>
       <w:bookmarkEnd w:id="16"/>
       <w:r>
         <w:rPr>
@@ -11538,7 +11538,7 @@
         <w:jc w:val="right"/>
         <w:rPr/>
       </w:pPr>
-      <w:bookmarkStart w:id="17" w:name="__RefHeading___Toc443_1970309342"/>
+      <w:bookmarkStart w:id="17" w:name="__RefHeading___Toc438_3329718844"/>
       <w:bookmarkEnd w:id="17"/>
       <w:r>
         <w:rPr>
@@ -13133,7 +13133,7 @@
         <w:jc w:val="right"/>
         <w:rPr/>
       </w:pPr>
-      <w:bookmarkStart w:id="18" w:name="__RefHeading___Toc445_1970309342"/>
+      <w:bookmarkStart w:id="18" w:name="__RefHeading___Toc440_3329718844"/>
       <w:bookmarkEnd w:id="18"/>
       <w:r>
         <w:rPr>
@@ -15043,7 +15043,7 @@
         <w:jc w:val="right"/>
         <w:rPr/>
       </w:pPr>
-      <w:bookmarkStart w:id="19" w:name="__RefHeading___Toc447_1970309342"/>
+      <w:bookmarkStart w:id="19" w:name="__RefHeading___Toc442_3329718844"/>
       <w:bookmarkEnd w:id="19"/>
       <w:r>
         <w:rPr>
@@ -15780,7 +15780,7 @@
         <w:jc w:val="right"/>
         <w:rPr/>
       </w:pPr>
-      <w:bookmarkStart w:id="20" w:name="__RefHeading___Toc449_1970309342"/>
+      <w:bookmarkStart w:id="20" w:name="__RefHeading___Toc444_3329718844"/>
       <w:bookmarkEnd w:id="20"/>
       <w:r>
         <w:rPr>
@@ -16537,7 +16537,7 @@
         <w:jc w:val="right"/>
         <w:rPr/>
       </w:pPr>
-      <w:bookmarkStart w:id="21" w:name="__RefHeading___Toc451_1970309342"/>
+      <w:bookmarkStart w:id="21" w:name="__RefHeading___Toc446_3329718844"/>
       <w:bookmarkEnd w:id="21"/>
       <w:r>
         <w:rPr>
@@ -17708,7 +17708,7 @@
         <w:jc w:val="right"/>
         <w:rPr/>
       </w:pPr>
-      <w:bookmarkStart w:id="22" w:name="__RefHeading___Toc453_1970309342"/>
+      <w:bookmarkStart w:id="22" w:name="__RefHeading___Toc448_3329718844"/>
       <w:bookmarkEnd w:id="22"/>
       <w:r>
         <w:rPr>
@@ -17801,7 +17801,7 @@
         <w:jc w:val="right"/>
         <w:rPr/>
       </w:pPr>
-      <w:bookmarkStart w:id="23" w:name="__RefHeading___Toc455_1970309342"/>
+      <w:bookmarkStart w:id="23" w:name="__RefHeading___Toc450_3329718844"/>
       <w:bookmarkEnd w:id="23"/>
       <w:r>
         <w:rPr>
@@ -18733,7 +18733,7 @@
         <w:jc w:val="right"/>
         <w:rPr/>
       </w:pPr>
-      <w:bookmarkStart w:id="24" w:name="__RefHeading___Toc457_1970309342"/>
+      <w:bookmarkStart w:id="24" w:name="__RefHeading___Toc452_3329718844"/>
       <w:bookmarkEnd w:id="24"/>
       <w:r>
         <w:rPr>
@@ -19525,7 +19525,7 @@
         <w:jc w:val="right"/>
         <w:rPr/>
       </w:pPr>
-      <w:bookmarkStart w:id="25" w:name="__RefHeading___Toc459_1970309342"/>
+      <w:bookmarkStart w:id="25" w:name="__RefHeading___Toc454_3329718844"/>
       <w:bookmarkEnd w:id="25"/>
       <w:r>
         <w:rPr>
@@ -20713,7 +20713,7 @@
         <w:jc w:val="right"/>
         <w:rPr/>
       </w:pPr>
-      <w:bookmarkStart w:id="26" w:name="__RefHeading___Toc461_1970309342"/>
+      <w:bookmarkStart w:id="26" w:name="__RefHeading___Toc456_3329718844"/>
       <w:bookmarkEnd w:id="26"/>
       <w:r>
         <w:rPr>
@@ -21877,7 +21877,7 @@
         <w:jc w:val="right"/>
         <w:rPr/>
       </w:pPr>
-      <w:bookmarkStart w:id="27" w:name="__RefHeading___Toc463_1970309342"/>
+      <w:bookmarkStart w:id="27" w:name="__RefHeading___Toc458_3329718844"/>
       <w:bookmarkEnd w:id="27"/>
       <w:r>
         <w:rPr>
@@ -25207,7 +25207,7 @@
         <w:jc w:val="right"/>
         <w:rPr/>
       </w:pPr>
-      <w:bookmarkStart w:id="28" w:name="__RefHeading___Toc465_1970309342"/>
+      <w:bookmarkStart w:id="28" w:name="__RefHeading___Toc460_3329718844"/>
       <w:bookmarkEnd w:id="28"/>
       <w:r>
         <w:rPr>
@@ -32148,7 +32148,7 @@
         <w:jc w:val="right"/>
         <w:rPr/>
       </w:pPr>
-      <w:bookmarkStart w:id="29" w:name="__RefHeading___Toc467_1970309342"/>
+      <w:bookmarkStart w:id="29" w:name="__RefHeading___Toc462_3329718844"/>
       <w:bookmarkEnd w:id="29"/>
       <w:r>
         <w:rPr>
@@ -34172,7 +34172,7 @@
         <w:jc w:val="right"/>
         <w:rPr/>
       </w:pPr>
-      <w:bookmarkStart w:id="30" w:name="__RefHeading___Toc469_1970309342"/>
+      <w:bookmarkStart w:id="30" w:name="__RefHeading___Toc464_3329718844"/>
       <w:bookmarkEnd w:id="30"/>
       <w:r>
         <w:rPr>
@@ -34453,120 +34453,7 @@
           <w:szCs w:val="24"/>
           <w:rtl w:val="true"/>
         </w:rPr>
-        <w:t xml:space="preserve">. </w:t>
-      </w:r>
-      <w:r>
-        <w:rPr>
-          <w:rFonts w:ascii="David" w:hAnsi="David" w:eastAsia="David"/>
-          <w:i w:val="false"/>
-          <w:i w:val="false"/>
-          <w:iCs w:val="false"/>
-          <w:sz w:val="24"/>
-          <w:sz w:val="24"/>
-          <w:szCs w:val="24"/>
-          <w:rtl w:val="true"/>
-        </w:rPr>
-        <w:t>אוחזר ב</w:t>
-      </w:r>
-      <w:r>
-        <w:rPr>
-          <w:rFonts w:eastAsia="David" w:cs="David"/>
-          <w:i w:val="false"/>
-          <w:iCs w:val="false"/>
-          <w:sz w:val="24"/>
-          <w:szCs w:val="24"/>
-          <w:rtl w:val="true"/>
-        </w:rPr>
-        <w:t>-</w:t>
-      </w:r>
-      <w:r>
-        <w:rPr>
-          <w:rFonts w:eastAsia="David" w:cs="David"/>
-          <w:i w:val="false"/>
-          <w:iCs w:val="false"/>
-          <w:sz w:val="24"/>
-          <w:szCs w:val="24"/>
-        </w:rPr>
-        <w:t>16</w:t>
-      </w:r>
-      <w:r>
-        <w:rPr>
-          <w:rFonts w:eastAsia="David" w:cs="David"/>
-          <w:i w:val="false"/>
-          <w:iCs w:val="false"/>
-          <w:sz w:val="24"/>
-          <w:szCs w:val="24"/>
-          <w:rtl w:val="true"/>
-        </w:rPr>
-        <w:t xml:space="preserve"> </w:t>
-      </w:r>
-      <w:r>
-        <w:rPr>
-          <w:rFonts w:ascii="David" w:hAnsi="David" w:eastAsia="David"/>
-          <w:i w:val="false"/>
-          <w:i w:val="false"/>
-          <w:iCs w:val="false"/>
-          <w:sz w:val="24"/>
-          <w:sz w:val="24"/>
-          <w:szCs w:val="24"/>
-          <w:rtl w:val="true"/>
-        </w:rPr>
-        <w:t>בספטמבר</w:t>
-      </w:r>
-      <w:r>
-        <w:rPr>
-          <w:rFonts w:eastAsia="David" w:cs="David"/>
-          <w:i w:val="false"/>
-          <w:iCs w:val="false"/>
-          <w:sz w:val="24"/>
-          <w:szCs w:val="24"/>
-          <w:rtl w:val="true"/>
-        </w:rPr>
-        <w:t xml:space="preserve">, </w:t>
-      </w:r>
-      <w:r>
-        <w:rPr>
-          <w:rFonts w:eastAsia="David" w:cs="David"/>
-          <w:i w:val="false"/>
-          <w:iCs w:val="false"/>
-          <w:sz w:val="24"/>
-          <w:szCs w:val="24"/>
-        </w:rPr>
-        <w:t>2026</w:t>
-      </w:r>
-      <w:r>
-        <w:rPr>
-          <w:rFonts w:eastAsia="David" w:cs="David"/>
-          <w:i w:val="false"/>
-          <w:iCs w:val="false"/>
-          <w:sz w:val="24"/>
-          <w:szCs w:val="24"/>
-          <w:rtl w:val="true"/>
-        </w:rPr>
-        <w:t xml:space="preserve">, </w:t>
-      </w:r>
-      <w:r>
-        <w:rPr>
-          <w:rFonts w:ascii="David" w:hAnsi="David" w:eastAsia="David"/>
-          <w:i w:val="false"/>
-          <w:i w:val="false"/>
-          <w:iCs w:val="false"/>
-          <w:sz w:val="24"/>
-          <w:sz w:val="24"/>
-          <w:szCs w:val="24"/>
-          <w:rtl w:val="true"/>
-        </w:rPr>
-        <w:t xml:space="preserve">מתוך </w:t>
-      </w:r>
-      <w:r>
-        <w:rPr>
-          <w:rFonts w:eastAsia="Times New Roman" w:cs="Times New Roman" w:ascii="Times New Roman" w:hAnsi="Times New Roman"/>
-          <w:i w:val="false"/>
-          <w:iCs w:val="false"/>
-          <w:sz w:val="24"/>
-          <w:szCs w:val="24"/>
-        </w:rPr>
-        <w:t>https://www.dyellin.ac.il/sites/default/files/journals/journaleducation/edtion14/autistics_parents_education_system.pdf</w:t>
+        <w:t>.</w:t>
       </w:r>
     </w:p>
     <w:p>
@@ -34999,131 +34886,7 @@
           <w:szCs w:val="24"/>
           <w:rtl w:val="true"/>
         </w:rPr>
-        <w:t xml:space="preserve">. </w:t>
-      </w:r>
-      <w:r>
-        <w:rPr>
-          <w:rFonts w:ascii="David" w:hAnsi="David" w:eastAsia="David"/>
-          <w:i w:val="false"/>
-          <w:i w:val="false"/>
-          <w:iCs w:val="false"/>
-          <w:sz w:val="24"/>
-          <w:sz w:val="24"/>
-          <w:szCs w:val="24"/>
-          <w:rtl w:val="true"/>
-        </w:rPr>
-        <w:t>אוחזר ב</w:t>
-      </w:r>
-      <w:r>
-        <w:rPr>
-          <w:rFonts w:eastAsia="David" w:cs="David"/>
-          <w:i w:val="false"/>
-          <w:iCs w:val="false"/>
-          <w:sz w:val="24"/>
-          <w:szCs w:val="24"/>
-          <w:rtl w:val="true"/>
-        </w:rPr>
-        <w:t>-</w:t>
-      </w:r>
-      <w:r>
-        <w:rPr>
-          <w:rFonts w:eastAsia="David" w:cs="David"/>
-          <w:i w:val="false"/>
-          <w:iCs w:val="false"/>
-          <w:sz w:val="24"/>
-          <w:szCs w:val="24"/>
-        </w:rPr>
-        <w:t>16</w:t>
-      </w:r>
-      <w:r>
-        <w:rPr>
-          <w:rFonts w:eastAsia="David" w:cs="David"/>
-          <w:i w:val="false"/>
-          <w:iCs w:val="false"/>
-          <w:sz w:val="24"/>
-          <w:szCs w:val="24"/>
-          <w:rtl w:val="true"/>
-        </w:rPr>
-        <w:t xml:space="preserve"> </w:t>
-      </w:r>
-      <w:r>
-        <w:rPr>
-          <w:rFonts w:ascii="David" w:hAnsi="David" w:eastAsia="David"/>
-          <w:i w:val="false"/>
-          <w:i w:val="false"/>
-          <w:iCs w:val="false"/>
-          <w:sz w:val="24"/>
-          <w:sz w:val="24"/>
-          <w:szCs w:val="24"/>
-          <w:rtl w:val="true"/>
-        </w:rPr>
-        <w:t>בספטמבר</w:t>
-      </w:r>
-      <w:r>
-        <w:rPr>
-          <w:rFonts w:eastAsia="David" w:cs="David"/>
-          <w:i w:val="false"/>
-          <w:iCs w:val="false"/>
-          <w:sz w:val="24"/>
-          <w:szCs w:val="24"/>
-          <w:rtl w:val="true"/>
-        </w:rPr>
-        <w:t xml:space="preserve">, </w:t>
-      </w:r>
-      <w:r>
-        <w:rPr>
-          <w:rFonts w:eastAsia="David" w:cs="David"/>
-          <w:i w:val="false"/>
-          <w:iCs w:val="false"/>
-          <w:sz w:val="24"/>
-          <w:szCs w:val="24"/>
-        </w:rPr>
-        <w:t>2026</w:t>
-      </w:r>
-      <w:r>
-        <w:rPr>
-          <w:rFonts w:eastAsia="David" w:cs="David"/>
-          <w:i w:val="false"/>
-          <w:iCs w:val="false"/>
-          <w:sz w:val="24"/>
-          <w:szCs w:val="24"/>
-          <w:rtl w:val="true"/>
-        </w:rPr>
-        <w:t xml:space="preserve">, </w:t>
-      </w:r>
-      <w:r>
-        <w:rPr>
-          <w:rFonts w:ascii="David" w:hAnsi="David" w:eastAsia="David"/>
-          <w:i w:val="false"/>
-          <w:i w:val="false"/>
-          <w:iCs w:val="false"/>
-          <w:sz w:val="24"/>
-          <w:sz w:val="24"/>
-          <w:szCs w:val="24"/>
-          <w:rtl w:val="true"/>
-        </w:rPr>
-        <w:t xml:space="preserve">מתוך </w:t>
-      </w:r>
-      <w:r>
-        <w:rPr>
-          <w:rFonts w:eastAsia="Times New Roman" w:cs="Times New Roman" w:ascii="Times New Roman" w:hAnsi="Times New Roman"/>
-          <w:i w:val="false"/>
-          <w:iCs w:val="false"/>
-          <w:sz w:val="24"/>
-          <w:szCs w:val="24"/>
-        </w:rPr>
-        <w:t>https://www.l-w.ac.il/articles/researchers-special-education/gilyonot-special-education/special-education-issue-4</w:t>
-      </w:r>
-      <w:r>
-        <w:rPr>
-          <w:rFonts w:eastAsia="Times New Roman" w:cs="Times New Roman" w:ascii="Times New Roman" w:hAnsi="Times New Roman"/>
-          <w:i w:val="false"/>
-          <w:iCs w:val="false"/>
-          <w:sz w:val="24"/>
-          <w:szCs w:val="24"/>
-          <w:rtl w:val="true"/>
-        </w:rPr>
-        <w:t>/</w:t>
+        <w:t>.</w:t>
       </w:r>
     </w:p>
     <w:p>
@@ -35611,120 +35374,7 @@
           <w:szCs w:val="24"/>
           <w:rtl w:val="true"/>
         </w:rPr>
-        <w:t xml:space="preserve">. </w:t>
-      </w:r>
-      <w:r>
-        <w:rPr>
-          <w:rFonts w:ascii="David" w:hAnsi="David" w:eastAsia="David"/>
-          <w:i w:val="false"/>
-          <w:i w:val="false"/>
-          <w:iCs w:val="false"/>
-          <w:sz w:val="24"/>
-          <w:sz w:val="24"/>
-          <w:szCs w:val="24"/>
-          <w:rtl w:val="true"/>
-        </w:rPr>
-        <w:t>אוחזר ב</w:t>
-      </w:r>
-      <w:r>
-        <w:rPr>
-          <w:rFonts w:eastAsia="David" w:cs="David"/>
-          <w:i w:val="false"/>
-          <w:iCs w:val="false"/>
-          <w:sz w:val="24"/>
-          <w:szCs w:val="24"/>
-          <w:rtl w:val="true"/>
-        </w:rPr>
-        <w:t>-</w:t>
-      </w:r>
-      <w:r>
-        <w:rPr>
-          <w:rFonts w:eastAsia="David" w:cs="David"/>
-          <w:i w:val="false"/>
-          <w:iCs w:val="false"/>
-          <w:sz w:val="24"/>
-          <w:szCs w:val="24"/>
-        </w:rPr>
-        <w:t>16</w:t>
-      </w:r>
-      <w:r>
-        <w:rPr>
-          <w:rFonts w:eastAsia="David" w:cs="David"/>
-          <w:i w:val="false"/>
-          <w:iCs w:val="false"/>
-          <w:sz w:val="24"/>
-          <w:szCs w:val="24"/>
-          <w:rtl w:val="true"/>
-        </w:rPr>
-        <w:t xml:space="preserve"> </w:t>
-      </w:r>
-      <w:r>
-        <w:rPr>
-          <w:rFonts w:ascii="David" w:hAnsi="David" w:eastAsia="David"/>
-          <w:i w:val="false"/>
-          <w:i w:val="false"/>
-          <w:iCs w:val="false"/>
-          <w:sz w:val="24"/>
-          <w:sz w:val="24"/>
-          <w:szCs w:val="24"/>
-          <w:rtl w:val="true"/>
-        </w:rPr>
-        <w:t>בספטמבר</w:t>
-      </w:r>
-      <w:r>
-        <w:rPr>
-          <w:rFonts w:eastAsia="David" w:cs="David"/>
-          <w:i w:val="false"/>
-          <w:iCs w:val="false"/>
-          <w:sz w:val="24"/>
-          <w:szCs w:val="24"/>
-          <w:rtl w:val="true"/>
-        </w:rPr>
-        <w:t xml:space="preserve">, </w:t>
-      </w:r>
-      <w:r>
-        <w:rPr>
-          <w:rFonts w:eastAsia="David" w:cs="David"/>
-          <w:i w:val="false"/>
-          <w:iCs w:val="false"/>
-          <w:sz w:val="24"/>
-          <w:szCs w:val="24"/>
-        </w:rPr>
-        <w:t>2026</w:t>
-      </w:r>
-      <w:r>
-        <w:rPr>
-          <w:rFonts w:eastAsia="David" w:cs="David"/>
-          <w:i w:val="false"/>
-          <w:iCs w:val="false"/>
-          <w:sz w:val="24"/>
-          <w:szCs w:val="24"/>
-          <w:rtl w:val="true"/>
-        </w:rPr>
-        <w:t xml:space="preserve">, </w:t>
-      </w:r>
-      <w:r>
-        <w:rPr>
-          <w:rFonts w:ascii="David" w:hAnsi="David" w:eastAsia="David"/>
-          <w:i w:val="false"/>
-          <w:i w:val="false"/>
-          <w:iCs w:val="false"/>
-          <w:sz w:val="24"/>
-          <w:sz w:val="24"/>
-          <w:szCs w:val="24"/>
-          <w:rtl w:val="true"/>
-        </w:rPr>
-        <w:t xml:space="preserve">מתוך </w:t>
-      </w:r>
-      <w:r>
-        <w:rPr>
-          <w:rFonts w:eastAsia="Times New Roman" w:cs="Times New Roman" w:ascii="Times New Roman" w:hAnsi="Times New Roman"/>
-          <w:i w:val="false"/>
-          <w:iCs w:val="false"/>
-          <w:sz w:val="24"/>
-          <w:szCs w:val="24"/>
-        </w:rPr>
-        <w:t>https://www.l-w.ac.il/wp-content/uploads/2025/02/Issue24_Article1_gil_harah.pdf</w:t>
+        <w:t>.</w:t>
       </w:r>
     </w:p>
     <w:p>
@@ -36251,131 +35901,7 @@
           <w:szCs w:val="24"/>
           <w:rtl w:val="true"/>
         </w:rPr>
-        <w:t xml:space="preserve">. </w:t>
-      </w:r>
-      <w:r>
-        <w:rPr>
-          <w:rFonts w:ascii="David" w:hAnsi="David" w:eastAsia="David"/>
-          <w:i w:val="false"/>
-          <w:i w:val="false"/>
-          <w:iCs w:val="false"/>
-          <w:sz w:val="24"/>
-          <w:sz w:val="24"/>
-          <w:szCs w:val="24"/>
-          <w:rtl w:val="true"/>
-        </w:rPr>
-        <w:t>אוחזר ב</w:t>
-      </w:r>
-      <w:r>
-        <w:rPr>
-          <w:rFonts w:eastAsia="David" w:cs="David"/>
-          <w:i w:val="false"/>
-          <w:iCs w:val="false"/>
-          <w:sz w:val="24"/>
-          <w:szCs w:val="24"/>
-          <w:rtl w:val="true"/>
-        </w:rPr>
-        <w:t>-</w:t>
-      </w:r>
-      <w:r>
-        <w:rPr>
-          <w:rFonts w:eastAsia="David" w:cs="David"/>
-          <w:i w:val="false"/>
-          <w:iCs w:val="false"/>
-          <w:sz w:val="24"/>
-          <w:szCs w:val="24"/>
-        </w:rPr>
-        <w:t>16</w:t>
-      </w:r>
-      <w:r>
-        <w:rPr>
-          <w:rFonts w:eastAsia="David" w:cs="David"/>
-          <w:i w:val="false"/>
-          <w:iCs w:val="false"/>
-          <w:sz w:val="24"/>
-          <w:szCs w:val="24"/>
-          <w:rtl w:val="true"/>
-        </w:rPr>
-        <w:t xml:space="preserve"> </w:t>
-      </w:r>
-      <w:r>
-        <w:rPr>
-          <w:rFonts w:ascii="David" w:hAnsi="David" w:eastAsia="David"/>
-          <w:i w:val="false"/>
-          <w:i w:val="false"/>
-          <w:iCs w:val="false"/>
-          <w:sz w:val="24"/>
-          <w:sz w:val="24"/>
-          <w:szCs w:val="24"/>
-          <w:rtl w:val="true"/>
-        </w:rPr>
-        <w:t>בספטמבר</w:t>
-      </w:r>
-      <w:r>
-        <w:rPr>
-          <w:rFonts w:eastAsia="David" w:cs="David"/>
-          <w:i w:val="false"/>
-          <w:iCs w:val="false"/>
-          <w:sz w:val="24"/>
-          <w:szCs w:val="24"/>
-          <w:rtl w:val="true"/>
-        </w:rPr>
-        <w:t xml:space="preserve">, </w:t>
-      </w:r>
-      <w:r>
-        <w:rPr>
-          <w:rFonts w:eastAsia="David" w:cs="David"/>
-          <w:i w:val="false"/>
-          <w:iCs w:val="false"/>
-          <w:sz w:val="24"/>
-          <w:szCs w:val="24"/>
-        </w:rPr>
-        <w:t>2026</w:t>
-      </w:r>
-      <w:r>
-        <w:rPr>
-          <w:rFonts w:eastAsia="David" w:cs="David"/>
-          <w:i w:val="false"/>
-          <w:iCs w:val="false"/>
-          <w:sz w:val="24"/>
-          <w:szCs w:val="24"/>
-          <w:rtl w:val="true"/>
-        </w:rPr>
-        <w:t xml:space="preserve">, </w:t>
-      </w:r>
-      <w:r>
-        <w:rPr>
-          <w:rFonts w:ascii="David" w:hAnsi="David" w:eastAsia="David"/>
-          <w:i w:val="false"/>
-          <w:i w:val="false"/>
-          <w:iCs w:val="false"/>
-          <w:sz w:val="24"/>
-          <w:sz w:val="24"/>
-          <w:szCs w:val="24"/>
-          <w:rtl w:val="true"/>
-        </w:rPr>
-        <w:t xml:space="preserve">מתוך </w:t>
-      </w:r>
-      <w:r>
-        <w:rPr>
-          <w:rFonts w:eastAsia="Times New Roman" w:cs="Times New Roman" w:ascii="Times New Roman" w:hAnsi="Times New Roman"/>
-          <w:i w:val="false"/>
-          <w:iCs w:val="false"/>
-          <w:sz w:val="24"/>
-          <w:szCs w:val="24"/>
-        </w:rPr>
-        <w:t>https://www.l-w.ac.il/articles/researchers-early-childhood/gilyonot</w:t>
-      </w:r>
-      <w:r>
-        <w:rPr>
-          <w:rFonts w:eastAsia="Times New Roman" w:cs="Times New Roman" w:ascii="Times New Roman" w:hAnsi="Times New Roman"/>
-          <w:i w:val="false"/>
-          <w:iCs w:val="false"/>
-          <w:sz w:val="24"/>
-          <w:szCs w:val="24"/>
-          <w:rtl w:val="true"/>
-        </w:rPr>
-        <w:t>/</w:t>
+        <w:t>.</w:t>
       </w:r>
     </w:p>
     <w:p>
@@ -38682,131 +38208,7 @@
           <w:szCs w:val="24"/>
           <w:rtl w:val="true"/>
         </w:rPr>
-        <w:t xml:space="preserve">. </w:t>
-      </w:r>
-      <w:r>
-        <w:rPr>
-          <w:rFonts w:ascii="David" w:hAnsi="David" w:eastAsia="David"/>
-          <w:i w:val="false"/>
-          <w:i w:val="false"/>
-          <w:iCs w:val="false"/>
-          <w:sz w:val="24"/>
-          <w:sz w:val="24"/>
-          <w:szCs w:val="24"/>
-          <w:rtl w:val="true"/>
-        </w:rPr>
-        <w:t>אוחזר ב</w:t>
-      </w:r>
-      <w:r>
-        <w:rPr>
-          <w:rFonts w:eastAsia="David" w:cs="David"/>
-          <w:i w:val="false"/>
-          <w:iCs w:val="false"/>
-          <w:sz w:val="24"/>
-          <w:szCs w:val="24"/>
-          <w:rtl w:val="true"/>
-        </w:rPr>
-        <w:t>-</w:t>
-      </w:r>
-      <w:r>
-        <w:rPr>
-          <w:rFonts w:eastAsia="David" w:cs="David"/>
-          <w:i w:val="false"/>
-          <w:iCs w:val="false"/>
-          <w:sz w:val="24"/>
-          <w:szCs w:val="24"/>
-        </w:rPr>
-        <w:t>16</w:t>
-      </w:r>
-      <w:r>
-        <w:rPr>
-          <w:rFonts w:eastAsia="David" w:cs="David"/>
-          <w:i w:val="false"/>
-          <w:iCs w:val="false"/>
-          <w:sz w:val="24"/>
-          <w:szCs w:val="24"/>
-          <w:rtl w:val="true"/>
-        </w:rPr>
-        <w:t xml:space="preserve"> </w:t>
-      </w:r>
-      <w:r>
-        <w:rPr>
-          <w:rFonts w:ascii="David" w:hAnsi="David" w:eastAsia="David"/>
-          <w:i w:val="false"/>
-          <w:i w:val="false"/>
-          <w:iCs w:val="false"/>
-          <w:sz w:val="24"/>
-          <w:sz w:val="24"/>
-          <w:szCs w:val="24"/>
-          <w:rtl w:val="true"/>
-        </w:rPr>
-        <w:t>בספטמבר</w:t>
-      </w:r>
-      <w:r>
-        <w:rPr>
-          <w:rFonts w:eastAsia="David" w:cs="David"/>
-          <w:i w:val="false"/>
-          <w:iCs w:val="false"/>
-          <w:sz w:val="24"/>
-          <w:szCs w:val="24"/>
-          <w:rtl w:val="true"/>
-        </w:rPr>
-        <w:t xml:space="preserve">, </w:t>
-      </w:r>
-      <w:r>
-        <w:rPr>
-          <w:rFonts w:eastAsia="David" w:cs="David"/>
-          <w:i w:val="false"/>
-          <w:iCs w:val="false"/>
-          <w:sz w:val="24"/>
-          <w:szCs w:val="24"/>
-        </w:rPr>
-        <w:t>2026</w:t>
-      </w:r>
-      <w:r>
-        <w:rPr>
-          <w:rFonts w:eastAsia="David" w:cs="David"/>
-          <w:i w:val="false"/>
-          <w:iCs w:val="false"/>
-          <w:sz w:val="24"/>
-          <w:szCs w:val="24"/>
-          <w:rtl w:val="true"/>
-        </w:rPr>
-        <w:t xml:space="preserve">, </w:t>
-      </w:r>
-      <w:r>
-        <w:rPr>
-          <w:rFonts w:ascii="David" w:hAnsi="David" w:eastAsia="David"/>
-          <w:i w:val="false"/>
-          <w:i w:val="false"/>
-          <w:iCs w:val="false"/>
-          <w:sz w:val="24"/>
-          <w:sz w:val="24"/>
-          <w:szCs w:val="24"/>
-          <w:rtl w:val="true"/>
-        </w:rPr>
-        <w:t xml:space="preserve">מתוך </w:t>
-      </w:r>
-      <w:r>
-        <w:rPr>
-          <w:rFonts w:eastAsia="Times New Roman" w:cs="Times New Roman" w:ascii="Times New Roman" w:hAnsi="Times New Roman"/>
-          <w:i w:val="false"/>
-          <w:iCs w:val="false"/>
-          <w:sz w:val="24"/>
-          <w:szCs w:val="24"/>
-        </w:rPr>
-        <w:t>https://www.l-w.ac.il/articles/researchers-early-childhood/gilyonot/issue-22</w:t>
-      </w:r>
-      <w:r>
-        <w:rPr>
-          <w:rFonts w:eastAsia="Times New Roman" w:cs="Times New Roman" w:ascii="Times New Roman" w:hAnsi="Times New Roman"/>
-          <w:i w:val="false"/>
-          <w:iCs w:val="false"/>
-          <w:sz w:val="24"/>
-          <w:szCs w:val="24"/>
-          <w:rtl w:val="true"/>
-        </w:rPr>
-        <w:t>/</w:t>
+        <w:t>.</w:t>
       </w:r>
     </w:p>
     <w:p>

</xml_diff>

<commit_message>
Correct author details after verifying four Hebrew articles against originals
Co-Authored-By: Claude Fable 5.1 <noreply@anthropic.com>
Claude-Session: https://claude.ai/code/session_01AGMAnS6o1o3m246uMW2ium
</commit_message>
<xml_diff>
--- a/seminar/סמינריון - תפקודים ניהוליים - הייכל מרווה.docx
+++ b/seminar/סמינריון - תפקודים ניהוליים - הייכל מרווה.docx
@@ -838,7 +838,7 @@
               <w:sz w:val="24"/>
               <w:szCs w:val="24"/>
             </w:rPr>
-            <w:t>9</w:t>
+            <w:t>10</w:t>
           </w:r>
         </w:p>
         <w:p>
@@ -874,7 +874,7 @@
               <w:sz w:val="24"/>
               <w:szCs w:val="24"/>
             </w:rPr>
-            <w:t>9</w:t>
+            <w:t>10</w:t>
           </w:r>
         </w:p>
         <w:p>
@@ -910,7 +910,7 @@
               <w:sz w:val="24"/>
               <w:szCs w:val="24"/>
             </w:rPr>
-            <w:t>10</w:t>
+            <w:t>11</w:t>
           </w:r>
         </w:p>
         <w:p>
@@ -1234,7 +1234,7 @@
               <w:sz w:val="24"/>
               <w:szCs w:val="24"/>
             </w:rPr>
-            <w:t>16</w:t>
+            <w:t>17</w:t>
           </w:r>
         </w:p>
         <w:p>
@@ -2041,7 +2041,7 @@
           <w:szCs w:val="24"/>
           <w:rtl/>
         </w:rPr>
-        <w:t xml:space="preserve">, שבו ציון גבוה מציין קושי, לבין ביצוע במטלה גרפו-מוטורית. כלומר, ככל שהילד התקשה יותר בתפקודים ניהוליים, כך ביצועיו במטלת הכתיבה המוקדמת היו נמוכים יותר (טורגמן וגלבוע, 2020). החוקרות השתמשו גם במבחן מיון קלפים </w:t>
+        <w:t xml:space="preserve">, שבו ציון גבוה מציין קושי, לבין ביצוע במטלה גרפו-מוטורית. כלומר, ככל שהילד התקשה יותר בתפקודים ניהוליים, כך ביצועיו במטלת הכתיבה המוקדמת היו נמוכים יותר (תורג'מן וגלבוע, 2020). מבין סולמות השאלון, סולם עיכוב התגובה נמצא בקשרים החזקים ביותר לביצוע, ואילו זיכרון העבודה נקשר רק למטלת כתיבת השם. החוקרות השתמשו גם במבחן מיון קלפים </w:t>
       </w:r>
       <w:r>
         <w:rPr>
@@ -2519,7 +2519,7 @@
           <w:szCs w:val="24"/>
           <w:rtl/>
         </w:rPr>
-        <w:t xml:space="preserve">, שאלון שממלאים הורים או גננות והוא מודד תפקודים ניהוליים כפי שהם מופיעים בשגרה. הכלי הזה שימש במחקר הישראלי על ילדי גן בהתפתחות תקינה (טורגמן וגלבוע, 2020), במחקר האורך האיטלקי </w:t>
+        <w:t xml:space="preserve">, שאלון שממלאים הורים או גננות והוא מודד תפקודים ניהוליים כפי שהם מופיעים בשגרה. הכלי הזה שימש במחקר הישראלי על ילדי גן בהתפתחות תקינה (תורג'מן וגלבוע, 2020), במחקר האורך האיטלקי </w:t>
       </w:r>
       <w:r>
         <w:rPr>
@@ -2696,24 +2696,24 @@
           <w:szCs w:val="24"/>
           <w:rtl/>
         </w:rPr>
-        <w:t xml:space="preserve">המחקר על ההורים מספק גם עדות עקיפה לחשיבות הצוות הטיפולי בגן. במחקר שבחן את עמדות ההורים לפני ואחרי תוכנית שנתית לקידום מיומנויות עצמאות בגני חינוך מיוחד, ובהם גן תקשורת, עלו עמדות ההורים כלפי יכולת ילדיהם בכל חמש עשרה המיומנויות שנמדדו (הס ואחרים, 2024). מיומנויות עצמאות כמו התלבשות, סידור חפצים ומעבר בין פעילויות הן, במונחי העבודה הנוכחית, תפקודים ניהוליים בלבוש יומיומי: הן דורשות תכנון, רצף ועכבה. התוכנית שנבדקה הופעלה על ידי צוות הגן, והממצא מראה שהורים מזהים שינוי כשהצוות עובד על יעדים מוגדרים.</w:t>
-      </w:r>
-    </w:p>
-    <w:p>
-      <w:pPr>
-        <w:bidi/>
-        <w:spacing w:after="120" w:line="360" w:lineRule="auto"/>
-        <w:ind w:firstLine="567"/>
-        <w:jc w:val="both"/>
-      </w:pPr>
-      <w:r>
-        <w:rPr>
-          <w:rFonts w:ascii="David" w:cs="David" w:eastAsia="David" w:hAnsi="David"/>
-          <w:sz w:val="24"/>
-          <w:szCs w:val="24"/>
-          <w:rtl/>
-        </w:rPr>
-        <w:t xml:space="preserve">שני מחקרים ישראליים נוספים מוסיפים ממד של הקשר משפחתי שלא ניתן להתעלם ממנו בשנים האחרונות. מחקר שבחן מסוגלות הורית של הורים לילדים עם אוטיזם בעתות שגרה ומלחמה מצא שתפקוד רפלקטיבי של ההורה, כלומר יכולתו לחשוב על המצבים הנפשיים של ילדו, ניבא את המסוגלות ההורית גם בשגרה וגם במלחמה, ואילו גמישות פסיכולוגית ניבאה אותה רק בשגרה (אלמוג ואחרים, 2024). מחקר איכותני שראיין שנים עשר הורים לילדים בני שנתיים עד שש עם אוטיזם בזמן מלחמת "חרבות ברזל" זיהה חמש תמות: מצוקה רגשית, תמיכה קהילתית, מסוגלות הורית, רפלקטיביות וצורך בהגנה על הילד (בכר-כץ ואחרים, 2025). שני המחקרים אינם עוסקים בתפקודים ניהוליים, אך הם מזכירים שהתפקודים הניהוליים, שנפגעים ראשונים מלחץ </w:t>
+        <w:t xml:space="preserve">המחקר על ההורים מספק גם עדות עקיפה לחשיבות הצוות הטיפולי בגן. במחקר שבחן את עמדות ההורים לפני ואחרי תוכנית שנתית לקידום מיומנויות עצמאות בגני חינוך מיוחד, ובהם גן תקשורת, עלו עמדות ההורים כלפי יכולת ילדיהם בכל חמש עשרה המיומנויות שנמדדו (הס ואחרים, 2025). מיומנויות עצמאות כמו התלבשות, סידור חפצים ומעבר בין פעילויות הן, במונחי העבודה הנוכחית, תפקודים ניהוליים בלבוש יומיומי: הן דורשות תכנון, רצף ועכבה. התוכנית שנבדקה הופעלה על ידי צוות הגן, והממצא מראה שהורים מזהים שינוי כשהצוות עובד על יעדים מוגדרים.</w:t>
+      </w:r>
+    </w:p>
+    <w:p>
+      <w:pPr>
+        <w:bidi/>
+        <w:spacing w:after="120" w:line="360" w:lineRule="auto"/>
+        <w:ind w:firstLine="567"/>
+        <w:jc w:val="both"/>
+      </w:pPr>
+      <w:r>
+        <w:rPr>
+          <w:rFonts w:ascii="David" w:cs="David" w:eastAsia="David" w:hAnsi="David"/>
+          <w:sz w:val="24"/>
+          <w:szCs w:val="24"/>
+          <w:rtl/>
+        </w:rPr>
+        <w:t xml:space="preserve">שני מחקרים ישראליים נוספים מוסיפים ממד של הקשר משפחתי שלא ניתן להתעלם ממנו בשנים האחרונות. מחקר שבחן 140 הורים לילדים עם אוטיזם, 86 בזמן שגרה ו-54 בזמן מלחמה, מצא שתפקוד רפלקטיבי של ההורה, כלומר יכולתו לחשוב על המצבים הנפשיים של ילדו, נמצא קשור למסוגלות ההורית גם בשגרה וגם במלחמה, ואילו גמישות פסיכולוגית נמצאה קשורה אליה רק בשגרה. באופן מפתיע, התפקוד הרפלקטיבי והמסוגלות ההורית היו גבוהים יותר בזמן המלחמה מאשר בשגרה (אלמוג ואחרים, 2024). מחקר איכותני שראיין שנים עשר הורים לילדים בני שנתיים עד שש עם אוטיזם בזמן מלחמת "חרבות ברזל" זיהה חמש תמות: מצוקה רגשית, תמיכה קהילתית, מסוגלות הורית, רפלקטיביות וצורך בהגנה על הילד (בכר-כץ ואחרים, 2025). שני המחקרים אינם עוסקים בתפקודים ניהוליים, אך הם מזכירים שהתפקודים הניהוליים, שנפגעים ראשונים מלחץ </w:t>
       </w:r>
       <w:r>
         <w:rPr>
@@ -3786,7 +3786,7 @@
           <w:szCs w:val="24"/>
           <w:rtl/>
         </w:rPr>
-        <w:t xml:space="preserve">, והמחקר הישראלי על ילדים בהתפתחות תקינה הראה שכלי המדידה של הגמישות רגישים כבר בגיל הגן (טורגמן וגלבוע, 2020). השני הוא שהסביבה הטבעית עדיפה על חדר הטיפולים כזירת התערבות: על כך מסכימות המרפאות בעיסוק בישראל (שטנגר ופדה, 2020), קלינאיות התקשורת בקנדה </w:t>
+        <w:t xml:space="preserve">, והמחקר הישראלי על ילדים בהתפתחות תקינה הראה שכלי המדידה של הגמישות רגישים כבר בגיל הגן (תורג'מן וגלבוע, 2020). השני הוא שהסביבה הטבעית עדיפה על חדר הטיפולים כזירת התערבות: על כך מסכימות המרפאות בעיסוק בישראל (שטנגר ופדה, 2020), קלינאיות התקשורת בקנדה </w:t>
       </w:r>
       <w:r>
         <w:rPr>
@@ -4035,24 +4035,24 @@
           <w:szCs w:val="24"/>
           <w:rtl/>
         </w:rPr>
-        <w:t xml:space="preserve">. המדגמים הישראליים קטנים אף יותר (טורגמן וגלבוע, 2020; שי, 2024). מסקנות על "תרומה" חייבות להיות מסויגות בהתאם.</w:t>
-      </w:r>
-    </w:p>
-    <w:p>
-      <w:pPr>
-        <w:bidi/>
-        <w:spacing w:after="120" w:line="360" w:lineRule="auto"/>
-        <w:ind w:firstLine="567"/>
-        <w:jc w:val="both"/>
-      </w:pPr>
-      <w:r>
-        <w:rPr>
-          <w:rFonts w:ascii="David" w:cs="David" w:eastAsia="David" w:hAnsi="David"/>
-          <w:sz w:val="24"/>
-          <w:szCs w:val="24"/>
-          <w:rtl/>
-        </w:rPr>
-        <w:t xml:space="preserve">הרביעי הוא הפער הישראלי. אין מחקר ישראלי שפיט על תפקודים ניהוליים אצל ילדי גן על הרצף, ואין מחקר ישראלי שפיט על תוצאות ההתערבות הפרא-רפואית בגני תקשורת. הספרות הישראלית עוסקת בהורים (אלמוג ואחרים, 2024; בכר-כץ ואחרים, 2025; הס ואחרים, 2024), בחוויית מערכת החינוך (אלון-מן וברק, 2025), בהגדרת תפקידי המקצוע (פריש ואחרים, 2021; שטנגר ופדה, 2020) ובהתערבויות מתווכות (רמר וגרומן, 2022; שי, 2024). שני המקורות הישראליים שעוסקים ישירות בהתערבות ובקשר עם הילד על הרצף (גל, 2011; יואלי, 1992) ותיקים, ואף אחד מהם אינו מודד תפקודים ניהוליים. זו ספרות חשובה להבנת ההקשר, אך היא אינה עונה על השאלה מה קורה לתפקודים הניהוליים של הילד כשמרפאה בעיסוק וקלינאית תקשורת נכנסות לגן.</w:t>
+        <w:t xml:space="preserve">. המדגמים הישראליים קטנים אף יותר (תורג'מן וגלבוע, 2020; שי, 2024). מסקנות על "תרומה" חייבות להיות מסויגות בהתאם.</w:t>
+      </w:r>
+    </w:p>
+    <w:p>
+      <w:pPr>
+        <w:bidi/>
+        <w:spacing w:after="120" w:line="360" w:lineRule="auto"/>
+        <w:ind w:firstLine="567"/>
+        <w:jc w:val="both"/>
+      </w:pPr>
+      <w:r>
+        <w:rPr>
+          <w:rFonts w:ascii="David" w:cs="David" w:eastAsia="David" w:hAnsi="David"/>
+          <w:sz w:val="24"/>
+          <w:szCs w:val="24"/>
+          <w:rtl/>
+        </w:rPr>
+        <w:t xml:space="preserve">הרביעי הוא הפער הישראלי. אין מחקר ישראלי שפיט על תפקודים ניהוליים אצל ילדי גן על הרצף, ואין מחקר ישראלי שפיט על תוצאות ההתערבות הפרא-רפואית בגני תקשורת. הספרות הישראלית עוסקת בהורים (אלמוג ואחרים, 2024; בכר-כץ ואחרים, 2025; הס ואחרים, 2025), בחוויית מערכת החינוך (אלון-מן וברק, 2025), בהגדרת תפקידי המקצוע (פריש ואחרים, 2021; שטנגר ופדה, 2020) ובהתערבויות מתווכות (רמר וגרומן, 2022; שי, 2024). שני המקורות הישראליים שעוסקים ישירות בהתערבות ובקשר עם הילד על הרצף (גל, 2011; יואלי, 1992) ותיקים, ואף אחד מהם אינו מודד תפקודים ניהוליים. זו ספרות חשובה להבנת ההקשר, אך היא אינה עונה על השאלה מה קורה לתפקודים הניהוליים של הילד כשמרפאה בעיסוק וקלינאית תקשורת נכנסות לגן.</w:t>
       </w:r>
     </w:p>
     <w:p>
@@ -4322,7 +4322,7 @@
           <w:szCs w:val="24"/>
           <w:rtl/>
         </w:rPr>
-        <w:t xml:space="preserve">. המחקר הישראלי על ילדי גן בהתפתחות תקינה מראה שהכלים למדידת התפקודים האלה רגישים כבר בגיל הגן ושהם נמצאים בידי מרפאות בעיסוק (טורגמן וגלבוע, 2020). לפרופיל הזה משמעות ישירה לתכנון ההתערבות. אם הגמישות היא הקושי המרכזי, המעברים ביום הגן הם הזירה המרכזית, והצוות הפרא-רפואי צריך להיות נוכח בהם ולא רק בשעת הטיפול בחדר. העובדה שהילדים הם ללא לקות שכלית משנה את התמונה בשני כיוונים מנוגדים. מצד אחד, יש להם השפה והרפלקציה שגישות מטה-קוגניטיביות דורשות </w:t>
+        <w:t xml:space="preserve">. המחקר הישראלי על ילדי גן בהתפתחות תקינה מראה שהכלים למדידת התפקודים האלה רגישים כבר בגיל הגן ושהם נמצאים בידי מרפאות בעיסוק (תורג'מן וגלבוע, 2020). לפרופיל הזה משמעות ישירה לתכנון ההתערבות. אם הגמישות היא הקושי המרכזי, המעברים ביום הגן הם הזירה המרכזית, והצוות הפרא-רפואי צריך להיות נוכח בהם ולא רק בשעת הטיפול בחדר. העובדה שהילדים הם ללא לקות שכלית משנה את התמונה בשני כיוונים מנוגדים. מצד אחד, יש להם השפה והרפלקציה שגישות מטה-קוגניטיביות דורשות </w:t>
       </w:r>
       <w:r>
         <w:rPr>
@@ -4712,7 +4712,7 @@
           <w:szCs w:val="24"/>
           <w:rtl/>
         </w:rPr>
-        <w:t xml:space="preserve">, והמחקר הישראלי מהשנים האחרונות מראה שהורים לילדים על הרצף בגיל הגן פועלים תחת לחץ יוצא דופן, ושהמסוגלות ההורית שלהם תלויה בתפקוד רפלקטיבי יותר מאשר בגמישות פסיכולוגית (אלמוג ואחרים, 2024; בכר-כץ ואחרים, 2025). התערבות פרא-רפואית שמדריכה את ההורים לזהות את הקושי הניהולי כקושי ניהולי, ולא כסרבנות, מעניקה להם בדיוק את הרפלקטיביות הזאת. המחקר על עמדות ההורים לפני ואחרי תוכנית בגן (הס ואחרים, 2024) מראה שהורים מזהים שינוי כשהצוות עובד על יעדים מוגדרים, ותיאור המקרה של גל (2011) מראה שהורים מדווחים על יוזמות חדשות בבית כשהאסטרטגיות מועברות אליהם באופן מסודר. הצוות הפרא-רפואי תורם לתפקודים הניהוליים של הילד, במובן זה, גם דרך ההורים.</w:t>
+        <w:t xml:space="preserve">, והמחקר הישראלי מהשנים האחרונות מראה שהורים לילדים על הרצף בגיל הגן פועלים תחת לחץ יוצא דופן, ושהמסוגלות ההורית שלהם תלויה בתפקוד רפלקטיבי יותר מאשר בגמישות פסיכולוגית (אלמוג ואחרים, 2024; בכר-כץ ואחרים, 2025). התערבות פרא-רפואית שמדריכה את ההורים לזהות את הקושי הניהולי כקושי ניהולי, ולא כסרבנות, מעניקה להם בדיוק את הרפלקטיביות הזאת. המחקר על עמדות ההורים לפני ואחרי תוכנית בגן (הס ואחרים, 2025) מראה שהורים מזהים שינוי כשהצוות עובד על יעדים מוגדרים, ותיאור המקרה של גל (2011) מראה שהורים מדווחים על יוזמות חדשות בבית כשהאסטרטגיות מועברות אליהם באופן מסודר. הצוות הפרא-רפואי תורם לתפקודים הניהוליים של הילד, במובן זה, גם דרך ההורים.</w:t>
       </w:r>
     </w:p>
     <w:p>
@@ -4906,7 +4906,7 @@
           <w:szCs w:val="24"/>
           <w:rtl/>
         </w:rPr>
-        <w:t xml:space="preserve">, מודדת אותם בכלים של ריפוי בעיסוק (טורגמן וגלבוע, 2020; פריש ואחרים, 2021), ומוצאת אותם מאחורי תוצאות של קלינאות תקשורת </w:t>
+        <w:t xml:space="preserve">, מודדת אותם בכלים של ריפוי בעיסוק (פריש ואחרים, 2021; תורג'מן וגלבוע, 2020), ומוצאת אותם מאחורי תוצאות של קלינאות תקשורת </w:t>
       </w:r>
       <w:r>
         <w:rPr>
@@ -4942,7 +4942,7 @@
           <w:szCs w:val="24"/>
           <w:rtl/>
         </w:rPr>
-        <w:t xml:space="preserve">, שכבר בשימוש בישראל (טורגמן וגלבוע, 2020), הוא כלי זמין לכך. ההמלצות המפורטות מוצגות בפרק הסיכום.</w:t>
+        <w:t xml:space="preserve">, שכבר בשימוש בישראל (תורג'מן וגלבוע, 2020), הוא כלי זמין לכך. ההמלצות המפורטות מוצגות בפרק הסיכום.</w:t>
       </w:r>
     </w:p>
     <w:p>
@@ -5404,7 +5404,7 @@
           <w:szCs w:val="24"/>
           <w:rtl/>
         </w:rPr>
-        <w:t xml:space="preserve">טורגמן, א. וגלבוע, י. (2020). הקשר בין מיומנויות גרפו-מוטוריות לתפקודים ניהוליים בקרב ילדי גן. </w:t>
+        <w:t xml:space="preserve">תורג'מן, א. וגלבוע, י. (2020). הקשר בין מיומנויות גרפו-מוטוריות לתפקודים ניהוליים בקרב ילדי גן. </w:t>
       </w:r>
       <w:r>
         <w:rPr>

</xml_diff>

<commit_message>
Fix reference entries for Lev-On, Hess and Turgeman
Co-Authored-By: Claude Fable 5.1 <noreply@anthropic.com>
Claude-Session: https://claude.ai/code/session_01AGMAnS6o1o3m246uMW2ium
</commit_message>
<xml_diff>
--- a/seminar/סמינריון - תפקודים ניהוליים - הייכל מרווה.docx
+++ b/seminar/סמינריון - תפקודים ניהוליים - הייכל מרווה.docx
@@ -5363,7 +5363,7 @@
           <w:szCs w:val="24"/>
           <w:rtl/>
         </w:rPr>
-        <w:t xml:space="preserve">הס, א., אוגן, נ., ויפתי-בזוק, א. (2024). עמדות הורים כלפי היכולת הפוטנציאלית והתפקוד של ילדיהם בגני חינוך מיוחד לפני ואחרי השתתפות בתוכנית "איכות חיים – הכנה לחיים". </w:t>
+        <w:t xml:space="preserve">הס, א., אוגן, נ., ויפתי-בזוק, א. (2025). עמדות הורים כלפי היכולת הפוטנציאלית והתפקוד של ילדיהם בגני חינוך מיוחד לפני ואחרי השתתפות בתוכנית "איכות חיים – הכנה לחיים". </w:t>
       </w:r>
       <w:r>
         <w:rPr>
@@ -5385,7 +5385,20 @@
           <w:szCs w:val="24"/>
           <w:rtl/>
         </w:rPr>
-        <w:t xml:space="preserve">, 132-162.</w:t>
+        <w:t xml:space="preserve">, 132-162. </w:t>
+      </w:r>
+      <w:r>
+        <w:rPr>
+          <w:rFonts w:ascii="David" w:cs="David" w:eastAsia="David" w:hAnsi="David"/>
+          <w:i w:val="false"/>
+          <w:iCs w:val="false"/>
+          <w:sz w:val="24"/>
+          <w:szCs w:val="24"/>
+          <w:highlight w:val="yellow"/>
+          <w:highlightCs w:val="yellow"/>
+          <w:rtl/>
+        </w:rPr>
+        <w:t xml:space="preserve">[לאמת מול המאמר]</w:t>
       </w:r>
     </w:p>
     <w:p>
@@ -5404,7 +5417,7 @@
           <w:szCs w:val="24"/>
           <w:rtl/>
         </w:rPr>
-        <w:t xml:space="preserve">תורג'מן, א. וגלבוע, י. (2020). הקשר בין מיומנויות גרפו-מוטוריות לתפקודים ניהוליים בקרב ילדי גן. </w:t>
+        <w:t xml:space="preserve">יואלי, י. (1992). הצצה לעולמו של הילד האוטיסט: מתודה של התבוננות כאמצעי להבנת הילד החריג. </w:t>
       </w:r>
       <w:r>
         <w:rPr>
@@ -5415,7 +5428,7 @@
           <w:szCs w:val="24"/>
           <w:rtl/>
         </w:rPr>
-        <w:t xml:space="preserve">כתב עת ישראלי לריפוי בעיסוק, 29</w:t>
+        <w:t xml:space="preserve">סוגיות בחינוך מיוחד ובשיקום, 7</w:t>
       </w:r>
       <w:r>
         <w:rPr>
@@ -5426,29 +5439,7 @@
           <w:szCs w:val="24"/>
           <w:rtl/>
         </w:rPr>
-        <w:t xml:space="preserve">(1), </w:t>
-      </w:r>
-      <w:r>
-        <w:rPr>
-          <w:rFonts w:ascii="Times New Roman" w:cs="Times New Roman" w:eastAsia="Times New Roman" w:hAnsi="Times New Roman"/>
-          <w:i w:val="false"/>
-          <w:iCs w:val="false"/>
-          <w:sz w:val="24"/>
-          <w:szCs w:val="24"/>
-          <w:rtl w:val="false"/>
-        </w:rPr>
-        <w:t xml:space="preserve">H41-H53</w:t>
-      </w:r>
-      <w:r>
-        <w:rPr>
-          <w:rFonts w:ascii="David" w:cs="David" w:eastAsia="David" w:hAnsi="David"/>
-          <w:i w:val="false"/>
-          <w:iCs w:val="false"/>
-          <w:sz w:val="24"/>
-          <w:szCs w:val="24"/>
-          <w:rtl/>
-        </w:rPr>
-        <w:t xml:space="preserve">.</w:t>
+        <w:t xml:space="preserve">(1), 19-29.</w:t>
       </w:r>
     </w:p>
     <w:p>
@@ -5467,7 +5458,7 @@
           <w:szCs w:val="24"/>
           <w:rtl/>
         </w:rPr>
-        <w:t xml:space="preserve">יואלי, י. (1992). הצצה לעולמו של הילד האוטיסט: מתודה של התבוננות כאמצעי להבנת הילד החריג. </w:t>
+        <w:t xml:space="preserve">לב-און, ש., וקס, ס., ישי-וואס מלדה, ג', ימין-שרקי, ח., יושעי, י., ונחמיאס, א. (2024). השקט שבתוך הסערה: מיזם "החדרים השקטים". </w:t>
       </w:r>
       <w:r>
         <w:rPr>
@@ -5478,7 +5469,7 @@
           <w:szCs w:val="24"/>
           <w:rtl/>
         </w:rPr>
-        <w:t xml:space="preserve">סוגיות בחינוך מיוחד ובשיקום, 7</w:t>
+        <w:t xml:space="preserve">כתב עת ישראלי לריפוי בעיסוק, 33</w:t>
       </w:r>
       <w:r>
         <w:rPr>
@@ -5489,7 +5480,29 @@
           <w:szCs w:val="24"/>
           <w:rtl/>
         </w:rPr>
-        <w:t xml:space="preserve">(1), 19-29.</w:t>
+        <w:t xml:space="preserve">(3), </w:t>
+      </w:r>
+      <w:r>
+        <w:rPr>
+          <w:rFonts w:ascii="Times New Roman" w:cs="Times New Roman" w:eastAsia="Times New Roman" w:hAnsi="Times New Roman"/>
+          <w:i w:val="false"/>
+          <w:iCs w:val="false"/>
+          <w:sz w:val="24"/>
+          <w:szCs w:val="24"/>
+          <w:rtl w:val="false"/>
+        </w:rPr>
+        <w:t xml:space="preserve">H216-H233</w:t>
+      </w:r>
+      <w:r>
+        <w:rPr>
+          <w:rFonts w:ascii="David" w:cs="David" w:eastAsia="David" w:hAnsi="David"/>
+          <w:i w:val="false"/>
+          <w:iCs w:val="false"/>
+          <w:sz w:val="24"/>
+          <w:szCs w:val="24"/>
+          <w:rtl/>
+        </w:rPr>
+        <w:t xml:space="preserve">.</w:t>
       </w:r>
     </w:p>
     <w:p>
@@ -5508,7 +5521,31 @@
           <w:szCs w:val="24"/>
           <w:rtl/>
         </w:rPr>
-        <w:t xml:space="preserve">לב-און, ש., וקס, ש., מלדה, ג., ימין-שרקי, ח., יוספי, י., ונחמיאס, א. (2024). השקט שבתוך הסערה: מיזם "החדרים השקטים". </w:t>
+        <w:t xml:space="preserve">פריש, ק., חן-מרקוביץ', ג., רון-בצל, ב., מושיוב, ח., דרורי, י., שנרך-וודה, מ., </w:t>
+      </w:r>
+      <w:r>
+        <w:rPr>
+          <w:rFonts w:ascii="David" w:cs="David" w:eastAsia="David" w:hAnsi="David"/>
+          <w:i w:val="false"/>
+          <w:iCs w:val="false"/>
+          <w:sz w:val="24"/>
+          <w:szCs w:val="24"/>
+          <w:highlight w:val="yellow"/>
+          <w:highlightCs w:val="yellow"/>
+          <w:rtl/>
+        </w:rPr>
+        <w:t xml:space="preserve">[להשלים מחברים נוספים]</w:t>
+      </w:r>
+      <w:r>
+        <w:rPr>
+          <w:rFonts w:ascii="David" w:cs="David" w:eastAsia="David" w:hAnsi="David"/>
+          <w:i w:val="false"/>
+          <w:iCs w:val="false"/>
+          <w:sz w:val="24"/>
+          <w:szCs w:val="24"/>
+          <w:rtl/>
+        </w:rPr>
+        <w:t xml:space="preserve"> (2021). אמות מידה לאבחון וטיפול בריפוי בעיסוק לילדים בני 3-10 שנים עם הסתמנות מרכזית של הפרעת קשב. </w:t>
       </w:r>
       <w:r>
         <w:rPr>
@@ -5519,7 +5556,7 @@
           <w:szCs w:val="24"/>
           <w:rtl/>
         </w:rPr>
-        <w:t xml:space="preserve">כתב עת ישראלי לריפוי בעיסוק, 33</w:t>
+        <w:t xml:space="preserve">כתב עת ישראלי לריפוי בעיסוק, 30</w:t>
       </w:r>
       <w:r>
         <w:rPr>
@@ -5541,7 +5578,7 @@
           <w:szCs w:val="24"/>
           <w:rtl w:val="false"/>
         </w:rPr>
-        <w:t xml:space="preserve">H216-H233</w:t>
+        <w:t xml:space="preserve">H157-H164</w:t>
       </w:r>
       <w:r>
         <w:rPr>
@@ -5571,7 +5608,18 @@
           <w:szCs w:val="24"/>
           <w:rtl/>
         </w:rPr>
-        <w:t xml:space="preserve">פריש, ק., חן-מרקוביץ', ג., רון-בצל, ב., מושיוב, ח., דרורי, י., שנרך-וודה, מ., </w:t>
+        <w:t xml:space="preserve">רמר, ר. וגרומן, ת. (2022). השפעתו של השימוש בבובת תיאטרון על יצירת תקשורת ראשונית עם ילדי גן המאובחנים על הרצף האוטיסטי. </w:t>
+      </w:r>
+      <w:r>
+        <w:rPr>
+          <w:rFonts w:ascii="David" w:cs="David" w:eastAsia="David" w:hAnsi="David"/>
+          <w:i/>
+          <w:iCs/>
+          <w:sz w:val="24"/>
+          <w:szCs w:val="24"/>
+          <w:rtl/>
+        </w:rPr>
+        <w:t xml:space="preserve">מפגש לעבודה חינוכית-סוציאלית, ל</w:t>
       </w:r>
       <w:r>
         <w:rPr>
@@ -5580,66 +5628,9 @@
           <w:iCs w:val="false"/>
           <w:sz w:val="24"/>
           <w:szCs w:val="24"/>
-          <w:highlight w:val="yellow"/>
-          <w:highlightCs w:val="yellow"/>
-          <w:rtl/>
-        </w:rPr>
-        <w:t xml:space="preserve">[להשלים מחברים נוספים]</w:t>
-      </w:r>
-      <w:r>
-        <w:rPr>
-          <w:rFonts w:ascii="David" w:cs="David" w:eastAsia="David" w:hAnsi="David"/>
-          <w:i w:val="false"/>
-          <w:iCs w:val="false"/>
-          <w:sz w:val="24"/>
-          <w:szCs w:val="24"/>
-          <w:rtl/>
-        </w:rPr>
-        <w:t xml:space="preserve"> (2021). אמות מידה לאבחון וטיפול בריפוי בעיסוק לילדים בני 3-10 שנים עם הסתמנות מרכזית של הפרעת קשב. </w:t>
-      </w:r>
-      <w:r>
-        <w:rPr>
-          <w:rFonts w:ascii="David" w:cs="David" w:eastAsia="David" w:hAnsi="David"/>
-          <w:i/>
-          <w:iCs/>
-          <w:sz w:val="24"/>
-          <w:szCs w:val="24"/>
-          <w:rtl/>
-        </w:rPr>
-        <w:t xml:space="preserve">כתב עת ישראלי לריפוי בעיסוק, 30</w:t>
-      </w:r>
-      <w:r>
-        <w:rPr>
-          <w:rFonts w:ascii="David" w:cs="David" w:eastAsia="David" w:hAnsi="David"/>
-          <w:i w:val="false"/>
-          <w:iCs w:val="false"/>
-          <w:sz w:val="24"/>
-          <w:szCs w:val="24"/>
-          <w:rtl/>
-        </w:rPr>
-        <w:t xml:space="preserve">(3), </w:t>
-      </w:r>
-      <w:r>
-        <w:rPr>
-          <w:rFonts w:ascii="Times New Roman" w:cs="Times New Roman" w:eastAsia="Times New Roman" w:hAnsi="Times New Roman"/>
-          <w:i w:val="false"/>
-          <w:iCs w:val="false"/>
-          <w:sz w:val="24"/>
-          <w:szCs w:val="24"/>
-          <w:rtl w:val="false"/>
-        </w:rPr>
-        <w:t xml:space="preserve">H157-H164</w:t>
-      </w:r>
-      <w:r>
-        <w:rPr>
-          <w:rFonts w:ascii="David" w:cs="David" w:eastAsia="David" w:hAnsi="David"/>
-          <w:i w:val="false"/>
-          <w:iCs w:val="false"/>
-          <w:sz w:val="24"/>
-          <w:szCs w:val="24"/>
-          <w:rtl/>
-        </w:rPr>
-        <w:t xml:space="preserve">.</w:t>
+          <w:rtl/>
+        </w:rPr>
+        <w:t xml:space="preserve">(54), 11-43.</w:t>
       </w:r>
     </w:p>
     <w:p>
@@ -5658,7 +5649,7 @@
           <w:szCs w:val="24"/>
           <w:rtl/>
         </w:rPr>
-        <w:t xml:space="preserve">רמר, ר. וגרומן, ת. (2022). השפעתו של השימוש בבובת תיאטרון על יצירת תקשורת ראשונית עם ילדי גן המאובחנים על הרצף האוטיסטי. </w:t>
+        <w:t xml:space="preserve">שטנגר, א. ופדה, מ. (2020). הערכת צרכים לפיתוח פרויקט בנושא התערבות כיתתית בריפוי בעיסוק בחינוך הרגיל. </w:t>
       </w:r>
       <w:r>
         <w:rPr>
@@ -5669,7 +5660,7 @@
           <w:szCs w:val="24"/>
           <w:rtl/>
         </w:rPr>
-        <w:t xml:space="preserve">מפגש לעבודה חינוכית-סוציאלית, ל</w:t>
+        <w:t xml:space="preserve">כתב עת ישראלי לריפוי בעיסוק, 29</w:t>
       </w:r>
       <w:r>
         <w:rPr>
@@ -5680,7 +5671,29 @@
           <w:szCs w:val="24"/>
           <w:rtl/>
         </w:rPr>
-        <w:t xml:space="preserve">(54), 11-43.</w:t>
+        <w:t xml:space="preserve">(3), </w:t>
+      </w:r>
+      <w:r>
+        <w:rPr>
+          <w:rFonts w:ascii="Times New Roman" w:cs="Times New Roman" w:eastAsia="Times New Roman" w:hAnsi="Times New Roman"/>
+          <w:i w:val="false"/>
+          <w:iCs w:val="false"/>
+          <w:sz w:val="24"/>
+          <w:szCs w:val="24"/>
+          <w:rtl w:val="false"/>
+        </w:rPr>
+        <w:t xml:space="preserve">H167-H186</w:t>
+      </w:r>
+      <w:r>
+        <w:rPr>
+          <w:rFonts w:ascii="David" w:cs="David" w:eastAsia="David" w:hAnsi="David"/>
+          <w:i w:val="false"/>
+          <w:iCs w:val="false"/>
+          <w:sz w:val="24"/>
+          <w:szCs w:val="24"/>
+          <w:rtl/>
+        </w:rPr>
+        <w:t xml:space="preserve">.</w:t>
       </w:r>
     </w:p>
     <w:p>
@@ -5699,7 +5712,7 @@
           <w:szCs w:val="24"/>
           <w:rtl/>
         </w:rPr>
-        <w:t xml:space="preserve">שטנגר, א. ופדה, מ. (2020). הערכת צרכים לפיתוח פרויקט בנושא התערבות כיתתית בריפוי בעיסוק בחינוך הרגיל. </w:t>
+        <w:t xml:space="preserve">שי, א. (2024). האם אפשר ללמד פעוטות עם אוטיזם מושגים שפתיים באמצעות שירים? מחקר חלוץ. </w:t>
       </w:r>
       <w:r>
         <w:rPr>
@@ -5710,7 +5723,7 @@
           <w:szCs w:val="24"/>
           <w:rtl/>
         </w:rPr>
-        <w:t xml:space="preserve">כתב עת ישראלי לריפוי בעיסוק, 29</w:t>
+        <w:t xml:space="preserve">חוקרים@הגיל הרך, 22</w:t>
       </w:r>
       <w:r>
         <w:rPr>
@@ -5721,29 +5734,7 @@
           <w:szCs w:val="24"/>
           <w:rtl/>
         </w:rPr>
-        <w:t xml:space="preserve">(3), </w:t>
-      </w:r>
-      <w:r>
-        <w:rPr>
-          <w:rFonts w:ascii="Times New Roman" w:cs="Times New Roman" w:eastAsia="Times New Roman" w:hAnsi="Times New Roman"/>
-          <w:i w:val="false"/>
-          <w:iCs w:val="false"/>
-          <w:sz w:val="24"/>
-          <w:szCs w:val="24"/>
-          <w:rtl w:val="false"/>
-        </w:rPr>
-        <w:t xml:space="preserve">H167-H186</w:t>
-      </w:r>
-      <w:r>
-        <w:rPr>
-          <w:rFonts w:ascii="David" w:cs="David" w:eastAsia="David" w:hAnsi="David"/>
-          <w:i w:val="false"/>
-          <w:iCs w:val="false"/>
-          <w:sz w:val="24"/>
-          <w:szCs w:val="24"/>
-          <w:rtl/>
-        </w:rPr>
-        <w:t xml:space="preserve">.</w:t>
+        <w:t xml:space="preserve">, 55-81.</w:t>
       </w:r>
     </w:p>
     <w:p>
@@ -5762,7 +5753,7 @@
           <w:szCs w:val="24"/>
           <w:rtl/>
         </w:rPr>
-        <w:t xml:space="preserve">שי, א. (2024). האם אפשר ללמד פעוטות עם אוטיזם מושגים שפתיים באמצעות שירים? מחקר חלוץ. </w:t>
+        <w:t xml:space="preserve">תורג'מן, א. וגלבוע, י. (2020). הקשר בין מיומנויות גרפו מוטוריות לתפקודים ניהוליים בקרב ילדי גן. </w:t>
       </w:r>
       <w:r>
         <w:rPr>
@@ -5773,7 +5764,7 @@
           <w:szCs w:val="24"/>
           <w:rtl/>
         </w:rPr>
-        <w:t xml:space="preserve">חוקרים@הגיל הרך, 22</w:t>
+        <w:t xml:space="preserve">כתב עת ישראלי לריפוי בעיסוק, 29</w:t>
       </w:r>
       <w:r>
         <w:rPr>
@@ -5784,7 +5775,29 @@
           <w:szCs w:val="24"/>
           <w:rtl/>
         </w:rPr>
-        <w:t xml:space="preserve">, 55-81.</w:t>
+        <w:t xml:space="preserve">(1), </w:t>
+      </w:r>
+      <w:r>
+        <w:rPr>
+          <w:rFonts w:ascii="Times New Roman" w:cs="Times New Roman" w:eastAsia="Times New Roman" w:hAnsi="Times New Roman"/>
+          <w:i w:val="false"/>
+          <w:iCs w:val="false"/>
+          <w:sz w:val="24"/>
+          <w:szCs w:val="24"/>
+          <w:rtl w:val="false"/>
+        </w:rPr>
+        <w:t xml:space="preserve">H41-H53</w:t>
+      </w:r>
+      <w:r>
+        <w:rPr>
+          <w:rFonts w:ascii="David" w:cs="David" w:eastAsia="David" w:hAnsi="David"/>
+          <w:i w:val="false"/>
+          <w:iCs w:val="false"/>
+          <w:sz w:val="24"/>
+          <w:szCs w:val="24"/>
+          <w:rtl/>
+        </w:rPr>
+        <w:t xml:space="preserve">.</w:t>
       </w:r>
     </w:p>
     <w:p>

</xml_diff>

<commit_message>
Verify Gimeno and Polatajko (2025) against original and refine its description
Co-Authored-By: Claude Fable 5.1 <noreply@anthropic.com>
Claude-Session: https://claude.ai/code/session_01AGMAnS6o1o3m246uMW2ium
</commit_message>
<xml_diff>
--- a/seminar/סמינריון - תפקודים ניהוליים - הייכל מרווה.docx
+++ b/seminar/סמינריון - תפקודים ניהוליים - הייכל מרווה.docx
@@ -982,7 +982,7 @@
               <w:sz w:val="24"/>
               <w:szCs w:val="24"/>
             </w:rPr>
-            <w:t>12</w:t>
+            <w:t>13</w:t>
           </w:r>
         </w:p>
         <w:p>
@@ -1126,7 +1126,7 @@
               <w:sz w:val="24"/>
               <w:szCs w:val="24"/>
             </w:rPr>
-            <w:t>14</w:t>
+            <w:t>15</w:t>
           </w:r>
         </w:p>
         <w:p>
@@ -1270,7 +1270,7 @@
               <w:sz w:val="24"/>
               <w:szCs w:val="24"/>
             </w:rPr>
-            <w:t>19</w:t>
+            <w:t>20</w:t>
           </w:r>
         </w:p>
         <w:p>
@@ -1306,7 +1306,7 @@
               <w:sz w:val="24"/>
               <w:szCs w:val="24"/>
             </w:rPr>
-            <w:t>24</w:t>
+            <w:t>25</w:t>
           </w:r>
         </w:p>
         <w:p>
@@ -1342,7 +1342,7 @@
               <w:sz w:val="24"/>
               <w:szCs w:val="24"/>
             </w:rPr>
-            <w:t>26</w:t>
+            <w:t>27</w:t>
           </w:r>
         </w:p>
         <w:p>
@@ -2954,7 +2954,7 @@
           <w:szCs w:val="24"/>
           <w:rtl/>
         </w:rPr>
-        <w:t xml:space="preserve">. בגישה זו הילד לומד אסטרטגיה כללית לפתרון בעיות בארבעה שלבים: מטרה, תכנון, ביצוע ובדיקה. המטפלת אינה מלמדת את המיומנות עצמה, אלא מדריכה את הילד לגלות בעצמו מה לא עובד ולתכנן מחדש. סקירה עדכנית של הגישה במגבלות עם התחלה בילדות, ובהן הפרעת קואורדינציה התפתחותית, אוטיזם, שיתוק מוחין ופגיעת ראש נרכשת, מתארת אותה כגישה מטה-קוגניטיבית שמכוונת במפורש לתכנון, לניטור עצמי ולהעברה של הלמידה למשימות חדשות, ומציגה עדויות להעברה כזאת </w:t>
+        <w:t xml:space="preserve">. בגישה זו הילד לומד אסטרטגיה כללית לפתרון בעיות בארבעה שלבים: מטרה, תכנון, ביצוע ובדיקה. המטפלת אינה מלמדת את המיומנות עצמה, אלא מדריכה את הילד לגלות בעצמו מה לא עובד ולתכנן מחדש. סקירה עדכנית של הגישה במגבלות עם התחלה בילדות, ובהן הפרעת קואורדינציה התפתחותית, אוטיזם, שיתוק מוחין ופגיעת ראש נרכשת, מתארת אותה כגישה שארבע מטרותיה המוצהרות הן רכישת מיומנות, שימוש באסטרטגיה קוגניטיבית, הכללה והעברה של הלמידה למשימות ולהקשרים חדשים, ומסכמת שהספרות שהצטברה מאז 2001 מעידה שהגישה תומכת בשלושתן </w:t>
       </w:r>
       <w:r>
         <w:rPr>
@@ -2972,24 +2972,24 @@
           <w:szCs w:val="24"/>
           <w:rtl/>
         </w:rPr>
-        <w:t xml:space="preserve">.</w:t>
-      </w:r>
-    </w:p>
-    <w:p>
-      <w:pPr>
-        <w:bidi/>
-        <w:spacing w:after="120" w:line="360" w:lineRule="auto"/>
-        <w:ind w:firstLine="567"/>
-        <w:jc w:val="both"/>
-      </w:pPr>
-      <w:r>
-        <w:rPr>
-          <w:rFonts w:ascii="David" w:cs="David" w:eastAsia="David" w:hAnsi="David"/>
-          <w:sz w:val="24"/>
-          <w:szCs w:val="24"/>
-          <w:rtl/>
-        </w:rPr>
-        <w:t xml:space="preserve">עבור העבודה הנוכחית הגישה מעניינת מסיבה אחת ומגבילה מסיבה אחרת. היא מעניינת משום שארבעת השלבים שלה הם, למעשה, תפקודים ניהוליים בפעולה: הצבת מטרה ותכנון, עכבה של פעולה אוטומטית לטובת הפעולה המתוכננת, ובדיקה שדורשת גמישות. היא מגבילה משום שהיא דורשת מהילד יכולת מילולית ורפלקטיבית מסוימת, ולכן רוב העדויות עליה באוטיזם הן מילדים בגיל בית ספר. הסקירה עצמה מציינת שהראיות באוטיזם עדיין מוגבלות </w:t>
+        <w:t xml:space="preserve">. האסטרטגיה הכללית של הגישה, מטרה-תכנון-ביצוע-בדיקה, מוגדרת במאמר כאסטרטגיה שתומכת במטה-קוגניציה, והמטפלת אינה מלמדת את הפתרון אלא מובילה את הילד לגלות אותו בעצמו בשאלות ובאימון, בתהליך שהמחברות מכנות גילוי מודרך.</w:t>
+      </w:r>
+    </w:p>
+    <w:p>
+      <w:pPr>
+        <w:bidi/>
+        <w:spacing w:after="120" w:line="360" w:lineRule="auto"/>
+        <w:ind w:firstLine="567"/>
+        <w:jc w:val="both"/>
+      </w:pPr>
+      <w:r>
+        <w:rPr>
+          <w:rFonts w:ascii="David" w:cs="David" w:eastAsia="David" w:hAnsi="David"/>
+          <w:sz w:val="24"/>
+          <w:szCs w:val="24"/>
+          <w:rtl/>
+        </w:rPr>
+        <w:t xml:space="preserve">עבור העבודה הנוכחית הגישה מעניינת מסיבה אחת ומגבילה מסיבה אחרת. היא מעניינת משום שארבעת השלבים שלה הם, למעשה, תפקודים ניהוליים בפעולה: הצבת מטרה ותכנון, עכבה של פעולה אוטומטית לטובת הפעולה המתוכננת, ובדיקה שדורשת גמישות. היא מגבילה משום שהיא דורשת מהילד יכולת מילולית ורפלקטיבית מסוימת, ולכן רוב העדויות עליה באוטיזם הן מילדים בגיל בית ספר. הסקירה עצמה מונה באוטיזם ארבעה מחקרי מקרה בלבד, שבעה ילדים בגילי חמש עד שתים עשרה, ומציינת שמחקרים שמזהים את מנגנון הפעולה של הגישה, ובכלל זה תוצאות של העברה, עדיין חסרים </w:t>
       </w:r>
       <w:r>
         <w:rPr>
@@ -4482,7 +4482,7 @@
           <w:szCs w:val="24"/>
           <w:rtl/>
         </w:rPr>
-        <w:t xml:space="preserve"> הוא, בקריאה זו, הפער בין מנגנון אחד לבין שילוב של שניים. המדגם קטן, שבעה עשר ילדים, והקריאה הזאת היא פרשנות. אך היא מתיישבת עם סקירת גישת </w:t>
+        <w:t xml:space="preserve"> הוא, בקריאה זו, הפער בין מנגנון אחד לבין שילוב של שניים. המדגם קטן, שבעה עשר ילדים, והקריאה הזאת היא פרשנות. אך היא מתיישבת עם ההיגיון של גישת </w:t>
       </w:r>
       <w:r>
         <w:rPr>
@@ -4500,7 +4500,7 @@
           <w:szCs w:val="24"/>
           <w:rtl/>
         </w:rPr>
-        <w:t xml:space="preserve">, שמצאה שהתרומה נובעת מהאסטרטגיה המטה-קוגניטיבית ולא מהתרגול המוטורי </w:t>
+        <w:t xml:space="preserve">, שבנויה על אסטרטגיה קוגניטיבית ועל גילוי מודרך ולא על טיפול בליקוי המוטורי עצמו, גם אם מחברות הסקירה מודות שמחקרים על מנגנון הפעולה של הגישה עדיין חסרים </w:t>
       </w:r>
       <w:r>
         <w:rPr>
@@ -4782,7 +4782,7 @@
           <w:szCs w:val="24"/>
           <w:rtl/>
         </w:rPr>
-        <w:t xml:space="preserve">, סקירה של גישה שהראיות עליה באוטיזם עדיין מוגבלות </w:t>
+        <w:t xml:space="preserve">, סקירה של גישה שהראיות עליה באוטיזם מסתכמות בארבעה מחקרי מקרה של שבעה ילדים </w:t>
       </w:r>
       <w:r>
         <w:rPr>
@@ -5987,7 +5987,7 @@
           <w:sz w:val="24"/>
           <w:szCs w:val="24"/>
         </w:rPr>
-        <w:t xml:space="preserve">. Advance online publication. https://doi.org/10.1111/dmcn.16260</w:t>
+        <w:t xml:space="preserve">, 977-985. https://doi.org/10.1111/dmcn.16260</w:t>
       </w:r>
     </w:p>
     <w:p>

</xml_diff>

<commit_message>
Add Ono Academic College logo to the title page
Co-Authored-By: Claude Opus 5 <noreply@anthropic.com>
Claude-Session: https://claude.ai/code/session_01AGMAnS6o1o3m246uMW2ium
</commit_message>
<xml_diff>
--- a/seminar/סמינריון - תפקודים ניהוליים - הייכל מרווה.docx
+++ b/seminar/סמינריון - תפקודים ניהוליים - הייכל מרווה.docx
@@ -4,8 +4,54 @@
   <w:body>
     <w:p>
       <w:pPr>
-        <w:bidi/>
-        <w:spacing w:after="120" w:before="600" w:line="360"/>
+        <w:spacing w:after="200" w:before="400"/>
+        <w:jc w:val="center"/>
+      </w:pPr>
+      <w:r>
+        <w:drawing>
+          <wp:inline distT="0" distB="0" distL="0" distR="0">
+            <wp:extent cx="1428750" cy="1428750"/>
+            <wp:effectExtent t="0" r="0" b="0" l="0"/>
+            <wp:docPr id="1" name="" descr="" title=""/>
+            <wp:cNvGraphicFramePr>
+              <a:graphicFrameLocks xmlns:a="http://schemas.openxmlformats.org/drawingml/2006/main" noChangeAspect="1"/>
+            </wp:cNvGraphicFramePr>
+            <a:graphic xmlns:a="http://schemas.openxmlformats.org/drawingml/2006/main">
+              <a:graphicData uri="http://schemas.openxmlformats.org/drawingml/2006/picture">
+                <pic:pic xmlns:pic="http://schemas.openxmlformats.org/drawingml/2006/picture">
+                  <pic:nvPicPr>
+                    <pic:cNvPr id="0" name="" descr=""/>
+                    <pic:cNvPicPr>
+                      <a:picLocks noChangeAspect="1" noChangeArrowheads="1"/>
+                    </pic:cNvPicPr>
+                  </pic:nvPicPr>
+                  <pic:blipFill>
+                    <a:blip r:embed="rId8" cstate="none"/>
+                    <a:srcRect/>
+                    <a:stretch>
+                      <a:fillRect/>
+                    </a:stretch>
+                  </pic:blipFill>
+                  <pic:spPr bwMode="auto">
+                    <a:xfrm>
+                      <a:off x="0" y="0"/>
+                      <a:ext cx="1428750" cy="1428750"/>
+                    </a:xfrm>
+                    <a:prstGeom prst="rect">
+                      <a:avLst/>
+                    </a:prstGeom>
+                  </pic:spPr>
+                </pic:pic>
+              </a:graphicData>
+            </a:graphic>
+          </wp:inline>
+        </w:drawing>
+      </w:r>
+    </w:p>
+    <w:p>
+      <w:pPr>
+        <w:bidi/>
+        <w:spacing w:after="120" w:before="0" w:line="360"/>
         <w:jc w:val="center"/>
       </w:pPr>
       <w:r>

</xml_diff>